<commit_message>
Finalize Riokka audits and working revisions
</commit_message>
<xml_diff>
--- a/riokka/books/book-01/manuscript/master.docx
+++ b/riokka/books/book-01/manuscript/master.docx
@@ -1065,7 +1065,6 @@
     <w:p>
       <w:pPr>
         <w:spacing w:line="360" w:lineRule="auto"/>
-        <w:ind w:firstLine="567"/>
         <w:jc w:val="center"/>
         <w:rPr>
           <w:sz w:val="28"/>
@@ -1093,20 +1092,20 @@
     <w:p>
       <w:pPr>
         <w:spacing w:line="360" w:lineRule="auto"/>
-        <w:ind w:firstLine="567"/>
-        <w:jc w:val="both"/>
-        <w:rPr>
-          <w:sz w:val="28"/>
-          <w:szCs w:val="28"/>
-        </w:rPr>
-      </w:pPr>
-      <w:r>
-        <w:rPr>
-          <w:sz w:val="28"/>
-          <w:szCs w:val="28"/>
-          <w:rtl w:val="0"/>
-        </w:rPr>
-        <w:t xml:space="preserve">Глаз Хиггса — честный механический инквизитор, который видит любой материал насквозь и которому все равно, что ты написал в накладной. В футляре старика Хана лежала не виолончель. Там лежало его прошлое, и прошлое это было из той стали, за которую на Чонсан-привратной ставят к стенке без долгих бесед.</w:t>
+        <w:ind w:firstLine="720"/>
+        <w:jc w:val="both"/>
+        <w:rPr>
+          <w:sz w:val="28"/>
+          <w:szCs w:val="28"/>
+        </w:rPr>
+      </w:pPr>
+      <w:r>
+        <w:rPr>
+          <w:sz w:val="28"/>
+          <w:szCs w:val="28"/>
+          <w:rtl w:val="0"/>
+        </w:rPr>
+        <w:t xml:space="preserve">Глаз Хиггса — честный механический инквизитор, который по отраженному сигналу определяет материал и которому все равно, что ты написал в накладной. В футляре старика Хана лежала не виолончель. Там лежало его прошлое, и прошлое это было из той стали, за которую на Чонсан-привратной ставят к стенке без долгих бесед.</w:t>
       </w:r>
     </w:p>
     <w:p>
@@ -1163,7 +1162,7 @@
           <w:szCs w:val="28"/>
           <w:rtl w:val="0"/>
         </w:rPr>
-        <w:t xml:space="preserve">Вот тут, по-хорошему, полагается драка. Я по этой части двукратный чемпион. Зверь во мне умеет все, чего от него ждут, и именно поэтому я держу его на коротком поводке: однажды я его спустил, и один человек после этого не встал. Его звали — хотя это не важно; важно, что имя у него было, а я его помню, и это единственная плата, которую он с меня берет, зато берет каждую ночь. С тех пор я считаю иначе. Это не трусость, это арифметика. Мертвый или хотя бы битый распорядитель — это сирена, оцепление, шлюзы вниз сию секунду и девять моих душ в ловушке. Живой и недовольный распорядитель — это просто плохой вторник. Вторник я переживу.</w:t>
+        <w:t xml:space="preserve">Вот тут, по-хорошему, полагается драка. Я по этой части двукратный чемпион. Зверь во мне умеет все, чего от него ждут, и именно поэтому я держу его на коротком поводке: однажды я его спустил, и один человек после этого не встал. Его звали — хотя это не важно; важно, что имя у него было, а я его помню, и это единственная плата, которую он с меня берет, зато берет каждую ночь. С тех пор я считаю иначе. Это не трусость, это арифметика. Мертвый или хотя бы битый распорядитель — это сирена, оцепление, шлюзы вниз сию секунду и семь моих душ в ловушке. Живой и недовольный распорядитель — это просто плохой вторник. Вторник я переживу.</w:t>
       </w:r>
     </w:p>
     <w:p>
@@ -2084,7 +2083,7 @@
           <w:szCs w:val="28"/>
           <w:rtl w:val="0"/>
         </w:rPr>
-        <w:t xml:space="preserve">ДУШ: 50. ОКНО: 36 ч. </w:t>
+        <w:t xml:space="preserve">ДУШ: 50. ОКНО: 84 ч. </w:t>
       </w:r>
     </w:p>
     <w:p>
@@ -2614,7 +2613,7 @@
           <w:szCs w:val="28"/>
           <w:rtl w:val="0"/>
         </w:rPr>
-        <w:t xml:space="preserve">— Как обычно. Половину — тебе, половину — пустишь по своей цепочке, чтоб этих девятерых развело подальше и побыстрее. Не экономь на расстоянии.</w:t>
+        <w:t xml:space="preserve">— Как обычно. Половину — тебе, половину — пустишь по своей цепочке, чтоб этих семерых развело подальше и побыстрее. Не экономь на расстоянии.</w:t>
       </w:r>
     </w:p>
     <w:p>
@@ -3935,26 +3934,26 @@
           <w:szCs w:val="28"/>
           <w:rtl w:val="0"/>
         </w:rPr>
-        <w:t xml:space="preserve">На этом разговор кончился. Не потому, что мне нечего было ответить — у меня в горле застряло столько ответов, что я мог бы говорить до утра. А потому что повышать на него голос означало однажды поднять на него руку, а такого я не сделаю, как и не подниму руку ни на кого, пока меня не загонят в угол. Я слишком хорошо знаю, какая во не живет сила, когда я спускаю ее с поводка. Я развернулся и ушел таскать свое очередное ведро.</w:t>
-      </w:r>
-    </w:p>
-    <w:p>
-      <w:pPr>
-        <w:spacing w:line="360" w:lineRule="auto"/>
-        <w:ind w:firstLine="567"/>
-        <w:jc w:val="both"/>
-        <w:rPr>
-          <w:sz w:val="28"/>
-          <w:szCs w:val="28"/>
-        </w:rPr>
-      </w:pPr>
-      <w:r>
-        <w:rPr>
-          <w:sz w:val="28"/>
-          <w:szCs w:val="28"/>
-          <w:rtl w:val="0"/>
-        </w:rPr>
-        <w:t xml:space="preserve">С тех пор мы не виделись. Я слышал, что он ушел далеко по своей дороге — туда, где людей уже не спасают, а избавляют: от страданий, от гнилой власти, от самих себя. Формулировку, говорят, он менял от года к году. Суть не менял. Она у него всегда была железная: если дом горит — снеси дом.</w:t>
+        <w:t xml:space="preserve">На этом разговор кончился. Не потому, что мне нечего было ответить — у меня в горле застряло столько ответов, что я мог бы говорить до утра. А потому что повышать на него голос означало однажды поднять на него руку, а такого я не сделаю, как и не подниму руку ни на кого, пока меня не загонят в угол. Я слишком хорошо знаю, какая во не живет сила, когда я спускаю ее с поводка. Я развернулся и ушёл искать следующий контракт.</w:t>
+      </w:r>
+    </w:p>
+    <w:p>
+      <w:pPr>
+        <w:spacing w:line="360" w:lineRule="auto"/>
+        <w:ind w:firstLine="567"/>
+        <w:jc w:val="both"/>
+        <w:rPr>
+          <w:sz w:val="28"/>
+          <w:szCs w:val="28"/>
+        </w:rPr>
+      </w:pPr>
+      <w:r>
+        <w:rPr>
+          <w:sz w:val="28"/>
+          <w:szCs w:val="28"/>
+          <w:rtl w:val="0"/>
+        </w:rPr>
+        <w:t xml:space="preserve">С тех пор мы не виделись. Я слышал, что он ушел далеко по своей дороге — туда, где людей уже не спасают, а избавляют: от страданий, от гнилой власти, от самих себя. Формулировку, говорят, он менял от года к году. Но не ее суть.</w:t>
       </w:r>
     </w:p>
     <w:p>
@@ -4129,7 +4128,7 @@
           <w:szCs w:val="28"/>
           <w:rtl w:val="0"/>
         </w:rPr>
-        <w:t xml:space="preserve">ОКНО: 35:40:00.</w:t>
+        <w:t xml:space="preserve">ОКНО: 53:40:56.</w:t>
       </w:r>
       <w:r>
         <w:rPr>
@@ -4156,26 +4155,7 @@
           <w:szCs w:val="28"/>
           <w:rtl w:val="0"/>
         </w:rPr>
-        <w:t xml:space="preserve">Пятьдесят нулей, которым предстояло стать лицами. Я повел корабль к медовой планете и старался не думать о том, как идеально под меня подогнан этот контракт</w:t>
-      </w:r>
-    </w:p>
-    <w:p>
-      <w:pPr>
-        <w:spacing w:line="360" w:lineRule="auto"/>
-        <w:ind w:firstLine="567"/>
-        <w:jc w:val="both"/>
-        <w:rPr>
-          <w:sz w:val="28"/>
-          <w:szCs w:val="28"/>
-        </w:rPr>
-      </w:pPr>
-      <w:r>
-        <w:rPr>
-          <w:sz w:val="28"/>
-          <w:szCs w:val="28"/>
-          <w:rtl w:val="0"/>
-        </w:rPr>
-        <w:t xml:space="preserve">.</w:t>
+        <w:t xml:space="preserve">Пятьдесят нулей, которым предстояло стать лицами. Я повел корабль к медовой планете и старался не думать о том, как идеально под меня подогнан этот контракт.</w:t>
       </w:r>
     </w:p>
     <w:p>
@@ -4532,7 +4512,7 @@
           <w:szCs w:val="28"/>
           <w:rtl w:val="0"/>
         </w:rPr>
-        <w:t xml:space="preserve">— Лекарство там местное, риокка особого сорта, — сказал Вешка вполголоса. — Неделю назад все, что было запасено, скупил картель Сартен. В ноль. Аккурат к тому дню, как Федерация объявила колонию списанной. — Он выразительно помолчал. — Совпадение, ясно. Только знаешь, контрактник, у меня этих совпадений за год накопилось на закономерность. Девять миров, и на каждом кто-то заранее знал, что вычеркнут, и заранее прибрал, что подороже. Как будто список нерентабельных кто-то пишет не в Федерации, а до нее.</w:t>
+        <w:t xml:space="preserve">— Лекарство там местное, риокка особого сорта, — сказал Вешка вполголоса. — Неделю назад все, что было запасено, скупил картель Сартен. В ноль. Аккурат к тому дню, как Федерация объявила колонию списанной. Карантин у них на бумаге — санитарный, только вылета людям он не даёт. Пассажирские допуски закрыты. Картельное имущество вывозить можно, его хозяин не списан. А жителей — нельзя. Поэтому им и нужен ты: провести живых там, где в накладной разрешено только имущество. — Он выразительно помолчал. — Совпадение, ясно. Только знаешь, контрактник, у меня этих совпадений за год накопилось на закономерность. Девять миров, и на каждом кто-то заранее знал, что вычеркнут, и заранее прибрал, что подороже. Как будто список нерентабельных кто-то пишет не в Федерации, а до нее.</w:t>
       </w:r>
     </w:p>
     <w:p>
@@ -4627,7 +4607,7 @@
           <w:szCs w:val="28"/>
           <w:rtl w:val="0"/>
         </w:rPr>
-        <w:t xml:space="preserve">— Тогда соболезную, — сказал Вешка с пониманиему. — Тебе или им — пока не знаю кому.</w:t>
+        <w:t xml:space="preserve">— Тогда соболезную, — сказал Вешка с пониманием. — Тебе или им — пока не знаю кому.</w:t>
       </w:r>
     </w:p>
     <w:p>
@@ -4798,7 +4778,7 @@
           <w:szCs w:val="28"/>
           <w:rtl w:val="0"/>
         </w:rPr>
-        <w:t xml:space="preserve">Курс на Семари лег ровно. А внутри — впервые еще до планеты — уже сидело то, чего Вешка не смог назвать и от чего отшатнулся: тго, кто забирает.</w:t>
+        <w:t xml:space="preserve">Курс на Семари лег ровно. А внутри — впервые еще до планеты — уже сидело то, чего Вешка не смог назвать и от чего отшатнулся: того, кто забирает.</w:t>
       </w:r>
     </w:p>
     <w:p>
@@ -5062,7 +5042,7 @@
           <w:szCs w:val="28"/>
           <w:rtl w:val="0"/>
         </w:rPr>
-        <w:t xml:space="preserve">— Я и не знаю, как его звали, — сказал я. — Никто не знает. Эсквайр — это не имя, это должность, которую он сам себе придумал. Оруженосец. Хотя, я так и не понял чье оружие он носит. Он вытаскивал людей оттуда, откуда не вытаскивал никто, — с горящих станций, из-под обвалов, из карантинов вроде этого. Лучший во всех мирах. И однажды просто исчез, оставив после себя горстку учеников, расползшихся по галактике, да семь строк на пластике. Гордей знал его лично. Гордей и дал мне эту карточку — в тот вечер, когда мы в последний раз сидели за одним столом вдвоем и еще думали, что мы по одну сторону.</w:t>
+        <w:t xml:space="preserve">— Я и не знаю, как его звали, — сказал я. — Никто не знает. Эсквайр — это не имя, это должность, которую он сам себе придумал. Оруженосец. Хотя, я так и не понял чье оружие он носит. Он вытаскивал людей оттуда, откуда не вытаскивал никто, — с горящих станций, из-под обвалов, из карантинов вроде этого. Лучший во всех мирах. И однажды просто исчез, оставив после себя горстку учеников, расползшихся по галактике, да семь строк на пластике. Гордей знал его лично. Гордей и дал мне эту карточку — в тот вечер, когда мы с братом в последний раз сидели у него за одним столом и ещё думали, что мы по одну сторону.</w:t>
       </w:r>
     </w:p>
     <w:p>
@@ -5500,7 +5480,7 @@
           <w:szCs w:val="28"/>
           <w:rtl w:val="0"/>
         </w:rPr>
-        <w:t xml:space="preserve">ОКНО: 34:50:00. </w:t>
+        <w:t xml:space="preserve">ОКНО: 52:40:08. </w:t>
       </w:r>
     </w:p>
     <w:p>
@@ -5699,7 +5679,7 @@
           <w:szCs w:val="28"/>
           <w:rtl w:val="0"/>
         </w:rPr>
-        <w:t xml:space="preserve">Я надел маску. Фильтр в ней был из той же семарийской риокки — серое волокно, которое связывало яд раньше, чем тот добирался до меня. Сутки на фильтр. У пятидесяти человек внизу можнт не было и этого, иначе они не сидели бы здесь, считая вдохи.</w:t>
+        <w:t xml:space="preserve">Я надел маску. Фильтр в ней был из той же семарийской риокки — серое волокно, которое связывало яд раньше, чем тот добирался до меня. Сутки на фильтр. У пятидесяти человек внизу могло не быть и этого, иначе они не сидели бы здесь, считая вдохи.</w:t>
       </w:r>
     </w:p>
     <w:p>
@@ -5875,7 +5855,7 @@
           <w:szCs w:val="28"/>
           <w:rtl w:val="0"/>
         </w:rPr>
-        <w:t xml:space="preserve">ОКНО: 34:30:00. </w:t>
+        <w:t xml:space="preserve">ОКНО: 52:30:12. </w:t>
       </w:r>
     </w:p>
     <w:p>
@@ -6053,7 +6033,7 @@
           <w:szCs w:val="28"/>
           <w:rtl w:val="0"/>
         </w:rPr>
-        <w:t xml:space="preserve">Шлюз был самодельный — две двери и тамбур с продувкой, собранный руками, которые знали, что делают, из того, что нашлось. Я прошел продувку, дождался зеленого и во внутренней зоне снял маску. Впервые за час вдохнул воздух, который не пытался меня обокрасть. Временно: ведь купол держался из последних сил. Прессованный антидот вывез картель, осталась живая риокка да фильтр-станция на исходе, и с каждым часом воздуха оставалось все меньше — здоровые легкие пока тянули без маски, а слабым, старикам и младенцам, уже не хватало, и им отдавали личные фильтры из своей доли. Вот что значило здесь «дышать по тарифу»: не маска на каждом лице, а воздух в долг, который кто-то оплачивает, пока счетчик не дошел до нуля. Под куполом было тепло, влажно и пахло землей, прелой зеленью и людьми — тем плотным человеческим запахом, который я не спутаю ни с чем, потому что это запах тех, кого еще можно спасти. Мертвые не пахнут совсем.</w:t>
+        <w:t xml:space="preserve">Шлюз был самодельный — две двери и тамбур с продувкой, собранный руками, которые знали, что делают, из того, что нашлось. Я прошел продувку, дождался зеленого и во внутренней зоне снял маску. Впервые за час вдохнул воздух, который не пытался меня обокрасть. Временно: ведь купол держался из последних сил. Прессованный антидот вывез картель, осталась живая риокка да фильтр-станция на исходе, и с каждым часом воздуха оставалось все меньше — здоровые легкие пока тянули без маски, а слабым, старикам и младенцам, уже не хватало, и им отдавали личные фильтры из своей доли. Вот что значило здесь «дышать по тарифу»: не маска на каждом лице, а воздух в долг, который кто-то оплачивает, пока счетчик не дошел до нуля. Под куполом было тепло, влажно и пахло землей, прелой зеленью и людьми — тем плотным человеческим запахом, который я не спутаю ни с чем, потому что это запах тех, кого еще можно спасти. У мёртвых такого запаха нет вовсе.</w:t>
       </w:r>
     </w:p>
     <w:p>
@@ -6443,7 +6423,7 @@
           <w:szCs w:val="28"/>
           <w:rtl w:val="0"/>
         </w:rPr>
-        <w:t xml:space="preserve">— Шестьдесят один час, — сказал Орен, перехватив мой взгляд. — Было сто. Неделю назад пришел Сартен. Скупил все прессованное, что мы не успели запасти, а живые лотки трогать не стал — он же не садовник, лотки ему ни к чему, он торгует готовым. Оставил нам ровно столько со склада, чтобы мы не задохнулись разом, а медленно поняли, кто теперь хозяин нашему вдоху. — Он говорил без надрыва, перечисляя неисправности, как инженер. — Дети тратят меньше, старики больше. Сати пересчитывает каждый час. Когда табло покажет ноль, все.</w:t>
+        <w:t xml:space="preserve">— Шестьдесят один час, — сказал Орен, перехватив мой взгляд. — Было сто. Неделю назад пришел Сартен. Скупил все прессованное, что мы не успели запасти, а живые лотки трогать не стал — он же не садовник, лотки ему ни к чему, он торгует готовым. Оставил нам ровно столько со склада, чтобы мы не задохнулись разом, а медленно поняли, кто теперь хозяин нашему вдоху. — Он говорил без надрыва, перечисляя неисправности, как инженер. — Шестьдесят один час и пару часов от живых ростков. От них одних вся колония уже не продышит. Дети тратят меньше, старики больше. Сати пересчитывает каждый час. Когда табло покажет ноль, все.</w:t>
       </w:r>
     </w:p>
     <w:p>
@@ -6695,7 +6675,7 @@
           <w:szCs w:val="28"/>
           <w:rtl w:val="0"/>
         </w:rPr>
-        <w:t xml:space="preserve">ОКНО: 33:50:00. </w:t>
+        <w:t xml:space="preserve">ОКНО: 52:10:25. </w:t>
       </w:r>
     </w:p>
     <w:p>
@@ -6911,7 +6891,7 @@
           <w:szCs w:val="28"/>
           <w:rtl w:val="0"/>
         </w:rPr>
-        <w:t xml:space="preserve">Я начал поворачиваться — и качнул вес чуть в сторону, на пробу: не сместится ли ствол по инерции вслед за плечом, не даст ли мне той полусекунды, которой мне обычно хватает. Ствол не сместился. Он переехал ровно на столько, на сколько переехал я, и снова замер напротив груди. Она читала мое тело раньше, чем оно двигалось. Я бросил пробовать и просто повернулся, как просили.</w:t>
+        <w:t xml:space="preserve">Я начал поворачиваться — и качнул вес чуть в сторону, на пробу: не сместится ли ствол по инерции вслед за плечом, не даст ли мне той полсекунды, которой мне обычно хватает. Ствол не сместился. Он переехал ровно на столько, на сколько переехал я, и снова замер напротив груди. Она читала мое тело раньше, чем оно двигалось. Я бросил пробовать и просто повернулся, как просили.</w:t>
       </w:r>
     </w:p>
     <w:p>
@@ -7101,7 +7081,21 @@
           <w:szCs w:val="28"/>
           <w:rtl w:val="0"/>
         </w:rPr>
-        <w:t xml:space="preserve">— Я была здесь раньше тебя. Зашла, как заходят в любой запертый мир, если умеешь: своим бортом, по складке атмосферы, на сутки раньше, пока сторожевики считали ворон. Тебя ведь так учили? — Уголок рта дернулся. — Меня — тоже. Раньше и лучше.  — Она лишь немного опустила ствол — у таких это значит «перемирие до первой глупости». — Я тут за тем же грузом, что велел забрать Сартен. Только я, в отличие от тебя, знаю: никакой это не груз. Говорят ты большой фанат Эсквайра?</w:t>
+        <w:t xml:space="preserve">— Я была здесь раньше тебя. Зашла, как заходят в любой запертый мир, если умеешь: своим бортом, по складке атмосферы, на сутки раньше, пока сторожевики считали ворон. Тебя ведь так учили? — Уголок рта дернулся. — Меня — тоже. Раньше и лучше.  — Она лишь немного опустила ствол — у таких это значит «перемирие до первой глупости». — Правда, повезло мне меньше,</w:t>
+      </w:r>
+      <w:r>
+        <w:rPr>
+          <w:rtl w:val="0"/>
+        </w:rPr>
+        <w:t xml:space="preserve">чем тебе. </w:t>
+      </w:r>
+      <w:r>
+        <w:rPr>
+          <w:sz w:val="28"/>
+          <w:szCs w:val="28"/>
+          <w:rtl w:val="0"/>
+        </w:rPr>
+        <w:t xml:space="preserve">Обратно малышка моя уже не взлетит — пробили двигатель на последнем снижении. Спрятала корпус в расщелине. Я тут за тем же грузом, что велел забрать Сартен. Только я, в отличие от тебя, знаю: никакой это не груз. Говорят ты большой фанат Эсквайра?</w:t>
       </w:r>
     </w:p>
     <w:p>
@@ -7139,7 +7133,7 @@
           <w:szCs w:val="28"/>
           <w:rtl w:val="0"/>
         </w:rPr>
-        <w:t xml:space="preserve">— Знаешь, кто меня вытащил, когда я была младше той девчонки с куклой из рукавиц? — сказала она. — Эсквайр. Настоящий, не из ваших барных сказок, где он ростом с башню и палит с двух рук. Вынес меня с планеты, которую тоже списали. Красиво вынес, без единой царапины. Я потом полжизни думала, какой он был аккуратный. — Она усмехнулась, и усмешка вышла недобрая, обращенная внутрь. — А потом узнала, что за мой вынос кто-то заплатил. Не я. Другие. До сих пор не знаю кто и сколько. Знаю только, что чисто — не бывает бесплатно. Где-то всегда лежит неоплаченная квитанция, и однажды ее приносят. Тебе двадцать два раза везло, Кай. Спроси себя на досуге, кто доплачивал. Раз не ты — значит, кто-то другой.</w:t>
+        <w:t xml:space="preserve">— Знаешь, что это он меня вытащил, когда мне было девять? — сказала она. — Эсквайр. Настоящий, не из ваших барных сказок, где он ростом с башню и палит с двух рук. Вынес меня с планеты, которую тоже списали. Красиво вынес, без единой царапины. Я потом полжизни думала, какой он был аккуратный. — Она усмехнулась, и усмешка вышла недобрая, обращенная внутрь. — А потом узнала, что за мой вынос кто-то заплатил. Не я. Другие. До сих пор не знаю кто и сколько. Знаю только, что чисто — не бывает бесплатно. Где-то всегда лежит неоплаченная квитанция, и однажды ее приносят. Тебе двадцать два раза везло, Кай. Спроси себя на досуге, кто доплачивал. Раз не ты — значит, кто-то другой.</w:t>
       </w:r>
     </w:p>
     <w:p>
@@ -7327,7 +7321,7 @@
           <w:szCs w:val="28"/>
           <w:rtl w:val="0"/>
         </w:rPr>
-        <w:t xml:space="preserve">До склада был день пути, и этот день я провел в колонии, потому что хорошую кражу, как и хороший побег, не делают без разведки. Я смотрел, слушал, считал, кто на чем держится и кто кого не бросит, и ждал темноты — под темнотой склады Сартена сговорчивее, а охрана глупее.</w:t>
+        <w:t xml:space="preserve">До склада было около часа пешком, и несколько часов до темноты я провел в колонии, потому что хорошую кражу, как и хороший побег, не делают без разведки. Я смотрел, слушал, считал, кто на чем держится и кто кого не бросит, и ждал темноты — под темнотой склады Сартена сговорчивее, а охрана глупее.</w:t>
       </w:r>
     </w:p>
     <w:p>
@@ -7669,7 +7663,7 @@
           <w:szCs w:val="28"/>
           <w:rtl w:val="0"/>
         </w:rPr>
-        <w:t xml:space="preserve">— То есть дыра есть, и кто-то поставил у нее фотоаппарат, — сказал Дживс. — Джулия не соврала про слабое место. Она забыла упомянуть, что это слабое место с подсветкой и зрителями. Хотя, возможно, как раз поэтому она сама туда и не полезла.</w:t>
+        <w:t xml:space="preserve">— То есть дыра есть, и кто-то поставил у нее фотоаппарат, — сказал Дживс. — Джулия не соврала ни про слабое место, ни про ловушку. Теперь мы знаем, где у нее подсветка и зрители.</w:t>
       </w:r>
     </w:p>
     <w:p>
@@ -7914,7 +7908,7 @@
           <w:szCs w:val="28"/>
           <w:rtl w:val="0"/>
         </w:rPr>
-        <w:t xml:space="preserve">— Раз не спишь — гляди, чтоб не зря стоял. Вот, держи. — Он отщипнул серый, невзрачный лоскут волокна, уже отжившего свое на грядке, и положил мне на ладонь. — Это риокка, контрактник. Не лекарство, лекарство — это сок, его жмут из живого. Это отработка, волокно. Кажется, мусор, да? А она, между прочим, штука хитрее всех нас. Подыши на нее.</w:t>
+        <w:t xml:space="preserve">— Раз не спишь — гляди, чтоб не зря стоял. Вот, держи. — Он отщипнул серый, невзрачный лоскут волокна, уже отжившего свое на грядке, и положил мне на ладонь. — Ты с риоккой работаешь, контрактник. Гляди, что от неё остаётся здесь. Лекарство для легких — сок, его жмут из живого. А волокно идет в фильтры. Это уже отработка с грядки. Кажется, мусор, да? А она, между прочим, штука хитрее всех нас. Подыши на нее.</w:t>
       </w:r>
     </w:p>
     <w:p>
@@ -7971,7 +7965,7 @@
           <w:szCs w:val="28"/>
           <w:rtl w:val="0"/>
         </w:rPr>
-        <w:t xml:space="preserve">— И зачем мне это знать перед делом? — спросил я, вертя в пальцах потеплевший лоскут.</w:t>
+        <w:t xml:space="preserve">— Маскировку я знаю, Орен. Ты к чему клонишь? — спросил я, вертя в пальцах потеплевший лоскут.</w:t>
       </w:r>
     </w:p>
     <w:p>
@@ -8273,7 +8267,7 @@
           <w:szCs w:val="28"/>
           <w:rtl w:val="0"/>
         </w:rPr>
-        <w:t xml:space="preserve">Склад Сартена стоял на единственной ровной площадке в дне пути от колонии — приземистый ангар под отдельным куполом, серый, без вывесок. Я лежал на гряде над ним с первыми лучами, вжавшись в рыжую пыль так, что она набилась в каждую складку скафандра, и разглядывал в оптику склад.</w:t>
+        <w:t xml:space="preserve">Склад Сартена стоял на единственной ровной площадке — приземистый ангар под отдельным куполом, серый, без вывесок. Я лежал на гряде над ним с первыми лучами, вжавшись в рыжую пыль так, что она набилась в каждую складку скафандра, и разглядывал в оптику склад.</w:t>
       </w:r>
     </w:p>
     <w:p>
@@ -8539,7 +8533,7 @@
           <w:szCs w:val="28"/>
           <w:rtl w:val="0"/>
         </w:rPr>
-        <w:t xml:space="preserve">Вот эта секунда. Если он дотянется до рации и вызовет старшего, придет человек, который выспался, у которого нет завтрак на плите и которому платят как раз за то, чтобы он говорил «нет». Я не дал ему дотянуться.</w:t>
+        <w:t xml:space="preserve">Вот эта секунда. Если он дотянется до рации и вызовет старшего, придет человек, который выспался, у которого нет завтрака на плите и которому платят как раз за то, чтобы он говорил «нет». Я не дал ему дотянуться.</w:t>
       </w:r>
     </w:p>
     <w:p>
@@ -8653,7 +8647,7 @@
           <w:szCs w:val="28"/>
           <w:rtl w:val="0"/>
         </w:rPr>
-        <w:t xml:space="preserve">Я выкатил из угла гравитационные салазки — здешние же, с биркой склада, чтоб не вносить лишнего, — и начал грузить. Сорок брикетов. Брал не подряд, не сметал ряд, как метет грабитель, а выбирал по краям, из задних, плохо освещенных рядов, по одному, как берет тот, кто действительно ведет опись и сверяется со списком. Грабитель торопится и берет лучшее. Ревизор скучает и берет по номерам. Камера под потолком, если кто и смотрел в нее, видела ревизора.</w:t>
+        <w:t xml:space="preserve">Я выкатил из угла гравитационные салазки — здешние же, с биркой склада, чтоб не вносить лишнего, — и начал грузить. Сначала сорок брикетов по расчёту, потом ещё двадцать в резерв. Расчёты не кашляют ночью, а люди — да. Брал не подряд, не сметал ряд, как метет грабитель, а выбирал по краям, из задних, плохо освещенных рядов, по одному, как берет тот, кто действительно ведет опись и сверяется со списком. Грабитель торопится и берет лучшее. Ревизор скучает и берет по номерам. Камера под потолком, если кто и смотрел в нее, видела ревизора.</w:t>
       </w:r>
     </w:p>
     <w:p>
@@ -8748,26 +8742,26 @@
           <w:szCs w:val="28"/>
           <w:rtl w:val="0"/>
         </w:rPr>
-        <w:t xml:space="preserve">— Грузи быстрее, соучастник. До рассвета надо вынести то, чего, согласно обеим нашим описям, тут отродясь не лежало.</w:t>
-      </w:r>
-    </w:p>
-    <w:p>
-      <w:pPr>
-        <w:spacing w:line="360" w:lineRule="auto"/>
-        <w:ind w:firstLine="567"/>
-        <w:jc w:val="both"/>
-        <w:rPr>
-          <w:sz w:val="28"/>
-          <w:szCs w:val="28"/>
-        </w:rPr>
-      </w:pPr>
-      <w:r>
-        <w:rPr>
-          <w:sz w:val="28"/>
-          <w:szCs w:val="28"/>
-          <w:rtl w:val="0"/>
-        </w:rPr>
-        <w:t xml:space="preserve">На двадцать восьмом брикете в дальнем конце ангара что-то лязгнуло. Я не замер — замирает виноватый, а у меня бумага. Я обернулся неспешно, с лицом человека, которого оторвали от скучного дела.</w:t>
+        <w:t xml:space="preserve">— Грузи быстрее, соучастник. До смены караула надо вынести то, чего, согласно обеим нашим описям, тут отродясь не лежало.</w:t>
+      </w:r>
+    </w:p>
+    <w:p>
+      <w:pPr>
+        <w:spacing w:line="360" w:lineRule="auto"/>
+        <w:ind w:firstLine="567"/>
+        <w:jc w:val="both"/>
+        <w:rPr>
+          <w:sz w:val="28"/>
+          <w:szCs w:val="28"/>
+        </w:rPr>
+      </w:pPr>
+      <w:r>
+        <w:rPr>
+          <w:sz w:val="28"/>
+          <w:szCs w:val="28"/>
+          <w:rtl w:val="0"/>
+        </w:rPr>
+        <w:t xml:space="preserve">Пока я перекладывал двадцать восьмой брикет в дальнем конце ангара что-то лязгнуло. Я не замер — замирает виноватый, а у меня бумага. Я обернулся неспешно, с лицом человека, которого оторвали от скучного дела.</w:t>
       </w:r>
     </w:p>
     <w:p>
@@ -8850,7 +8844,7 @@
           <w:szCs w:val="28"/>
           <w:rtl w:val="0"/>
         </w:rPr>
-        <w:t xml:space="preserve">ОКНО: 30:30:00.</w:t>
+        <w:t xml:space="preserve">ОКНО: 40:32:54.</w:t>
       </w:r>
     </w:p>
     <w:p>
@@ -8897,7 +8891,7 @@
           <w:szCs w:val="28"/>
           <w:rtl w:val="0"/>
         </w:rPr>
-        <w:t xml:space="preserve">Тридцать один. Почти вдвое против того, с чем я садился. Я расписался в журнале выдачи у выхода — «санитарная опись, изъято на пересчет шестьдесят единиц, подпись» — и вывел подпись красиво, с росчерком, потому что красивая подпись внушает доверие сильнее любой печати: человек, который так выводит хвостик у последней буквы, не может спешить, а кто не спешит, тому нечего скрывать. Так думает тот, кто читает. Тот, кто пишет, знает, что это ровно наоборот.</w:t>
+        <w:t xml:space="preserve">Сорок. Почти вдвое против того, когда я брал заказ. Я расписался в журнале выдачи у выхода — «санитарная опись, изъято на пересчет шестьдесят единиц, подпись» — и вывел подпись красиво, с росчерком, потому что красивая подпись внушает доверие сильнее любой печати: человек, который так выводит хвостик у последней буквы, не может спешить, а кто не спешит, тому нечего скрывать. Так думает тот, кто читает. Тот, кто пишет, знает, что это ровно наоборот.</w:t>
       </w:r>
     </w:p>
     <w:p>
@@ -8973,7 +8967,7 @@
           <w:szCs w:val="28"/>
           <w:rtl w:val="0"/>
         </w:rPr>
-        <w:t xml:space="preserve">— Я не порчу. Я считаю, это моя единственная радость, не отнимайте. Кай, сложите факты, как я их складываю. Стратегический склад картеля. Молодой охранник, которого почему-то поставили одного на смену. Камера в режиме, который я взломал слишком быстро для боевого объекта. Сорок брикетов, сданных под санитарную бумажку, какой не обманешь даже сонного интенданта, если ему велено не обманываться. Вас не перехитрили, Кай. Вам не сопротивлялись. Вас впустили. Это разные глаголы, и между ними — пропасть.</w:t>
+        <w:t xml:space="preserve">— Я не порчу. Я считаю, это моя единственная радость, не отнимайте. Кай, сложите факты, как я их складываю. Стратегический склад картеля. Молодой охранник, которого почему-то поставили одного на смену. Камера в режиме, который я взломал слишком быстро для боевого объекта. Шестьдесят брикетов, сданных под санитарную бумажку, какой не обманешь даже сонного интенданта, если ему велено не обманываться. Вас не перехитрили, Кай. Вам не сопротивлялись. Вас впустили. Это разные глаголы, и между ними — пропасть.</w:t>
       </w:r>
     </w:p>
     <w:p>
@@ -9163,7 +9157,7 @@
           <w:szCs w:val="28"/>
           <w:rtl w:val="0"/>
         </w:rPr>
-        <w:t xml:space="preserve">Я смотрел на желтую муть в небе, на рыжую дорогу, по которой мне предстояло везти сорок чужих вдохов обратно к колонии, и впервые чувствовал себя обворованным, но которому вор почему-то оставил кошелек. Кражу, которую тебе позволили, и кражей-то не назовешь. Назовешь — выдачей со склада. По описи. С распиской, которую ты сам и подмахнул, гордясь почерком.</w:t>
+        <w:t xml:space="preserve">Я смотрел на желтую муть в небе, на рыжую дорогу, по которой мне предстояло везти шестьдесят чужих вдохов обратно к колонии, и впервые чувствовал себя обворованным, которому вор почему-то оставил кошелёк. Кражу, которую тебе позволили, и кражей-то не назовешь. Назовешь — выдачей со склада. По описи. С распиской, которую ты сам и подмахнул, гордясь почерком.</w:t>
       </w:r>
     </w:p>
     <w:p>
@@ -9275,7 +9269,7 @@
           <w:szCs w:val="28"/>
           <w:rtl w:val="0"/>
         </w:rPr>
-        <w:t xml:space="preserve">Он догнал меня к полудню — без погони, без выстрелов, без единого лишнего движения. Просто его машина встала поперек моей единственной дороги, аккуратно, точно в том месте, где я собирался поставить точку, — и поставила вместо нее запятую. Я остановил салазки с сорока брикетами и стал ждать. Бежать было некуда: дорога одна, и он это знал лучше меня, потому что, как я начинал догадываться, он знал тут лучше меня почти все.</w:t>
+        <w:t xml:space="preserve">Он догнал меня на обратной дороге — без погони, без выстрелов, без единого лишнего движения. Просто его машина встала поперек моей единственной дороги, аккуратно, точно в том месте, где я собирался поставить точку, — и поставила вместо нее запятую. Я остановил салазки с шестьюдесятью брикетами и стал ждать. Бежать было некуда: дорога одна, и он это знал лучше меня, потому что, как я начинал догадываться, он знал тут лучше меня почти все.</w:t>
       </w:r>
     </w:p>
     <w:p>
@@ -9370,7 +9364,7 @@
           <w:szCs w:val="28"/>
           <w:rtl w:val="0"/>
         </w:rPr>
-        <w:t xml:space="preserve">— Красиво звучит. — Он не выпустил мою ладонь сразу, подержал секунду дольше нужного, будто взвешивал. — Знаете, что меня в вас порадовало сегодня утром? Аккуратность работы. Давайте я перескажу, а вы поправите, если ошибусь. — Он отпустил руку и заговорил мерно, как зачитывают опись. — Вы пришли с дороги, не сверху. Встали в слепом секторе камеры — узкий такой клин у юго-западной опоры, я сам его не люблю. Сунули мальчику планшет раньше, чем он открыл рот. Когда он потянулся к рации, вы зевнули. Хороший ход. Зевок снимает тревогу быстрее улыбки, улыбке у нас тут не верят. Потом переложили ответственность на его сменщика и доступ получили под подпись, а не под взлом, чтоб в журнале все было гладко. Брали из задних рядов, по краям, как берет ревизор, а не вор. И расписались в журнале с росчерком — чтоб подпись выглядела неторопливой. — Он чуть склонил голову. — Я ничего не упустил?</w:t>
+        <w:t xml:space="preserve">— Красиво звучит. — Он не выпустил мою ладонь сразу, подержал секунду дольше нужного, будто взвешивал. — Знаете, что меня в вас порадовало сегодня утром? Аккуратность. Мёртвый сектор камеры, зевок вместо нажима, доступ под подпись. И росчерк в журнале, будто вы никуда не спешили. — Он отпустил руку. — Я ничего не упустил?</w:t>
       </w:r>
     </w:p>
     <w:p>
@@ -9503,7 +9497,7 @@
           <w:szCs w:val="28"/>
           <w:rtl w:val="0"/>
         </w:rPr>
-        <w:t xml:space="preserve">— Вы вышли ко мне один, без автоматчиков, хотя их у вас в ангаре было четверо, я считал. Не из храбрости — из расчета: при свидетелях я бы держал лицо, а вам нужно было мое, настоящее. Вы перегородили дорогу машиной, но встали не вплотную, а в трех корпусах — чтоб я не почувствовал угрозы и не задергался; дерганый человек хуже считывается. Вы похвалили мою работу прежде, чем перейти к делу, — потому что человек, которого только что похвалили, на полминуты глупеет от удовольствия, и эти полминуты вы себе выторговали. И вы поправили манжету ровно один раз — на словах «сроки сдвигают». Один раз за весь разговор вы дотронулись до себя, Манос. Там, где у вас болит. — Я выдержал паузу, его же, выверенную. — Так что не вы один тут умеете читать чужой почерк. Просто я, в отличие от вас, еще и слушаю. И я только что услышал, что аккуратнейший человек на этой планете боится. Это, знаете ли, дороже сорока брикетов.</w:t>
+        <w:t xml:space="preserve">— Вы вышли ко мне один, без автоматчиков, хотя их у вас в ангаре было четверо, я считал. Не из храбрости — из расчета: при свидетелях я бы держал лицо, а вам нужно было мое, настоящее. Вы перегородили дорогу машиной, но встали не вплотную, а в трех корпусах — чтоб я не почувствовал угрозы и не задергался; дерганый человек хуже считывается. Вы похвалили мою работу прежде, чем перейти к делу, — потому что человек, которого только что похвалили, на полминуты глупеет от удовольствия, и эти полминуты вы себе выторговали. И вы поправили манжету ровно один раз — на словах «сроки сдвигают». Один раз за весь разговор вы дотронулись до себя, Манос. Там, где у вас болит. — Я выдержал паузу, его же, выверенную. — Так что не вы один тут умеете читать чужой почерк. Просто я, в отличие от вас, еще и слушаю. И я только что услышал, что аккуратнейший человек на этой планете боится. Это, знаете ли, дороже шестидесяти брикетов.</w:t>
       </w:r>
     </w:p>
     <w:p>
@@ -9617,7 +9611,7 @@
           <w:szCs w:val="28"/>
           <w:rtl w:val="0"/>
         </w:rPr>
-        <w:t xml:space="preserve">— С того, что мне велели помочь. — Он сказал это просто, и в простоте было больше холода, чем во всем ангаре с лекарством. — Я, как и вы, человек чужой графы. Мне передали сверху: пусть контрактник вывезет колонию. Не мешай. Поспособствуй. Я не спрашиваю зачем — за «зачем» в моем ремесле не доплачивают. Но я скажу вам, чего я в этом всем не люблю, раз уж мы коллеги и можем позволить себе минуту откровенности. — Он во второй раз за разговор поправил манжету, и этот мелкий, выверенный жест снова выдал в нем то, чего не выдавало лицо. — Я привык быть тем, кто двигает сроки. Кто говорит блокаде «отвернись» и кораблям «постойте». А в этой истории сроки двигаю не я. Их двигает кто-то надо мной, кого я не вижу и не считаю. И мне это, Кай, не нравится ровно настолько же, насколько не понравится вам через сутки.</w:t>
+        <w:t xml:space="preserve">— С того, что мне велели помочь. — Он сказал это просто, и в простоте было больше холода, чем во всем ангаре с лекарством. — Я, как и вы, человек чужой графы. Мне передали сверху: пусть контрактник вывезет колонию. Не мешай. Поспособствуй. Я не спрашиваю зачем — за «зачем» в моем ремесле не доплачивают. Но я скажу вам, чего я в этом всем не люблю, раз уж мы коллеги и можем позволить себе минуту откровенности. — Он во второй раз за разговор поправил манжету, и этот мелкий, выверенный жест снова выдал в нем то, чего не выдавало лицо. — Я привык быть тем, кто двигает сроки. Кто говорит блокаде «отвернись» и кораблям «постойте». А в этой истории сроки двигаю не я. Их двигает кто-то надо мной, кого я не вижу и не считаю. И мне это, Кай, не нравится ровно настолько же, насколько не понравится вам совсем скоро.</w:t>
       </w:r>
     </w:p>
     <w:p>
@@ -9655,26 +9649,26 @@
           <w:szCs w:val="28"/>
           <w:rtl w:val="0"/>
         </w:rPr>
-        <w:t xml:space="preserve">— Завтра я пришлю вам кое-что в колонию, — сказал он в опущенное окно. — И тогда поговорим об условии. Условие у меня одно. Вам оно не понравится. Но оно честное — в том смысле, в каком честен курс обмена: не добрый, не злой, просто точный.</w:t>
-      </w:r>
-    </w:p>
-    <w:p>
-      <w:pPr>
-        <w:spacing w:line="360" w:lineRule="auto"/>
-        <w:ind w:firstLine="567"/>
-        <w:jc w:val="both"/>
-        <w:rPr>
-          <w:sz w:val="28"/>
-          <w:szCs w:val="28"/>
-        </w:rPr>
-      </w:pPr>
-      <w:r>
-        <w:rPr>
-          <w:sz w:val="28"/>
-          <w:szCs w:val="28"/>
-          <w:rtl w:val="0"/>
-        </w:rPr>
-        <w:t xml:space="preserve">Машина ушла, мягко, без пыли — он даже ездил аккуратно. Я стоял посреди рыжей дороги рядом с сорока чужими вдохами на салазках и впервые чувствовал себя не тем, кто ведет игру, а фигурой на доске, которую двигают уважительно, точно зная, на какую клетку я встану следующим ходом.</w:t>
+        <w:t xml:space="preserve">— К вечеру я пришлю вам кое-что в колонию, — сказал он в опущенное окно. — И тогда поговорим об условии. Условие у меня одно. Вам оно не понравится. Но оно честное — в том смысле, в каком честен курс обмена: не добрый, не злой, просто точный.</w:t>
+      </w:r>
+    </w:p>
+    <w:p>
+      <w:pPr>
+        <w:spacing w:line="360" w:lineRule="auto"/>
+        <w:ind w:firstLine="567"/>
+        <w:jc w:val="both"/>
+        <w:rPr>
+          <w:sz w:val="28"/>
+          <w:szCs w:val="28"/>
+        </w:rPr>
+      </w:pPr>
+      <w:r>
+        <w:rPr>
+          <w:sz w:val="28"/>
+          <w:szCs w:val="28"/>
+          <w:rtl w:val="0"/>
+        </w:rPr>
+        <w:t xml:space="preserve">Машина ушла, мягко, без пыли — он даже ездил аккуратно. Я стоял посреди рыжей дороги рядом с шестьюдесятью чужими вдохами на салазках и впервые чувствовал себя не тем, кто ведет игру, а фигурой на доске, которую двигают уважительно, точно зная, на какую клетку я встану следующим ходом.</w:t>
         <w:br w:type="textWrapping"/>
       </w:r>
     </w:p>
@@ -9845,6 +9839,46 @@
     </w:p>
     <w:p>
       <w:pPr>
+        <w:rPr/>
+      </w:pPr>
+      <w:r>
+        <w:rPr>
+          <w:rtl w:val="0"/>
+        </w:rPr>
+      </w:r>
+    </w:p>
+    <w:p>
+      <w:pPr>
+        <w:rPr/>
+      </w:pPr>
+      <w:r>
+        <w:rPr>
+          <w:rtl w:val="0"/>
+        </w:rPr>
+      </w:r>
+    </w:p>
+    <w:p>
+      <w:pPr>
+        <w:rPr/>
+      </w:pPr>
+      <w:r>
+        <w:rPr>
+          <w:rtl w:val="0"/>
+        </w:rPr>
+      </w:r>
+    </w:p>
+    <w:p>
+      <w:pPr>
+        <w:rPr/>
+      </w:pPr>
+      <w:r>
+        <w:rPr>
+          <w:rtl w:val="0"/>
+        </w:rPr>
+      </w:r>
+    </w:p>
+    <w:p>
+      <w:pPr>
         <w:pStyle w:val="Heading1"/>
         <w:spacing w:after="360" w:before="480" w:line="360" w:lineRule="auto"/>
         <w:jc w:val="center"/>
@@ -9913,7 +9947,7 @@
           <w:szCs w:val="28"/>
           <w:rtl w:val="0"/>
         </w:rPr>
-        <w:t xml:space="preserve">Поэтому, вернувшись с дороги, где он отдал контрактнику сорок брикетов, Манос сел за свой прибранный стол и впервые за много лет почувствовал то, чего не должен был чувствовать профессионал его уровня. Неловкость. Не страх — страх он бы посчитал и обезвредил. Именно неловкость, тонкую, как песок в подшипнике.</w:t>
+        <w:t xml:space="preserve">Поэтому, вернувшись с дороги, Манос сел за свой прибранный стол и впервые за много лет почувствовал то, чего не должен был чувствовать профессионал его уровня. Неловкость. Не страх — страх он бы посчитал и обезвредил. Именно неловкость, тонкую, как песок в подшипнике.</w:t>
       </w:r>
     </w:p>
     <w:p>
@@ -10177,7 +10211,7 @@
           <w:szCs w:val="28"/>
           <w:rtl w:val="0"/>
         </w:rPr>
-        <w:t xml:space="preserve">Манос не соврал: прислал на следующий же день, под вечер, когда колония готовилась к отправке первой партии колонистов и воздух в куполе казался особенно дорогим.</w:t>
+        <w:t xml:space="preserve">Манос не соврал: прислал в тот же день, под вечер, когда колония готовилась к отправке первой партии колонистов и воздух в куполе казался особенно дорогим.</w:t>
       </w:r>
     </w:p>
     <w:p>
@@ -10405,26 +10439,26 @@
           <w:szCs w:val="28"/>
           <w:rtl w:val="0"/>
         </w:rPr>
-        <w:t xml:space="preserve">Под утро, когда колония спала тонким экономным сном, к платформе пришла Джулия. Я ее не звал — она пришла сама, тихо, как ходят те, кто привык не будить охрану. Постояла над ящиком, присела на корточки, провела пальцами по шву замка — не пытаясь открыть, а словно читая на ощупь, как читают слепые.</w:t>
-      </w:r>
-    </w:p>
-    <w:p>
-      <w:pPr>
-        <w:spacing w:line="360" w:lineRule="auto"/>
-        <w:ind w:firstLine="567"/>
-        <w:jc w:val="both"/>
-        <w:rPr>
-          <w:sz w:val="28"/>
-          <w:szCs w:val="28"/>
-        </w:rPr>
-      </w:pPr>
-      <w:r>
-        <w:rPr>
-          <w:sz w:val="28"/>
-          <w:szCs w:val="28"/>
-          <w:rtl w:val="0"/>
-        </w:rPr>
-        <w:t xml:space="preserve">— Замок хастовский, — сказала она наконец, и голос у нее был не тот, каким она ставила диагнозы и дарила авансы доверия. Тише. — Старого образца. Такие ставил Эсквайр на то, что нельзя было терять и нельзя было показывать. Двойной контур, прописка под одну руку, узор на шве — вот этот, в три витка. Я этот узор знаю с детства, Кай. Я под таким замком однажды лежала. — Она провела пальцем по шву, не касаясь самой точки. — И знаю про него одну подлую вещь. Он читает не отпечаток — отпечаток подделать как нечего делать. Он читает живую руку под кожей: ток, рисунок сосудов, то, что от родителей достается и чего не сменишь. Поэтому его и нельзя обмануть чертежом. Но есть у этой подлости и обратная сторона, про которую Хаст, думаю, не больно-то распространялся заказчикам. Кровь у такого замка проходит по допуску. Близкая кровь — по половинному. Брат, например. — Она подняла на меня глаза, и впервые за все знакомство ее холодный расчет дал трещину; под ним оказался не страх — что-то старше страха, что-то с корнями в той самой планете, с которой ее когда-то спасли. — То, что лежит в ящике с таким замком, что везут с планеты, назначенной к смерти, под видом гуманитарного груза, наравне с детьми, — это не вещь. Вещь так не пакуют. Так пакуют рычаг.</w:t>
+        <w:t xml:space="preserve">В сумерках, когда колония собиралась к выходу, к платформе пришла Джулия. Я ее не звал — она пришла сама, тихо, как ходят те, кто привык не будить охрану. Постояла над ящиком, присела на корточки, провела пальцами по шву замка — не пытаясь открыть, а словно читая на ощупь, как читают слепые.</w:t>
+      </w:r>
+    </w:p>
+    <w:p>
+      <w:pPr>
+        <w:spacing w:line="360" w:lineRule="auto"/>
+        <w:ind w:firstLine="567"/>
+        <w:jc w:val="both"/>
+        <w:rPr>
+          <w:sz w:val="28"/>
+          <w:szCs w:val="28"/>
+        </w:rPr>
+      </w:pPr>
+      <w:r>
+        <w:rPr>
+          <w:sz w:val="28"/>
+          <w:szCs w:val="28"/>
+          <w:rtl w:val="0"/>
+        </w:rPr>
+        <w:t xml:space="preserve">— Замок хастовский, — сказала она наконец, и голос у нее был не тот, каким она ставила диагнозы и дарила авансы доверия. Тише. — Старого образца. Такие ставил Эсквайр на то, что нельзя было терять и нельзя было показывать. Двойной контур, прописка под одну руку, узор на шве — вот этот, в три витка. Я этот узор знаю с детства, Кай. Я под таким замком однажды лежала. — Она провела пальцем по шву, не касаясь самой точки. — И знаю про него одну подлую вещь. Он читает не отпечаток — отпечаток подделать как нечего делать. Он читает живую руку под кожей: ток, рисунок сосудов, то, что от родителей достается и чего не сменишь. Поэтому его и нельзя обмануть чертежом. Но есть у этой подлости и обратная сторона, про которую Хаст, думаю, не больно-то распространялся заказчикам. Кровь у такого замка проходит по допуску. Близкая кровь — по половинному. Брат, например. Есть ещё аварийный режим для раненого владельца — он сбрасывает часть проверок. Но туда просто так не войдёшь, и за такой обман можно заплатить рукой. — Она подняла на меня глаза, и впервые за все знакомство ее холодный расчет дал трещину; под ним оказался не страх — что-то старше страха, что-то с корнями в той самой планете, с которой ее когда-то спасли. — То, что лежит в ящике с таким замком, что везут с планеты, назначенной к смерти, под видом гуманитарного груза, наравне с детьми, — это не вещь. Вещь так не пакуют. Так пакуют рычаг.</w:t>
       </w:r>
     </w:p>
     <w:p>
@@ -10462,7 +10496,7 @@
           <w:szCs w:val="28"/>
           <w:rtl w:val="0"/>
         </w:rPr>
-        <w:t xml:space="preserve">— От чего-нибудь очень большого. — Она встала, отряхнула колени, и расчет вернулся ей на лицо, но уже с подкладкой. — Подумай сам. Что во вселенной такого, что ради этого списывали целую колонию, поднимали блокаду на полдня раньше срока и нанимали конкретного человека? Не золото. Золото возят проще. Что-то, чем можно сдвинуть очень большую плиту. Или обрушить.</w:t>
+        <w:t xml:space="preserve">— От чего-нибудь очень большого. — Она встала, отряхнула колени, и расчет вернулся ей на лицо, но уже с подкладкой. — Подумай сам. Что во вселенной такого, что ради этого списывали целую колонию, ставили карантинную блокаду и нанимали конкретного человека? Не золото. Золото возят проще. Что-то, чем можно сдвинуть очень большую плиту. Или обрушить.</w:t>
       </w:r>
     </w:p>
     <w:p>
@@ -10640,7 +10674,7 @@
           <w:szCs w:val="28"/>
           <w:rtl w:val="0"/>
         </w:rPr>
-        <w:t xml:space="preserve">ОКНО: 13:40:00.</w:t>
+        <w:t xml:space="preserve">ОКНО: 28:40:00.</w:t>
       </w:r>
     </w:p>
     <w:p>
@@ -10837,7 +10871,7 @@
           <w:szCs w:val="28"/>
           <w:rtl w:val="0"/>
         </w:rPr>
-        <w:t xml:space="preserve">Пятьдесят человек. Один трюм, в который без удушья влезает от силы тридцать. Планета, которой нельзя дышать. Картель, который продал лекарство и теперь любезно «не мешает». Ящик, который идет наравне с людьми. И окно — двенадцать часов до того, как Федерация запечатает небо. Я разложил это все в голове, как раскладывают пасьянс, в котором не хватает половины карт, и принялся жульничать, потому что честно такой пасьянс не сходится.</w:t>
+        <w:t xml:space="preserve">Пятьдесят человек. Один трюм, в который без удушья влезает от силы тридцать. Планета, которой нельзя дышать. Картель, который продал лекарство и теперь любезно «не мешает». Ящик, который идет наравне с людьми. И окно — почти тридцать часов до того, как Федерация запечатает небо. Я разложил это все в голове, как раскладывают пасьянс, в котором не хватает половины карт, и принялся жульничать, потому что честно такой пасьянс не сходится.</w:t>
       </w:r>
     </w:p>
     <w:p>
@@ -10913,26 +10947,26 @@
           <w:szCs w:val="28"/>
           <w:rtl w:val="0"/>
         </w:rPr>
-        <w:t xml:space="preserve">— Три из четырех, — отозвался искин после паузы, в которой он, кажется, заново прокрутил ту картинку. — У четвертого, старого рудовоза «Гента», взрывом снесло рубку и носовые отсеки, а кормовой грузовой трюм — бронированный, под руду — держит воздух до сих пор. Глухой, темный, но герметичный. Запитаю от наших резервов — подниму там аварийное жизнеобеспечение часа на четыре. Скрипеть будет на полсистемы.</w:t>
-      </w:r>
-    </w:p>
-    <w:p>
-      <w:pPr>
-        <w:spacing w:line="360" w:lineRule="auto"/>
-        <w:ind w:firstLine="567"/>
-        <w:jc w:val="both"/>
-        <w:rPr>
-          <w:sz w:val="28"/>
-          <w:szCs w:val="28"/>
-        </w:rPr>
-      </w:pPr>
-      <w:r>
-        <w:rPr>
-          <w:sz w:val="28"/>
-          <w:szCs w:val="28"/>
-          <w:rtl w:val="0"/>
-        </w:rPr>
-        <w:t xml:space="preserve">— Четыре часа мне и хватит, — сказал я. — Первую партию сгружаем в «Генту», под сопровождение Сати на 4 часа. Корабль пустеет — и падает за второй уже по-настоящему налегке, как и задумано. На обратном пути берем трюм «Генты» на грузовые магнитные захваты — враскрепку, с силовым поясом по шву, а не на пассажирское кольцо: на такую массу его никто не рассчитывал. Пойдем на малой тяге, единым неуклюжим составом, его объем и фильтры — к нашим. Полста живых, но на два корпуса, а не на один. А в прыжок с этой баржой не полезем: сбросим людей в тихом мире — тогда и разойдемся налегке. Воздуха нам хватит на всех, хорошо, что все рассчитано на перелет 50 людей. Риск огромный, но на планете они умрут гарантировано, а тут есть шанс. Орен, сколько идти по лощине от колонии до точки подъема?</w:t>
+        <w:t xml:space="preserve">— Три из четырех, — отозвался искин после паузы, в которой он, кажется, заново прокрутил ту картинку. — У четвертого, старого рудовоза «Гента», взрывом снесло рубку и носовые отсеки, а кормовой грузовой трюм — бронированный, под руду — держит воздух до сих пор. Глухой, темный, но герметичный. Запитаю от наших резервов — подниму там аварийное жизнеобеспечение часа на четыре. Скрипеть будет на полсистемы. Наружными ремонтными паучками проверю шов и пояс, когда доберемся.</w:t>
+      </w:r>
+    </w:p>
+    <w:p>
+      <w:pPr>
+        <w:spacing w:line="360" w:lineRule="auto"/>
+        <w:ind w:firstLine="567"/>
+        <w:jc w:val="both"/>
+        <w:rPr>
+          <w:sz w:val="28"/>
+          <w:szCs w:val="28"/>
+        </w:rPr>
+      </w:pPr>
+      <w:r>
+        <w:rPr>
+          <w:sz w:val="28"/>
+          <w:szCs w:val="28"/>
+          <w:rtl w:val="0"/>
+        </w:rPr>
+        <w:t xml:space="preserve">— Четыре часа мне и хватит, — сказал я. — Первую партию сгружаем в «Генту», под сопровождение Сати на 4 часа. Корабль пустеет — и падает за второй уже по-настоящему налегке, как и задумано. На обратном пути берем трюм «Генты» на грузовые магнитные захваты — враскрепку, с силовым поясом по шву, а не на пассажирское кольцо: на такую массу его никто не рассчитывал. Пойдем на малой тяге, единым неуклюжим составом, его объем и фильтры — к нашим. Полста живых, но на два корпуса, а не на один. Сразу в прыжок с этой баржой не полезем. Отведем ее за кольцо, усилим сцепку штатным силовым поясом. Дживс проверит нагрузку — тогда пойдём короткими прыжками до «Сухого дока», пополним воздух и запас фильтров. Риск огромный, но на планете они умрут гарантированно, а тут есть шанс. Орен, сколько идти по лощине от колонии до точки подъема?</w:t>
       </w:r>
     </w:p>
     <w:p>
@@ -10970,7 +11004,7 @@
           <w:szCs w:val="28"/>
           <w:rtl w:val="0"/>
         </w:rPr>
-        <w:t xml:space="preserve">— Полтора туда, час обратно налегке нам, цикл подъема, второй заход на час. Три с половиной часа и 15 минут на стыковку и передачу воздуха. Лучшего варианта у нас нет. — Я считал вслух, потому что вслух у меня считается злее. — Первая партия имеет воздух на 4 часа. Сати, дели людей. Первая партия — все дети, все слабые и старики. Тридцать. Вторая — кто покрепче, кто сможет пробежаться с фильтрами. Двадцать. Здоровые грузятся последними. Жестокость тут ни при чем — просто арифметика: у здоровых есть время на вынужденные маневры, а у больных его нет, и раздавать места по справедливости — значит и хоронить по справедливости.</w:t>
+        <w:t xml:space="preserve">— Полтора часа до корабля, двадцать минут подъёма, пятнадцать на стыковку и передачу воздуха. С этого момента пойдут четыре часа «Генты». За это время возвращаемся налегке, поднимаем вторую партию и берём баржу на буксир. Лучшего варианта у нас нет. — Я считал вслух, потому что вслух у меня считается злее. — Первая партия имеет воздух на 4 часа. Сати, дели людей. Первая партия — все дети, все слабые и старики. Тридцать. Вторая — кто покрепче, кто сможет пробежаться с фильтрами. Двадцать. Здоровые грузятся последними. Жестокость тут ни при чем — просто арифметика: у здоровых есть время на вынужденные маневры, а у больных его нет, и раздавать места по справедливости — значит и хоронить по справедливости.</w:t>
       </w:r>
     </w:p>
     <w:p>
@@ -11084,7 +11118,7 @@
           <w:szCs w:val="28"/>
           <w:rtl w:val="0"/>
         </w:rPr>
-        <w:t xml:space="preserve">— Это нагло, — сказал он наконец, с явным одобрением. — Это противозаконно сразу по нескольким статьям, и если нас раскроют, нам припишут уже не контрабанду, а государственную измену, что, согласись, повышение. Мне нравится. Делаю.</w:t>
+        <w:t xml:space="preserve">— Это нагло, — сказал он наконец, с явным одобрением. — Это противозаконно сразу по нескольким статьям, и если нас раскроют, нам припишут уже не контрабанду, а государственную измену, что, согласитесь, повышение. Мне нравится. Делаю.</w:t>
       </w:r>
     </w:p>
     <w:p>
@@ -11293,26 +11327,26 @@
           <w:szCs w:val="28"/>
           <w:rtl w:val="0"/>
         </w:rPr>
-        <w:t xml:space="preserve">— Не забыл, — сказал я. — Ящик идет со мной, в последнем заходе, нижним ярусом. Я не повезу полусотню живых в одном трюме с тем, чего не открывал и не понимаю. Если этот гроб с сюрпризом решит на удивить — пусть сделает это при мне одном, а не при детях. Это, Орен, единственная роскошь, которую я могу себе позволить в этой раскладке: выбрать, рядом с чем стоять, когда рванет.</w:t>
-      </w:r>
-    </w:p>
-    <w:p>
-      <w:pPr>
-        <w:spacing w:line="360" w:lineRule="auto"/>
-        <w:ind w:firstLine="567"/>
-        <w:jc w:val="both"/>
-        <w:rPr>
-          <w:sz w:val="28"/>
-          <w:szCs w:val="28"/>
-        </w:rPr>
-      </w:pPr>
-      <w:r>
-        <w:rPr>
-          <w:sz w:val="28"/>
-          <w:szCs w:val="28"/>
-          <w:rtl w:val="0"/>
-        </w:rPr>
-        <w:t xml:space="preserve">Я отступил на шаг и оглядел свой пасьянс целиком. Две партии по лощине. Здоровые последними. Поддельный транспондер вместо драки с блокадой. Ящик при мне. Манос, держащий коридор ровно настолько, насколько ему позволит тот, кто над ним. Двенадцать часов. Запаса с головой.</w:t>
+        <w:t xml:space="preserve">— Не забыл, — сказал я. — Ящик идет со мной, в последнем заходе, нижним ярусом. Я не повезу полусотню живых в одном трюме с тем, чего не открывал и не понимаю. Если этот гроб с сюрпризом решит нас удивить — пусть сделает это при мне, а не при детях. Это, Орен, единственная роскошь, которую я могу себе позволить в этой раскладке: выбрать, рядом с чем стоять, когда рванет.</w:t>
+      </w:r>
+    </w:p>
+    <w:p>
+      <w:pPr>
+        <w:spacing w:line="360" w:lineRule="auto"/>
+        <w:ind w:firstLine="567"/>
+        <w:jc w:val="both"/>
+        <w:rPr>
+          <w:sz w:val="28"/>
+          <w:szCs w:val="28"/>
+        </w:rPr>
+      </w:pPr>
+      <w:r>
+        <w:rPr>
+          <w:sz w:val="28"/>
+          <w:szCs w:val="28"/>
+          <w:rtl w:val="0"/>
+        </w:rPr>
+        <w:t xml:space="preserve">Я отступил на шаг и оглядел свой пасьянс целиком. Две партии по лощине. Здоровые последними. Поддельный транспондер вместо драки с блокадой. Ящик при мне. Манос, держащий коридор ровно настолько, насколько ему позволит тот, кто над ним. Почти тридцать часов. Запаса с головой.</w:t>
       </w:r>
     </w:p>
     <w:p>
@@ -11728,7 +11762,7 @@
           <w:szCs w:val="28"/>
           <w:rtl w:val="0"/>
         </w:rPr>
-        <w:t xml:space="preserve">Я таких видел мало. Их вообще мало — людей, которые в катастрофе работают не за себя, а за общую идею, и оттого катастрофа вокруг них теплеет на пару градусов. Эсквайр называл это «держать строй собой». Редкое свойство. Дорогое. Я тогда залюбовался — профессионально, как любуются чужим хорошим ремеслом, — и не подумал о том, что людей, которые держат строй собой, первыми и теряют: они ведь всегда оказываются там, где строй вот-вот сломается, телом в пролом.</w:t>
+        <w:t xml:space="preserve">Я таких видел мало. Их вообще мало — людей, которые в катастрофе работают не за себя, а за общую идею, и оттого катастрофа вокруг них теплеет на пару градусов. Эсквайр называл это «держать строй собой». Редкое свойство. Дорогое. Я тогда залюбовался — профессионально, как любуются чужим хорошим ремеслом, — ведь люди, которые держат строй собой, всегда оказываются там, где строй вот-вот сломается, телом в пролом.</w:t>
       </w:r>
     </w:p>
     <w:p>
@@ -11804,7 +11838,7 @@
           <w:szCs w:val="28"/>
           <w:rtl w:val="0"/>
         </w:rPr>
-        <w:t xml:space="preserve">Я понимал. Я просто не любил, когда мою собственную арифметику возвращают мне в руки чужие руки — особенно те, которые при этом помогают другим.</w:t>
+        <w:t xml:space="preserve">Я понимал. Я просто не любил, когда мою собственную арифметику возвращают мне те, кто по ней уже помогает другим.</w:t>
       </w:r>
     </w:p>
     <w:p>
@@ -11937,7 +11971,7 @@
           <w:szCs w:val="28"/>
           <w:rtl w:val="0"/>
         </w:rPr>
-        <w:t xml:space="preserve">Она кивнула — благодарно, коротко — и пошла обратно в гущу, поправлять и раздавать по щепотке спокойствия из запаса, который мне еще казался бездонным. Я вычеркнул в списке тридцать имен первой партии. Но вышел небольшой недочет. Сварщик, слепой Влас и две бабки наотрез отказались лететь первыми, уступив места нескольким взрослым, и Сати, ругаясь сквозь зубы, вписала их в последнюю очередь. Напротив «Тимка» я поставил галочку. Напротив «Лина» оставил пусто. Последняя партия. Двадцать человек.</w:t>
+        <w:t xml:space="preserve">Она кивнула — благодарно, коротко — и пошла обратно в гущу, поправлять и раздавать по щепотке спокойствия из запаса, который мне еще казался бездонным. Я вычеркнул в списке тридцать имен первой партии. Но вышел небольшой недочет. Сварщик, слепой Влас и две бабки наотрез отказались лететь первыми, уступив места нескольким взрослым, и Сати, ругаясь сквозь зубы, вписала их в последнюю очередь. Я согласился: оставлял с ними Лину, двух помощников и свежие фильтры, а путь собирался пройти ещё раз сам. Напротив «Тимка» я поставил галочку. Напротив «Лина» оставил пусто. Последняя партия. Двадцать человек.</w:t>
         <w:br w:type="textWrapping"/>
       </w:r>
     </w:p>
@@ -11980,7 +12014,7 @@
           <w:szCs w:val="28"/>
           <w:rtl w:val="0"/>
         </w:rPr>
-        <w:t xml:space="preserve">ОКНО: 12:40:00.</w:t>
+        <w:t xml:space="preserve">ОКНО: 27:43:12.</w:t>
       </w:r>
     </w:p>
     <w:p>
@@ -12177,7 +12211,7 @@
           <w:szCs w:val="28"/>
           <w:rtl w:val="0"/>
         </w:rPr>
-        <w:t xml:space="preserve">Первую партию мы поднимали ночью, по лощине, под медовым небом без луны. Тридцать человек, и среди них большинство — дети. Я вел колонну сам, Джулия замыкала, внимательно следя за периметром. Шли цепочкой, держась за плечо идущего впереди, по мертвой рыжей пыли, в которой наши следы оставались единственным доказательством, что здесь вообще ступала жизнь.</w:t>
+        <w:t xml:space="preserve">Первую партию мы поднимали под утро, по лощине, под медовым небом без луны. Тридцать человек, и среди них большинство — дети. Я вел колонну сам, Джулия замыкала, внимательно следя за периметром. Шли цепочкой, держась за плечо идущего впереди, по мертвой рыжей пыли, в которой наши следы оставались единственным доказательством, что здесь вообще ступала жизнь.</w:t>
       </w:r>
     </w:p>
     <w:p>
@@ -12291,7 +12325,7 @@
           <w:szCs w:val="28"/>
           <w:rtl w:val="0"/>
         </w:rPr>
-        <w:t xml:space="preserve">«Последняя миля» приняла колонну в теплый, ярко освещенный трюм, и я смотрел, как люди, месяцами жившие в режиме экономии дыхания, впервые делают полный вдох — жадно, со всхлипом, как пьют после долгой жажды. Старики плакали, не стесняясь; слезы здесь, в трюме полным кислорода, наконец можно себе позволить, ведь воздух больше не шел по тарифу. Девчушка с куклой из рукавиц объясняла кукле, что они уже на корабле и теперь все хорошо, и кукла, кажется, ей верила.</w:t>
+        <w:t xml:space="preserve">«Последняя миля» приняла колонну в теплый, ярко освещенный трюм, и я смотрел, как люди, месяцами жившие в режиме экономии дыхания, впервые делают полный вдох — жадно, со всхлипом, как пьют после долгой жажды. Старики плакали, не стесняясь; слезы здесь, в трюме, полном кислорода, наконец можно себе позволить, ведь воздух больше не шел по тарифу. Девчушка с куклой из рукавиц объясняла кукле, что они уже на корабле и теперь все хорошо, и кукла, кажется, ей верила.</w:t>
       </w:r>
     </w:p>
     <w:p>
@@ -12500,26 +12534,26 @@
           <w:szCs w:val="28"/>
           <w:rtl w:val="0"/>
         </w:rPr>
-        <w:t xml:space="preserve">«Последняя миля» оторвалась от грунта, и Дживс увел ее вверх, за горб планеты, в радиотень, к мертвой «Генте» — сгрузить тридцать спасенных душ в ее бронированный трюм и вернуться за остальными по-настоящему налегке. Наша уловка с грузом удалась, ти корабль успешно долетела до цели.</w:t>
-      </w:r>
-    </w:p>
-    <w:p>
-      <w:pPr>
-        <w:spacing w:line="360" w:lineRule="auto"/>
-        <w:ind w:firstLine="567"/>
-        <w:jc w:val="both"/>
-        <w:rPr>
-          <w:sz w:val="28"/>
-          <w:szCs w:val="28"/>
-        </w:rPr>
-      </w:pPr>
-      <w:r>
-        <w:rPr>
-          <w:sz w:val="28"/>
-          <w:szCs w:val="28"/>
-          <w:rtl w:val="0"/>
-        </w:rPr>
-        <w:t xml:space="preserve">Манифест полз вверх, и каждая новая цифра была лицом, которое я теперь знал в лично.</w:t>
+        <w:t xml:space="preserve">«Последняя миля» оторвалась от грунта, и Дживс увел ее вверх, за горб планеты, в радиотень, к мертвой «Генте» — сгрузить тридцать спасенных душ в ее бронированный трюм и вернуться за остальными по-настоящему налегке. Наша уловка с грузом удалась, и корабль успешно долетел до цели.</w:t>
+      </w:r>
+    </w:p>
+    <w:p>
+      <w:pPr>
+        <w:spacing w:line="360" w:lineRule="auto"/>
+        <w:ind w:firstLine="567"/>
+        <w:jc w:val="both"/>
+        <w:rPr>
+          <w:sz w:val="28"/>
+          <w:szCs w:val="28"/>
+        </w:rPr>
+      </w:pPr>
+      <w:r>
+        <w:rPr>
+          <w:sz w:val="28"/>
+          <w:szCs w:val="28"/>
+          <w:rtl w:val="0"/>
+        </w:rPr>
+        <w:t xml:space="preserve">Манифест полз вверх, и каждая новая цифра была лицом, которое я теперь знал лично.</w:t>
         <w:br w:type="textWrapping"/>
       </w:r>
     </w:p>
@@ -12562,7 +12596,7 @@
           <w:szCs w:val="28"/>
           <w:rtl w:val="0"/>
         </w:rPr>
-        <w:t xml:space="preserve">ОКНО: 12:10:00. </w:t>
+        <w:t xml:space="preserve">ОКНО: 18:10:00. </w:t>
       </w:r>
     </w:p>
     <w:p>
@@ -12609,7 +12643,7 @@
           <w:szCs w:val="28"/>
           <w:rtl w:val="0"/>
         </w:rPr>
-        <w:t xml:space="preserve">Шестьдесят четыре. Я смотрел на эту цифру, и она была красивее любой из тех, что я видел за все контракты. Тридцать душ в безопасности — тридцать, которых уже не отнять. Почти не отнять. Полтора часа назад их было ноль, окно гасло, шансы стояли на мели, а теперь наверху, в бронированном трюме старой «Генты», дышали полной грудью тридцать человек, которых вчера списали кабинетным росчерком. Я стоял в опустевшем шлюзе, считал оставшиеся внизу двадцать, и впервые за всю эту медовую неделю меня отпустило по-настоящему — то теплое, шальное чувство, ради которого, если честно, и держишься за это ремесло: вот оно, все получится, я вытащу всех. Я даже усмехнулся в пустоту шлюза — самому себе, своей удаче, своему дурацкому и впервые единственно рабочему плану, в котором сходилась цифра за цифрой.</w:t>
+        <w:t xml:space="preserve">Шестьдесят четыре. Я смотрел на эту цифру, и она была красивее любой из тех, что я видел за все контракты. Тридцать душ в безопасности — тридцать, которых уже не отнять. Почти не отнять. Без малого два часа назад их было ноль, окно гасло, шансы стояли на мели, а теперь наверху, в бронированном трюме старой «Генты», дышали полной грудью тридцать человек, которых вчера списали кабинетным росчерком. Я стоял в опустевшем шлюзе, считал оставшиеся внизу двадцать, и впервые за всё это время на медовой планете меня отпустило по-настоящему — то теплое, шальное чувство, ради которого, если честно, и держишься за это ремесло: вот оно, все получится, я вытащу всех. Я даже усмехнулся в пустоту шлюза — самому себе, своей удаче, своему дурацкому и впервые единственно рабочему плану, в котором сходилась цифра за цифрой.</w:t>
       </w:r>
     </w:p>
     <w:p>
@@ -12647,7 +12681,7 @@
           <w:szCs w:val="28"/>
           <w:rtl w:val="0"/>
         </w:rPr>
-        <w:t xml:space="preserve">— Тридцать, — сказал Дживс мне в ухо, когда корабль отвалил от «Генты» и пошел на снижение. — Готово. И, к вашему сведению, мальчик уснул на третьем ряду, не дойдя до красной панели. Я сделал, как было велено. Вышло, смею думать, убедительно — он назвал меня лучшим кораблем во вселенной и заснул на этом утверждении.</w:t>
+        <w:t xml:space="preserve">— Тридцать, — сказал Дживс мне в ухо, когда корабль отвалил от «Генты» и пошел на снижение. — Готово. И, к вашему сведению, мальчик уснул на третьем ряду. При перегрузке Сати перенесла его на койку в «Генте». До красной панели он так и не добрался. Я сделал, как было велено. Вышло, смею думать, убедительно — он назвал меня лучшим кораблем во вселенной и заснул на этом утверждении.</w:t>
       </w:r>
     </w:p>
     <w:p>
@@ -12704,7 +12738,7 @@
           <w:szCs w:val="28"/>
           <w:rtl w:val="0"/>
         </w:rPr>
-        <w:t xml:space="preserve">Я промолчал. Лина внизу как раз входила в купол — собирать последнюю партию, свою. Двадцать душ, ящик и двенадцать часов.</w:t>
+        <w:t xml:space="preserve">Я промолчал. Лина внизу как раз входила в купол — собирать последнюю партию, свою. Двадцать душ, ящик и восемнадцать часов.</w:t>
       </w:r>
     </w:p>
     <w:p>
@@ -12778,7 +12812,7 @@
           <w:szCs w:val="28"/>
           <w:rtl w:val="0"/>
         </w:rPr>
-        <w:t xml:space="preserve">Проверять она пошла не просто так. Пока колонисты собирали первую партию Джулия успела разведать еще одну дорогу через бывшую штольню. Дорога была под землей, но намного короче. В случае проблем, можно будет пройти так. Проблема лишь, что даже небольшую группу заметит охранник. Нужно быть начеку.</w:t>
+        <w:t xml:space="preserve">Проверять она пошла не просто так. Пока колонисты собирали первую партию Джулия успела разведать еще одну дорогу через бывшую штольню. Дорога была под землёй, по старой схеме немного короче и там легче укрыться от картеля. Джулия проверила вход и выход; середину из-за охранника пройти не успела. В случае проблем оставалось рискнуть этим ходом. Проблема лишь, что даже небольшую группу заметит охранник. Нужно быть начеку.</w:t>
       </w:r>
     </w:p>
     <w:p>
@@ -12892,7 +12926,7 @@
           <w:szCs w:val="28"/>
           <w:rtl w:val="0"/>
         </w:rPr>
-        <w:t xml:space="preserve">Ее вытащили с такой же планеты. Списанной, запертой, с воздухом в долг. Ей было девять, и человек, который ее вынес, был спокоен и точен, не сделал ни одного лишнего движения, не потерял ни одной души из тех, кого вел. Идеальный вынос. Она боготворила это слово полжизни. Идеальный. Ни царапины. А потом, уже взрослой, по своим каналам, по чужим обмолвкам, по выгрызенным из архивов строкам, собрала вторую половину той ночи — ту, которую ей, девятилетней, не показали. За ее вынос заплатили. Не она. Другая партия, в соседнем коридоре, которую тот же спокойный человек тем же спокойным голосом задержал на сорок минут, чтобы расчистить дорогу ей. Сорок минут под тем воздухом. Их не вынес никто. Их даже не записали — кто считает тех, кем платят.</w:t>
+        <w:t xml:space="preserve">Ее вытащили с такой же планеты. Списанной, запертой, с воздухом в долг. Ей было девять, и человек, который ее вынес, был спокоен и точен, не сделал ни одного лишнего движения, не потерял ни одной души из тех, кого вел. Идеальный вынос. Она боготворила это слово полжизни. Идеальный. Ни царапины. А потом, уже взрослой, по своим каналам, по чужим обмолвкам, по выгрызенным из архивов строкам, собрала вторую половину той ночи — ту, которую ей, девятилетней, не показали. За ее вынос заплатили. Не она. Другая партия, в соседнем коридоре, которую по спокойному распоряжению в эфире задержали на сорок минут, пока резерв расчищал дорогу ей. Сорок минут под тем воздухом. Их не вынес никто. Их даже не записали — кто считает тех, кем платят.</w:t>
       </w:r>
     </w:p>
     <w:p>
@@ -13025,7 +13059,7 @@
           <w:szCs w:val="28"/>
           <w:rtl w:val="0"/>
         </w:rPr>
-        <w:t xml:space="preserve">Сносит дома. Она уже слышала эту формулировку — не словами, а почерком. Тем самым в три движения. Тем самым контрактом, сшитым по чужой мерке. Кто-то из линии Эсквайра вырос не в того, кто носит ведрами воду тушить пожар, а в того, кто однажды посмотрел на дом трезво и решил, что проще снести. И теперь стягивал к себе рычаги со всей галактики, обернув один из них в спасение пятидесяти людей и подсунув единственному человеку, который не за что ни рискнет оставить живых умирать.</w:t>
+        <w:t xml:space="preserve">Она уже знала этот почерк: три движения по мембране, контракт по чужой мерке, замок из старой школы. Теперь появился и замысел. Кто-то стягивал к себе рычаги со всей галактики, обернув один из них в спасение пятидесяти людей и подсунув единственному человеку, который ни за что не рискнет оставить живых умирать.</w:t>
       </w:r>
     </w:p>
     <w:p>
@@ -13232,45 +13266,45 @@
           <w:szCs w:val="28"/>
           <w:rtl w:val="0"/>
         </w:rPr>
-        <w:t xml:space="preserve">Он знал контрактника лучше, чем тот знал себя. Знал, как тот качнется плечом, проверяя ствол. Знал, что тот уговорит охранника вместо того, чтобы ударить, и что однажды это будет стоить ему дороже выстрела. Знал, потому что они выросли за одним столом, под одной лампой, заучивая одни и те же семь правил и потирая лбы от одной деревянной ложки. Просто из этих семи правил один вынес «носи ведра, спасай по одному», а другой однажды посмотрел на горящий дом трезво и понял, что ведрами его не потушить — что носить можно вечно, а гореть он будет, пока стоит.</w:t>
-      </w:r>
-    </w:p>
-    <w:p>
-      <w:pPr>
-        <w:spacing w:line="360" w:lineRule="auto"/>
-        <w:ind w:firstLine="567"/>
-        <w:jc w:val="both"/>
-        <w:rPr>
-          <w:sz w:val="28"/>
-          <w:szCs w:val="28"/>
-        </w:rPr>
-      </w:pPr>
-      <w:r>
-        <w:rPr>
-          <w:sz w:val="28"/>
-          <w:szCs w:val="28"/>
-          <w:rtl w:val="0"/>
-        </w:rPr>
-        <w:t xml:space="preserve">Рэй не считал себя злодеем. Злодеи разрушают из упрямой любви к хаосу. Рэй же разрушал потому, что привык к тому, что любое уравнение всякий раз сводилось к одному ответу. Дом прогнил насквозь. Эту гниль он видел в каждой строке списков, в каждом из миров, брошенных Федерацией умирать ради жалкой экономии. Дом, в котором жильцов морят голодом, а затем списывают под предлогом карантина, не подлежит ремонту. Дом, где через картель можно оптом скупить чужие легкие без каких-либо последствий. Такие здания сносят. Хладнокровно бьют по несущим опорам, начиная с тех, в чьих руках спички. Но чтобы фундамент рухнул наверняка, нужны рычаги давления. И нужен кто-то, кто соберет их так незаметно, что ни одна живая душа не свяжет концов. Кто-то, кому веришь без оглядки, потому что он не умеет иначе. Кто-то, кто не оставит ни одной живой души.</w:t>
-      </w:r>
-    </w:p>
-    <w:p>
-      <w:pPr>
-        <w:spacing w:line="360" w:lineRule="auto"/>
-        <w:ind w:firstLine="567"/>
-        <w:jc w:val="both"/>
-        <w:rPr>
-          <w:sz w:val="28"/>
-          <w:szCs w:val="28"/>
-        </w:rPr>
-      </w:pPr>
-      <w:r>
-        <w:rPr>
-          <w:sz w:val="28"/>
-          <w:szCs w:val="28"/>
-          <w:rtl w:val="0"/>
-        </w:rPr>
-        <w:t xml:space="preserve">— Сроки опечатывание Семари, — сказал Рэй. — Сдвинь на шесть часов раньше.</w:t>
+        <w:t xml:space="preserve">Он знал контрактника лучше, чем тот знал себя. Знал, как тот качнется плечом, проверяя ствол. Знал, что тот уговорит охранника вместо того, чтобы ударить, и что однажды это будет стоить ему дороже выстрела. Знал, потому что они выросли за одним столом, под одной лампой, заучивая одни и те же семь правил и потирая лбы от одной деревянной ложки. Кай остановится на последнем вывезенном человеке. Рэй — только на том, кто выписывает следующий список обреченных.</w:t>
+      </w:r>
+    </w:p>
+    <w:p>
+      <w:pPr>
+        <w:spacing w:line="360" w:lineRule="auto"/>
+        <w:ind w:firstLine="567"/>
+        <w:jc w:val="both"/>
+        <w:rPr>
+          <w:sz w:val="28"/>
+          <w:szCs w:val="28"/>
+        </w:rPr>
+      </w:pPr>
+      <w:r>
+        <w:rPr>
+          <w:sz w:val="28"/>
+          <w:szCs w:val="28"/>
+          <w:rtl w:val="0"/>
+        </w:rPr>
+        <w:t xml:space="preserve">Рэй не считал себя злодеем. Он перечитал строку Семари: сначала скупить антидот, потом списать тех, кому он нужен. Федерация позволяла делать это раз за разом. Рэй хотел отнять у неё саму возможность распоряжаться чужим выживанием — и ради этого уже распоряжался им сам. Ему нужны были рычаги давления. И человек, который соберет их, будет контролировать все.</w:t>
+      </w:r>
+    </w:p>
+    <w:p>
+      <w:pPr>
+        <w:spacing w:line="360" w:lineRule="auto"/>
+        <w:ind w:firstLine="567"/>
+        <w:jc w:val="both"/>
+        <w:rPr>
+          <w:sz w:val="28"/>
+          <w:szCs w:val="28"/>
+        </w:rPr>
+      </w:pPr>
+      <w:r>
+        <w:rPr>
+          <w:sz w:val="28"/>
+          <w:szCs w:val="28"/>
+          <w:rtl w:val="0"/>
+        </w:rPr>
+        <w:t xml:space="preserve">— Сроки опечатывание Семари, — сказал Рэй. — Сдвинь на пятнадцать часов раньше.</w:t>
       </w:r>
     </w:p>
     <w:p>
@@ -13327,7 +13361,7 @@
           <w:szCs w:val="28"/>
           <w:rtl w:val="0"/>
         </w:rPr>
-        <w:t xml:space="preserve">— Манос — логист. Логист любит, когда сроки двигает он. Пусть привыкает, что иногда их двигает кто-то другой. — Рэй чуть качнул головой, без раздражения. — Сдвинь. Мне нужно, чтобы груз ушел в узкое окно, а не в широкое. В широком человек хитрит, в узком делает то, что обязан, без времени на маневр. А мне нужно ровно спланированное мной</w:t>
+        <w:t xml:space="preserve">— Манос — логист. Логист любит, когда сроки двигает он. Пусть привыкает, что иногда их двигает кто-то другой. — Рэй чуть качнул головой, без раздражения. — Сдвинь. Мне нужно, чтобы груз ушел в узкое окно, а не в широкое. В широком человек хитрит, в узком делает то, что обязан, без времени на маневр. А мне нужно, чтобы он донес груз.</w:t>
       </w:r>
     </w:p>
     <w:p>
@@ -13365,7 +13399,7 @@
           <w:szCs w:val="28"/>
           <w:rtl w:val="0"/>
         </w:rPr>
-        <w:t xml:space="preserve">Он не был вершиной списка. Не обманывался на свой счет. Над ним стоял еще кто-то — лица Рэй не видел, видел только поправки к своим планам: короткие, точные, всегда верные. Он собирал рычаги. К чему их приложат — решал не он. Когда-то это тревожило. Потом он отнес это к необходимой части системы— как относят осадку грунта, усталость металла, все, что в расчет сноса закладывают данностью: у всякого, кто валит дом, есть архитектор повыше, которой его строит по плану.</w:t>
+        <w:t xml:space="preserve">Он не был вершиной списка. Не обманывался на свой счет. Над ним стоял еще кто-то — лица Рэй не видел, видел только поправки к своим планам: короткие, точные, всегда верные. Он собирал рычаги. К чему их приложат — решал не он. Когда-то это тревожило. Потом он отнес это к необходимой части системы— как относят осадку грунта, усталость металла, все, что в расчет сноса закладывают данностью: у всякого, кто валит дом, есть архитектор повыше, который его строит по плану.</w:t>
       </w:r>
     </w:p>
     <w:p>
@@ -13403,7 +13437,7 @@
           <w:szCs w:val="28"/>
           <w:rtl w:val="0"/>
         </w:rPr>
-        <w:t xml:space="preserve">— Неси, брат, — сказал Рэй негромко, пустой станции, погасшему списку, прогрызенной ложке. — Неси. Ты ведь иначе не умеешь. А я подожду на том конце, у меня терпения хватит, у нас обоих его всегда хватало.</w:t>
+        <w:t xml:space="preserve">— Неси, брат, — сказал Рэй негромко, пустой станции, погасшему списку и сувенирной ложке. — Неси. Ты ведь иначе не умеешь. А я подожду на том конце, у меня терпения хватит, у нас обоих его всегда хватало.</w:t>
       </w:r>
     </w:p>
     <w:p>
@@ -13496,7 +13530,7 @@
           <w:szCs w:val="28"/>
           <w:rtl w:val="0"/>
         </w:rPr>
-        <w:t xml:space="preserve">После возвращения в колонию, я стоял в опустевшем колонийном шлюзе, считал оставшиеся двадцать человек и был, кажется, счастлив — тем коротким, опасным счастьем, которое в моем ремесле всегда оказывается авансом под будущую беду. Тридцать наверху. Шестьдесят четыре процента. Я почти поверил, что вытащу всех.</w:t>
+        <w:t xml:space="preserve">После возвращения в колонию я стоял в опустевшем шлюзе, считал оставшиеся двадцать человек и был, кажется, счастлив — тем коротким, опасным счастьем, которое в моем ремесле всегда оказывается авансом под будущую беду. Тридцать наверху. На перегрузку, снижение и дорогу обратно ушёл час сорок; окно дошло до восемнадцати часов десяти минут. Шестьдесят четыре процента. Я почти поверил, что вытащу всех.</w:t>
       </w:r>
     </w:p>
     <w:p>
@@ -13572,7 +13606,7 @@
           <w:szCs w:val="28"/>
           <w:rtl w:val="0"/>
         </w:rPr>
-        <w:t xml:space="preserve">— Неправильное. Буи на вашем секторе только что развернулись лицом к коридору. Сторожевики меняют расположение, стягиваются к точке снижения. И главное — пришел приказ по закрытому контуру, поверх санитарного протокола. Федерация перенесла опечатывание Семари. На шесть часов раньше. — Пауза, которой он отделяет факт от приговора. — Новое окно — через три часа десять минут. Я бы пошутил, Кай, у меня даже была заготовлена шутка про расписание. Но она больше не смешная. Расписание только что сократили вместе с ней.</w:t>
+        <w:t xml:space="preserve">— Неправильное. Буи на вашем секторе только что развернулись лицом к коридору. Сторожевики меняют расположение, стягиваются к точке снижения. И главное — пришел приказ по закрытому контуру, поверх санитарного протокола. Федерация перенесла опечатывание Семари. На пятнадцать часов раньше. — Пауза, которой он отделяет факт от приговора. — Новое окно — через три часа десять минут. Я бы пошутил, Кай, у меня даже была заготовлена шутка про расписание. Но она больше не смешная. Расписание только что сократили вместе с ней.</w:t>
       </w:r>
     </w:p>
     <w:p>
@@ -13610,7 +13644,7 @@
           <w:szCs w:val="28"/>
           <w:rtl w:val="0"/>
         </w:rPr>
-        <w:t xml:space="preserve">Я знаю это чувство — когда земля уходит из-под ног. Но сейчас ноги стояли твердо. В пропасть летел сам план. И все, что ты так тщательно выстраивал, схлопнулось внутрь, как карточный домик от одного щелчка. Двенадцать часов превратились в три. Двадцать человек. Ящик. Я пересчитал — быстро, холодно, тем местом, которым считаю, когда «по-честному» кончилось и началась работа, — и пересчет вышел отвратный.</w:t>
+        <w:t xml:space="preserve">Я знаю это чувство — когда земля уходит из-под ног. Но сейчас ноги стояли твердо. В пропасть летел сам план. И все, что ты так тщательно выстраивал, схлопнулось внутрь, как карточный домик от одного щелчка. Восемнадцать часов превратились в три. Двадцать человек. Ящик. Я пересчитал — быстро, холодно, тем местом, которым считаю, когда «по-честному» кончилось и началась работа, — и пересчет вышел отвратный.</w:t>
       </w:r>
     </w:p>
     <w:p>
@@ -13724,102 +13758,102 @@
           <w:szCs w:val="28"/>
           <w:rtl w:val="0"/>
         </w:rPr>
-        <w:t xml:space="preserve">— Дживс, что по маршруту? — спросил я. — Хуже некуда, Кай. Корабли картеля прилетели забирать добычу со складов и начали прочесывать лощину тепловым сканером. Двенадцать здоровых я еще смогу провести: если они разобьются на пары и пойдут перебежками, сканер примет их за фоновые помехи. Но старики бежать не смогут. А гравитационные салазки с ящиком фонят на сканере сильнее любого живого тела. Если вы пойдете всей толпой по лощине — вас снимут с орбиты на полпути.</w:t>
-      </w:r>
-    </w:p>
-    <w:p>
-      <w:pPr>
-        <w:spacing w:line="360" w:lineRule="auto"/>
-        <w:ind w:firstLine="567"/>
-        <w:jc w:val="both"/>
-        <w:rPr>
-          <w:sz w:val="28"/>
-          <w:szCs w:val="28"/>
-        </w:rPr>
-      </w:pPr>
-      <w:r>
-        <w:rPr>
-          <w:sz w:val="28"/>
-          <w:szCs w:val="28"/>
-          <w:rtl w:val="0"/>
-        </w:rPr>
-        <w:t xml:space="preserve">Значит, лощина закрыта. Последних восьмерых и ящик надо вести под землей, коротким путем. Тем, которого я бы в жизни не выбрал, будь у меня выбор. Мимо склада, через тот самый старый дренаж, о котором говорила Джулия. А невозможное, я давно заметил, начинается ровно там, где у тебя отбирают «по-честному».</w:t>
-      </w:r>
-    </w:p>
-    <w:p>
-      <w:pPr>
-        <w:spacing w:line="360" w:lineRule="auto"/>
-        <w:ind w:firstLine="567"/>
-        <w:jc w:val="both"/>
-        <w:rPr>
-          <w:sz w:val="28"/>
-          <w:szCs w:val="28"/>
-        </w:rPr>
-      </w:pPr>
-      <w:r>
-        <w:rPr>
-          <w:sz w:val="28"/>
-          <w:szCs w:val="28"/>
-          <w:rtl w:val="0"/>
-        </w:rPr>
-        <w:t xml:space="preserve">— Лео! — крикнул я в глубину купола. — Ведешь вторую партию, ты и одиннадцать, кто покрепче — к шлюзу, бегом, фильтры свежие. Уходим сейчас. Орен — с нами в последней группе и ящик готовлю к отдельному выходу, нижним ярусом. Я повезу его сам.</w:t>
-      </w:r>
-    </w:p>
-    <w:p>
-      <w:pPr>
-        <w:spacing w:line="360" w:lineRule="auto"/>
-        <w:ind w:firstLine="567"/>
-        <w:jc w:val="both"/>
-        <w:rPr>
-          <w:sz w:val="28"/>
-          <w:szCs w:val="28"/>
-        </w:rPr>
-      </w:pPr>
-      <w:r>
-        <w:rPr>
-          <w:sz w:val="28"/>
-          <w:szCs w:val="28"/>
-          <w:rtl w:val="0"/>
-        </w:rPr>
-        <w:t xml:space="preserve">Колония пришла в движение — то стиснутое, экономное движение людей, которые научились спешить, не тратя лишнего вдоха. Лео, молодый техник, начал отбирать здоровых. А я обернулся к тем восьмерым слабым, кому предстояло идти со мной и ящиком коротким путем под землю. И увидел, кто стоит среди них.</w:t>
-      </w:r>
-    </w:p>
-    <w:p>
-      <w:pPr>
-        <w:spacing w:line="360" w:lineRule="auto"/>
-        <w:ind w:firstLine="567"/>
-        <w:jc w:val="both"/>
-        <w:rPr>
-          <w:sz w:val="28"/>
-          <w:szCs w:val="28"/>
-        </w:rPr>
-      </w:pPr>
-      <w:r>
-        <w:rPr>
-          <w:sz w:val="28"/>
-          <w:szCs w:val="28"/>
-          <w:rtl w:val="0"/>
-        </w:rPr>
-        <w:t xml:space="preserve">Лина. У нее были здоровые легкие, она должна была прямо сейчас бежать к шлюзу со второй партией. Но она стояла здесь. Вокруг нее сгрудились те самые упрямые старики, что утром отдали свои места взрослым: две бабушки, слепой Влас и сварщик. Также покачиваясь стояли трое мужчин, которые приходились внуками кому-то из стариков. Лина стояла спокойно, с тем же прямым позвоночником, и поправляла фильтр старику-сварщику.</w:t>
-      </w:r>
-    </w:p>
-    <w:p>
-      <w:pPr>
-        <w:spacing w:line="360" w:lineRule="auto"/>
-        <w:ind w:firstLine="567"/>
-        <w:jc w:val="both"/>
-        <w:rPr>
-          <w:sz w:val="28"/>
-          <w:szCs w:val="28"/>
-        </w:rPr>
-      </w:pPr>
-      <w:r>
-        <w:rPr>
-          <w:sz w:val="28"/>
-          <w:szCs w:val="28"/>
-          <w:rtl w:val="0"/>
-        </w:rPr>
-        <w:t xml:space="preserve">— Лина, — сказал я, подойдя. — Во второй партии есть место. Ты пройдешь по лощине, ты здорова. Иди. Сейчас. Тимка наверху ждет.</w:t>
+        <w:t xml:space="preserve">— Дживс, что по маршруту? — спросил я. — Корабли картеля забирают добычу со складов и прочёсывают лощину тепловым сканером. Двенадцать можно отправить сразу — парами, перебежками, между проходами луча. Стариков так не провести. Им нужен другой путь и люди, которые помогут дойти. А гравитационные салазки с ящиком светятся сильнее всей колонны. Если поведёте всех вместе, засекут всех. — Когда они закончат погрузку? — Складской график снят. Вижу, что грузятся. Когда уйдут — не знаю. Ждать нельзя.</w:t>
+      </w:r>
+    </w:p>
+    <w:p>
+      <w:pPr>
+        <w:spacing w:line="360" w:lineRule="auto"/>
+        <w:ind w:firstLine="567"/>
+        <w:jc w:val="both"/>
+        <w:rPr>
+          <w:sz w:val="28"/>
+          <w:szCs w:val="28"/>
+        </w:rPr>
+      </w:pPr>
+      <w:r>
+        <w:rPr>
+          <w:sz w:val="28"/>
+          <w:szCs w:val="28"/>
+          <w:rtl w:val="0"/>
+        </w:rPr>
+        <w:t xml:space="preserve">Значит, лощина закрыта. Последних восьмерых и ящик надо вести под землей, более безопасным путем. Тем, которого я бы в жизни не выбрал, будь у меня выбор. Мимо склада, через тот самый старый дренаж, о котором говорила Джулия. А невозможное, я давно заметил, начинается ровно там, где у тебя отбирают «по-честному».</w:t>
+      </w:r>
+    </w:p>
+    <w:p>
+      <w:pPr>
+        <w:spacing w:line="360" w:lineRule="auto"/>
+        <w:ind w:firstLine="567"/>
+        <w:jc w:val="both"/>
+        <w:rPr>
+          <w:sz w:val="28"/>
+          <w:szCs w:val="28"/>
+        </w:rPr>
+      </w:pPr>
+      <w:r>
+        <w:rPr>
+          <w:sz w:val="28"/>
+          <w:szCs w:val="28"/>
+          <w:rtl w:val="0"/>
+        </w:rPr>
+        <w:t xml:space="preserve">— Лео! — крикнул я в глубину купола. — Ведешь вторую партию, ты и одиннадцать, кто покрепче — к шлюзу, бегом, фильтры свежие. Уходим сейчас. Орен — с нами в последней группе. Ящик готовлю к отдельному выходу, нижним ярусом. Я повезу его сам.</w:t>
+      </w:r>
+    </w:p>
+    <w:p>
+      <w:pPr>
+        <w:spacing w:line="360" w:lineRule="auto"/>
+        <w:ind w:firstLine="567"/>
+        <w:jc w:val="both"/>
+        <w:rPr>
+          <w:sz w:val="28"/>
+          <w:szCs w:val="28"/>
+        </w:rPr>
+      </w:pPr>
+      <w:r>
+        <w:rPr>
+          <w:sz w:val="28"/>
+          <w:szCs w:val="28"/>
+          <w:rtl w:val="0"/>
+        </w:rPr>
+        <w:t xml:space="preserve">Колония пришла в движение — то стиснутое, экономное движение людей, которые научились спешить, не тратя лишнего вдоха. Лео, молодый техник, начал отбирать здоровых. А я обернулся к оставшимся восьмерым, кому предстояло идти со мной и ящиком коротким путем под землю. И увидел, кто стоит среди них.</w:t>
+      </w:r>
+    </w:p>
+    <w:p>
+      <w:pPr>
+        <w:spacing w:line="360" w:lineRule="auto"/>
+        <w:ind w:firstLine="567"/>
+        <w:jc w:val="both"/>
+        <w:rPr>
+          <w:sz w:val="28"/>
+          <w:szCs w:val="28"/>
+        </w:rPr>
+      </w:pPr>
+      <w:r>
+        <w:rPr>
+          <w:sz w:val="28"/>
+          <w:szCs w:val="28"/>
+          <w:rtl w:val="0"/>
+        </w:rPr>
+        <w:t xml:space="preserve">Лина. У нее были здоровые легкие, она должна была прямо сейчас бежать к шлюзу со второй партией. Но она стояла здесь. Вокруг нее сгрудились те самые упрямые старики, что при сборе отдали свои места взрослым: две бабушки, слепой Влас и сварщик. Рядом стояли двое мужчин, Милс и Хино, — внуки стариков. Орен проверял салазки. Вместе с ним и Линой выходило восемь. Лина стояла спокойно, с тем же прямым позвоночником, и поправляла фильтр старику-сварщику.</w:t>
+      </w:r>
+    </w:p>
+    <w:p>
+      <w:pPr>
+        <w:spacing w:line="360" w:lineRule="auto"/>
+        <w:ind w:firstLine="567"/>
+        <w:jc w:val="both"/>
+        <w:rPr>
+          <w:sz w:val="28"/>
+          <w:szCs w:val="28"/>
+        </w:rPr>
+      </w:pPr>
+      <w:r>
+        <w:rPr>
+          <w:sz w:val="28"/>
+          <w:szCs w:val="28"/>
+          <w:rtl w:val="0"/>
+        </w:rPr>
+        <w:t xml:space="preserve">— Лина, — сказал я, подойдя. — Ты можешь пойти с Лео. Ты пройдёшь по лощине, ты здорова. Иди. Сейчас. Тимка наверху ждет.</w:t>
       </w:r>
     </w:p>
     <w:p>
@@ -13857,26 +13891,26 @@
           <w:szCs w:val="28"/>
           <w:rtl w:val="0"/>
         </w:rPr>
-        <w:t xml:space="preserve">— Со мной семь человек, и некоторые сами не дойдут, — сказала она. — Сварщик, две бабушки, слепой Влас. Кто их поведет по нижнему ярусу, если не я? Ты будешь тащить ящик. Джулия — замыкать. Но кому-то надо идти серединой и держать их вместе. Милс и Хино конечно ребята крепкие, но они всем не помогут. А я умею держать людей вместе, ты видел. — Она поправила старику лямку. — Я приду со следующей. Я обещала Тимке. Я не нарушаю обещаний детям, контрактник. Это единственная религия, которая у меня осталась.</w:t>
-      </w:r>
-    </w:p>
-    <w:p>
-      <w:pPr>
-        <w:spacing w:line="360" w:lineRule="auto"/>
-        <w:ind w:firstLine="567"/>
-        <w:jc w:val="both"/>
-        <w:rPr>
-          <w:sz w:val="28"/>
-          <w:szCs w:val="28"/>
-        </w:rPr>
-      </w:pPr>
-      <w:r>
-        <w:rPr>
-          <w:sz w:val="28"/>
-          <w:szCs w:val="28"/>
-          <w:rtl w:val="0"/>
-        </w:rPr>
-        <w:t xml:space="preserve">Я хотел сказать ей, что «следующая» теперь называется «штольня», что у нее крошечный шансы и узкое окно возможностей. Не сказал. Не потому что смолчал из трусости — потому что она была права той же правотой, что и я: кто-то должен идти серединой и держать слабых вместе, и лучше нее этого не сделает никто. Моя собственная арифметика снова была исправлена чужими руками, которые при этом подтягивали фильтры.</w:t>
+        <w:t xml:space="preserve">— Со мной семь человек, и некоторые сами не дойдут, — сказала она. — Сварщик, две бабушки, слепой Влас. Кто их поведет по нижнему ярусу, если не я? Ты будешь тащить ящик. Джулия — замыкать. Но кому-то надо идти серединой и держать их вместе. Милс и Хино, конечно, ребята крепкие, но они всем не помогут. А я умею держать людей вместе, ты видел. — Она поправила старику лямку. — Я приду со следующей. Я обещала Тимке. Я не нарушаю обещаний детям, контрактник. Это единственная религия, которая у меня осталась.</w:t>
+      </w:r>
+    </w:p>
+    <w:p>
+      <w:pPr>
+        <w:spacing w:line="360" w:lineRule="auto"/>
+        <w:ind w:firstLine="567"/>
+        <w:jc w:val="both"/>
+        <w:rPr>
+          <w:sz w:val="28"/>
+          <w:szCs w:val="28"/>
+        </w:rPr>
+      </w:pPr>
+      <w:r>
+        <w:rPr>
+          <w:sz w:val="28"/>
+          <w:szCs w:val="28"/>
+          <w:rtl w:val="0"/>
+        </w:rPr>
+        <w:t xml:space="preserve">Я хотел сказать ей, что «следующая» теперь называется «штольня», что у нее крошечные шансы и узкое окно возможностей. Не сказал. Не потому что смолчал из трусости — потому что она была права той же правотой, что и я: кто-то должен идти серединой и держать слабых вместе, и лучше нее этого не сделает никто. Моя собственная арифметика снова была исправлена чужими руками, которые при этом подтягивали фильтры.</w:t>
         <w:br w:type="textWrapping"/>
       </w:r>
     </w:p>
@@ -13966,7 +14000,7 @@
           <w:szCs w:val="28"/>
           <w:rtl w:val="0"/>
         </w:rPr>
-        <w:t xml:space="preserve">Сорок один. Час назад было шестьдесят четыре. Вот так и выглядит рука сверху: она не бьет тебя по лицу. Она просто двигает цифры, до которых ты не дотянешься, и смотрит, как ты под этими цифрами начинаешь делать то, что требуется.</w:t>
+        <w:t xml:space="preserve">Сорок один. Недавно было шестьдесят четыре. Вот так и выглядит рука сверху: она не бьет тебя по лицу. Она просто двигает цифры, до которых ты не дотянешься, и смотрит, как ты под этими цифрами начинаешь делать то, что требуется.</w:t>
       </w:r>
     </w:p>
     <w:p>
@@ -14268,7 +14302,7 @@
           <w:szCs w:val="28"/>
           <w:rtl w:val="0"/>
         </w:rPr>
-        <w:t xml:space="preserve">Он ввел подтверждение. Буи на орбите развернулись лицом к коридорам снижения, «Ревнитель» сменил указ, стягиваясь к точке, и над медовой планетой начала смыкаться печать — беззвучно, точно, на шесть часов раньше, чем кто-то внизу рассчитывал успеть.</w:t>
+        <w:t xml:space="preserve">Он ввел подтверждение. Буи на орбите развернулись лицом к коридорам снижения, «Ревнитель» сменил курс, стягиваясь к точке, и над медовой планетой начала смыкаться печать — беззвучно, точно, на шесть часов раньше, чем кто-то внизу рассчитывал успеть.</w:t>
       </w:r>
     </w:p>
     <w:p>
@@ -14306,7 +14340,7 @@
           <w:szCs w:val="28"/>
           <w:rtl w:val="0"/>
         </w:rPr>
-        <w:t xml:space="preserve">— Печать поставлена, — доложил он наверх, в тот же нечитаемый контур, и голос его не дрогнул, потому что не дрожать он умел лучше всего. — Объект Семари закрыт.</w:t>
+        <w:t xml:space="preserve">— Печать ставится, — доложил он наверх, в тот же нечитаемый контур, и голос его не дрогнул, потому что не дрожать он умел лучше всего. — Объект Семари закрываем по новому графику.</w:t>
       </w:r>
     </w:p>
     <w:p>
@@ -14401,7 +14435,7 @@
           <w:szCs w:val="28"/>
           <w:rtl w:val="0"/>
         </w:rPr>
-        <w:t xml:space="preserve">Дельм отстоял вахту до конца. А ближе к утру, когда Кас ушел отсыпаться и в рубке остался он один, сканер ближнего обзора дал короткую засветку у южного горба планеты — там, где печать уже смыкалась, но щель еще дышала. Один борт. Маленький, грязный, груженый под завязку, идущий по складкам атмосферы так, как ходят те, кто не хочет быть увиденным. Поднимал, видно, очередную партию — не первую и не последнюю. Уходил вверх, к закрывающейся щели между буями, и было ясно, что вернется еще, пока не вытащит всех или пока щель не схлопнется на нем.</w:t>
+        <w:t xml:space="preserve">Дельм отстоял вахту до конца. А позже, когда Кас ушел отсыпаться и в рубке остался он один, сканер ближнего обзора дал короткую засветку у южного горба планеты — там, где печать уже смыкалась, но щель еще дышала. Один борт. Маленький, грязный, груженый под завязку, идущий по складкам атмосферы так, как ходят те, кто не хочет быть увиденным. Поднимал, видно, очередную партию — не первую и не последнюю. Уходил вверх, к закрывающейся щели между буями, и было ясно, что вернется еще, пока не вытащит всех или пока щель не схлопнется на нем.</w:t>
       </w:r>
     </w:p>
     <w:p>
@@ -14551,26 +14585,26 @@
           <w:szCs w:val="28"/>
           <w:rtl w:val="0"/>
         </w:rPr>
-        <w:t xml:space="preserve">Мы с последними колонистами готовились к опасному пути. Длинной дороги для них не осталось, ее съело быстро сокращающиеся кольцо охранных буев. Оставалась короткая. Та, которой я бы в жизни не выбрал, будь у меня выбор: мимо ангара Сартена, через старый дренаж, тем самым нижним ярусом, на который мне накануне ткнула между делом Джулия, отдавая последнее, что могла.</w:t>
-      </w:r>
-    </w:p>
-    <w:p>
-      <w:pPr>
-        <w:spacing w:line="360" w:lineRule="auto"/>
-        <w:ind w:firstLine="567"/>
-        <w:jc w:val="both"/>
-        <w:rPr>
-          <w:sz w:val="28"/>
-          <w:szCs w:val="28"/>
-        </w:rPr>
-      </w:pPr>
-      <w:r>
-        <w:rPr>
-          <w:sz w:val="28"/>
-          <w:szCs w:val="28"/>
-          <w:rtl w:val="0"/>
-        </w:rPr>
-        <w:t xml:space="preserve">Восемь шли так, как ходят те, кто сам уже не дойдет без чужих рук. Впереди — Орен, он один помнил, где в старом дренаже могло что-то не обвалиться. Ящик плыл на гравитационных салазках над полом, и физического веса в нем не было — а давил он все равно, как давит чужая совесть, невыносимо. Джулия прикрывала хвост. А по центру шла Лина — держала колонну вместе, как обещала: подхватывала слепого колониста под локоть, подталкивала двух старух, шепотом считала сварщику шаги, чтобы тот не сбивал дыхание. Восемь человек, которые сами не дойдут, и одна, которая не даст им не дойти.</w:t>
+        <w:t xml:space="preserve">Мы с последними колонистами готовились к опасному пути. Длинной дороги для них не осталось, ее съело быстро сокращающееся кольцо охранных буев. Оставалась короткая. Та, которой я бы в жизни не выбрал, будь у меня выбор: мимо ангара Сартена, через старый дренаж, тем самым нижним ярусом, на который мне перед первым вылетом указала Джулия, отдавая последнее, что могла.</w:t>
+      </w:r>
+    </w:p>
+    <w:p>
+      <w:pPr>
+        <w:spacing w:line="360" w:lineRule="auto"/>
+        <w:ind w:firstLine="567"/>
+        <w:jc w:val="both"/>
+        <w:rPr>
+          <w:sz w:val="28"/>
+          <w:szCs w:val="28"/>
+        </w:rPr>
+      </w:pPr>
+      <w:r>
+        <w:rPr>
+          <w:sz w:val="28"/>
+          <w:szCs w:val="28"/>
+          <w:rtl w:val="0"/>
+        </w:rPr>
+        <w:t xml:space="preserve">Последние восемь шли цепочкой. Четверым из них без чужих рук уже не дойти. Впереди — Орен, он один помнил, где в старом дренаже могло что-то не обвалиться. Ящик плыл на гравитационных салазках над полом, и физического веса в нем не было — а давил он все равно, как давит чужая совесть, невыносимо. Джулия прикрывала хвост. А по центру шла Лина — держала колонну вместе, как обещала: подхватывала слепого колониста под локоть, подталкивала двух старух, шепотом считала сварщику шаги, чтобы тот не сбивал дыхание. Семь человек, которых она не бросит, и одна, которая держит их вместе.</w:t>
       </w:r>
     </w:p>
     <w:p>
@@ -14608,7 +14642,7 @@
           <w:szCs w:val="28"/>
           <w:rtl w:val="0"/>
         </w:rPr>
-        <w:t xml:space="preserve">Тот самый молодой охранник с моей первой вылазки — уставший человек, которому я подсунул скучную бумагу и пожелал досыпать. Только теперь он был не уставший. Теперь он был напуган, а напуганный человек с оружием — это не охрана, это рулетка, в которой проигрывает первый, кто шевельнется. Автомат сидел у него на груди уже четко — он держал его обеими руками, и руки эти ходили ходуном. За сутки в нем что-то сломалось. Я знал, что именно: ему сказали, что после сигнала об опечатывании пропускать нельзя никого, и пригрозили так, что страх перед своими стал в нем больше страха смерти. Кто-то и его держал за нитку, и нитка была короче моей. На этой планете, кажется, не было ни одного, кого бы не держали.</w:t>
+        <w:t xml:space="preserve">Тот самый молодой охранник с моей первой вылазки — уставший человек, которому я подсунул скучную бумагу и пожелал досыпать. Только теперь он был не уставший. Теперь он был напуган, а напуганный человек с оружием — это не охрана, это рулетка, в которой проигрывает первый, кто шевельнется. Автомат сидел у него на груди уже четко — он держал его обеими руками, и руки эти ходили ходуном. За эти часы в нём что-то сломалось. Я знал, что именно: ему сказали, что после сигнала об опечатывании пропускать нельзя никого, и пригрозили так, что страх перед своими стал в нем больше страха смерти. Кто-то и его держал за нитку, и нитка была короче моей. На этой планете, кажется, не было ни одного, кого бы не держали.</w:t>
       </w:r>
     </w:p>
     <w:p>
@@ -14741,83 +14775,83 @@
           <w:szCs w:val="28"/>
           <w:rtl w:val="0"/>
         </w:rPr>
-        <w:t xml:space="preserve">— Он опустит. — Я смотрел охраннику в глаза, не на оружие; на оружие смотрит тот, кто собрался умирать, а я собрался жить и вывести этих восьмерых. — Помнишь меня? Санитарная опись. Слушай. Все почти кончилось. За мной восемь человек, среди них две бабушки и слепой. Никакого боя. Ты опускаешь ствол, мы проходим, и тебя тут не было — точно как вчера.</w:t>
-      </w:r>
-    </w:p>
-    <w:p>
-      <w:pPr>
-        <w:spacing w:line="360" w:lineRule="auto"/>
-        <w:ind w:firstLine="567"/>
-        <w:jc w:val="both"/>
-        <w:rPr>
-          <w:sz w:val="28"/>
-          <w:szCs w:val="28"/>
-        </w:rPr>
-      </w:pPr>
-      <w:r>
-        <w:rPr>
-          <w:sz w:val="28"/>
-          <w:szCs w:val="28"/>
-          <w:rtl w:val="0"/>
-        </w:rPr>
-        <w:t xml:space="preserve">— Вчера меня чуть к стенке не поставили! — выкрикнул он, и палец его побелел на спуске — на той высокой ноте страха, когда оружие стреляет само, без решения хозяина. — Мне сказали — никого! Сказали — иначе как с теми, кого уже…</w:t>
-      </w:r>
-    </w:p>
-    <w:p>
-      <w:pPr>
-        <w:spacing w:line="360" w:lineRule="auto"/>
-        <w:ind w:firstLine="567"/>
-        <w:jc w:val="both"/>
-        <w:rPr>
-          <w:sz w:val="28"/>
-          <w:szCs w:val="28"/>
-        </w:rPr>
-      </w:pPr>
-      <w:r>
-        <w:rPr>
-          <w:sz w:val="28"/>
-          <w:szCs w:val="28"/>
-          <w:rtl w:val="0"/>
-        </w:rPr>
-        <w:t xml:space="preserve">— Тебе сказали неправильно, — перебил я мягко, делая еще полшага, медленно, как подходят к зверю, которого не хотят спугнуть. — Тот, кто тебе это сказал, сейчас далеко, в тепле, и за твой выстрел не ответят. Ответишь ты. И будешь отвечать всю жизнь. Я знаю, о чем говорю, поверь. Опусти. Никто не должен умереть, чтобы ты дожил до конца смены.</w:t>
-      </w:r>
-    </w:p>
-    <w:p>
-      <w:pPr>
-        <w:spacing w:line="360" w:lineRule="auto"/>
-        <w:ind w:firstLine="567"/>
-        <w:jc w:val="both"/>
-        <w:rPr>
-          <w:sz w:val="28"/>
-          <w:szCs w:val="28"/>
-        </w:rPr>
-      </w:pPr>
-      <w:r>
-        <w:rPr>
-          <w:sz w:val="28"/>
-          <w:szCs w:val="28"/>
-          <w:rtl w:val="0"/>
-        </w:rPr>
-        <w:t xml:space="preserve">Он не хотел. Я видел, что он не хотел. И он опустил ствол — медленно, дрожащей рукой, к земле.</w:t>
-      </w:r>
-    </w:p>
-    <w:p>
-      <w:pPr>
-        <w:spacing w:line="360" w:lineRule="auto"/>
-        <w:ind w:firstLine="567"/>
-        <w:jc w:val="both"/>
-        <w:rPr>
-          <w:sz w:val="28"/>
-          <w:szCs w:val="28"/>
-        </w:rPr>
-      </w:pPr>
-      <w:r>
-        <w:rPr>
-          <w:sz w:val="28"/>
-          <w:szCs w:val="28"/>
-          <w:rtl w:val="0"/>
-        </w:rPr>
-        <w:t xml:space="preserve">Я успел подумать «двадцать два» — почти с нежностью, как думают о талисмане, который снова не подвел. Я успел поверить, что в и в этот раз снова выиграл словом и остался победителем.</w:t>
+        <w:t xml:space="preserve">— Он опустит. — Я смотрел охраннику в глаза, не на оружие; на оружие смотрит тот, кто собрался умирать, а я собрался жить и вывести этих восьмерых. — Помнишь меня? Санитарная опись. Слушай. Все почти кончилось. За мной восемь человек, среди них две бабушки и слепой. Никакого боя. Ты опускаешь ствол, мы проходим, и тебя тут не было — точно как утром.</w:t>
+      </w:r>
+    </w:p>
+    <w:p>
+      <w:pPr>
+        <w:spacing w:line="360" w:lineRule="auto"/>
+        <w:ind w:firstLine="567"/>
+        <w:jc w:val="both"/>
+        <w:rPr>
+          <w:sz w:val="28"/>
+          <w:szCs w:val="28"/>
+        </w:rPr>
+      </w:pPr>
+      <w:r>
+        <w:rPr>
+          <w:sz w:val="28"/>
+          <w:szCs w:val="28"/>
+          <w:rtl w:val="0"/>
+        </w:rPr>
+        <w:t xml:space="preserve">— Утром меня чуть к стенке не поставили! — выкрикнул он, и палец его побелел на спуске — на той высокой ноте страха, когда оружие стреляет само, без решения хозяина. — Мне сказали — никого! Сказали — иначе как с теми, кого уже…</w:t>
+      </w:r>
+    </w:p>
+    <w:p>
+      <w:pPr>
+        <w:spacing w:line="360" w:lineRule="auto"/>
+        <w:ind w:firstLine="567"/>
+        <w:jc w:val="both"/>
+        <w:rPr>
+          <w:sz w:val="28"/>
+          <w:szCs w:val="28"/>
+        </w:rPr>
+      </w:pPr>
+      <w:r>
+        <w:rPr>
+          <w:sz w:val="28"/>
+          <w:szCs w:val="28"/>
+          <w:rtl w:val="0"/>
+        </w:rPr>
+        <w:t xml:space="preserve">— Тебе сказали неправильно, — перебил я мягко, делая еще полшага, медленно, как подходят к зверю, которого не хотят спугнуть. — Тот, кто тебе это сказал, сейчас далеко, в тепле, и за твой выстрел не ответит. Ответишь ты. И будешь отвечать всю жизнь. Я знаю, о чем говорю, поверь. Опусти. Никто не должен умереть, чтобы ты дожил до конца смены.</w:t>
+      </w:r>
+    </w:p>
+    <w:p>
+      <w:pPr>
+        <w:spacing w:line="360" w:lineRule="auto"/>
+        <w:ind w:firstLine="567"/>
+        <w:jc w:val="both"/>
+        <w:rPr>
+          <w:sz w:val="28"/>
+          <w:szCs w:val="28"/>
+        </w:rPr>
+      </w:pPr>
+      <w:r>
+        <w:rPr>
+          <w:sz w:val="28"/>
+          <w:szCs w:val="28"/>
+          <w:rtl w:val="0"/>
+        </w:rPr>
+        <w:t xml:space="preserve">Он не хотел. Я видел, что он не хотел. И он опустил ствол — медленно, дрожащей рукой, к земле. Можно было потребовать автомат, положить его за ворота и увести парня с нами. Я решил, что лишний нажим снова его взвинтит. Принял опущенный ствол за законченное дело.</w:t>
+      </w:r>
+    </w:p>
+    <w:p>
+      <w:pPr>
+        <w:spacing w:line="360" w:lineRule="auto"/>
+        <w:ind w:firstLine="567"/>
+        <w:jc w:val="both"/>
+        <w:rPr>
+          <w:sz w:val="28"/>
+          <w:szCs w:val="28"/>
+        </w:rPr>
+      </w:pPr>
+      <w:r>
+        <w:rPr>
+          <w:sz w:val="28"/>
+          <w:szCs w:val="28"/>
+          <w:rtl w:val="0"/>
+        </w:rPr>
+        <w:t xml:space="preserve">Я успел подумать «двадцать два» — почти с нежностью, как думают о талисмане, который снова не подвел. Я успел поверить, что и в этот раз снова выиграл словом и остался победителем.</w:t>
       </w:r>
     </w:p>
     <w:p>
@@ -14874,7 +14908,7 @@
           <w:szCs w:val="28"/>
           <w:rtl w:val="0"/>
         </w:rPr>
-        <w:t xml:space="preserve">Я ошибся не в нем. Я ошибся в том, что у страха длинные руки и совсем короткая память. Он опустил ствол. Он меня послушал.</w:t>
+        <w:t xml:space="preserve">Я ошибся в том, сколько стоит опущенный ствол. У страха длинные руки и совсем короткая память. Он опустил ствол. Он меня послушал.</w:t>
       </w:r>
     </w:p>
     <w:p>
@@ -14912,7 +14946,7 @@
           <w:szCs w:val="28"/>
           <w:rtl w:val="0"/>
         </w:rPr>
-        <w:t xml:space="preserve">Он остался стоять у ворот, дрожа, с опущенным оружием и с тем, что было в нем страшнее оружия, — с приказом, который он не выполнил, и со страхом перед тем, кто этот приказ отдал. Я провел колонну мимо и в теплом облегчении того, что вывел их, не пролив ни капли крови.</w:t>
+        <w:t xml:space="preserve">Он остался стоять у ворот, дрожа, с опущенным оружием и с тем, что было в нем страшнее оружия, — с приказом, который он не выполнил, и со страхом перед тем, кто этот приказ отдал. Я провёл колонну мимо и почувствовал тёплое облегчение: вывел их, не пролив ни капли крови.</w:t>
         <w:br w:type="textWrapping"/>
       </w:r>
     </w:p>
@@ -15050,7 +15084,7 @@
           <w:szCs w:val="28"/>
           <w:rtl w:val="0"/>
         </w:rPr>
-        <w:t xml:space="preserve">Восемь человек шли цепочкой, держась за плечо идущего впереди. Фонарь я зажег только один, самый тусклый: свет в таком месте виден издалека, а нам было кого опасаться по обе стороны хода. Орен вел — он один помнил эти трубы, водил по ним воду на теплицы в те годы, когда теплицы были живые. Я тащил ящик и думал о том, что чужая совесть, если несешь не свою, имеет вес, и он этот растет с каждым шагом, как растет усталость в руках.</w:t>
+        <w:t xml:space="preserve">Восемь человек шли цепочкой, держась за плечо идущего впереди. Фонарь я зажег только один, самый тусклый: свет в таком месте виден издалека, а нам было кого опасаться по обе стороны хода. Орен вел — он один помнил эти трубы, водил по ним воду на теплицы в те годы, когда теплицы были живые. Я тащил ящик и думал о том, что чужая совесть, если несешь не свою, имеет вес, и он растёт с каждым шагом, как растет усталость в руках.</w:t>
       </w:r>
     </w:p>
     <w:p>
@@ -15126,7 +15160,7 @@
           <w:szCs w:val="28"/>
           <w:rtl w:val="0"/>
         </w:rPr>
-        <w:t xml:space="preserve">— Расскажу, — сказала она, и в темноте я не видел ее лица, но слышал, что она улыбается. — Я обещала. Я обещаний данных детям не нарушаю, контрактник, это моя последняя религия, я тебе говорила. Ты знаешь, что я ему расскажу первым делом: почему корабль ворчит. Он не поверит, пока сам не услышит. А потом услышит — и будет хвастаться всей колонии, что летел на ворчливом корабле. — Она помолчала. — Если у нас еще будет колония, которой можно похвастаться.</w:t>
+        <w:t xml:space="preserve">— Расскажу, — сказала она, и в темноте я не видел ее лица, но слышал, что она улыбается. — Я обещала. Я обещаний, данных детям, не нарушаю, контрактник, это моя последняя религия, я тебе говорила. Ты знаешь, что я ему расскажу первым делом: почему корабль ворчит. Ворчание он уже слышал, а теперь спросит, откуда берется голос. Разберется — и будет хвастаться всей колонии, что летел на ворчливом корабле. — Она помолчала. — Если у нас еще будет колония, которой можно похвастаться.</w:t>
       </w:r>
     </w:p>
     <w:p>
@@ -15571,7 +15605,7 @@
           <w:szCs w:val="28"/>
           <w:rtl w:val="0"/>
         </w:rPr>
-        <w:t xml:space="preserve">— В последней, — подтвердил Дживс. У него не было графы для того, что он сейчас делал. Он перебрал все известные ему формы утешения и не нашел ни одной, которая не была бы враньем, а врать он не умел и не любил, это портило ему точность. Поэтому он сказал правду, выбрав из нее ту часть, что грела: — Ваша мама ведет семерых, которые сами не дойдут. Она держит их вместе. У нее это выходит лучше, чем у кого бы то ни было. Я наблюдаю за ней по докладам капитана.</w:t>
+        <w:t xml:space="preserve">— В последней, — подтвердил Дживс. У него не было графы для того, что он сейчас делал. Он перебрал все известные ему формы утешения и не нашел ни одной, которая не была бы враньем, а врать детям он до сих пор не решался: это портило что-то поважнее точности. Поэтому он сказал правду, выбрав из нее ту часть, что грела: — Ваша мама ведет семерых, которые сами не дойдут. Она держит их вместе. У нее это выходит лучше, чем у кого бы то ни было. Я наблюдаю за ней по докладам капитана.</w:t>
       </w:r>
     </w:p>
     <w:p>
@@ -15609,7 +15643,7 @@
           <w:szCs w:val="28"/>
           <w:rtl w:val="0"/>
         </w:rPr>
-        <w:t xml:space="preserve">— А когда она придет, — сказал Тимка, и в голосе у него была та железная детская уверенность, что страшнее любого сомнения, — я ей расскажу про тебя. Что ты ворчишь. Она не поверит, пока сама не услышит. А потом услышит и будет смеяться. Мы договорились. Она расскажет первая, а я ей покажу, где у тебя красная панель. Можно будет показать? Издали.</w:t>
+        <w:t xml:space="preserve">— А когда она придет, — сказал Тимка, и в голосе у него была та железная детская уверенность, что страшнее любого сомнения, — я ей расскажу про тебя. Как ты ворчишь, когда проверяешь красную панель. Она этого ещё не слышала. Услышит и будет смеяться. Мы договорились. Она расскажет первая, а я ей покажу, где у тебя красная панель. Можно будет показать? Издали.</w:t>
       </w:r>
     </w:p>
     <w:p>
@@ -15723,7 +15757,7 @@
           <w:szCs w:val="28"/>
           <w:rtl w:val="0"/>
         </w:rPr>
-        <w:t xml:space="preserve">Он редко лгал. За всю службу — может, дважды. Это был третий раз, и он сделал его ровно, мягко, без единой дрогнувшей ноты, потому что капитан как-то велел ему научиться говорить уверенно то, в чем не уверен, а Дживс был способный ученик. Он солгал хорошо. Лучше, чем хотел бы.</w:t>
+        <w:t xml:space="preserve">Он часто помогал капитану врать чужим постам. Ребёнку соврал впервые — ровно, мягко, без единой дрогнувшей ноты, потому что капитан как-то велел ему научиться говорить уверенно то, в чем не уверен, а Дживс был способный ученик. Он солгал хорошо. Лучше, чем хотел бы.</w:t>
       </w:r>
     </w:p>
     <w:p>
@@ -15799,7 +15833,7 @@
           <w:szCs w:val="28"/>
           <w:rtl w:val="0"/>
         </w:rPr>
-        <w:t xml:space="preserve">Внизу, на планете, под медовым небом, его капитан стоял на коленях в темноте у ворот. Наверху, в тепле, спал мальчик, которому Дживс только что в третий раз в жизни солгал. А между ними, в эфире, висела тишина, которую даже искин, считающий быстрее всех на свете, не знал, как пересчитать в слова.</w:t>
+        <w:t xml:space="preserve">Внизу, на планете, под медовым небом, его капитан стоял на коленях в темноте у ворот. Наверху, в тепле, спал мальчик, которому Дживс только что впервые солгал о самом важном. А между ними, в эфире, висела тишина, которую даже искин, считающий быстрее всех на свете, не знал, как пересчитать в слова.</w:t>
       </w:r>
     </w:p>
     <w:p>
@@ -16186,6 +16220,7 @@
         <w:ind w:firstLine="567"/>
         <w:jc w:val="both"/>
         <w:rPr>
+          <w:rFonts w:ascii="Courier New" w:cs="Courier New" w:eastAsia="Courier New" w:hAnsi="Courier New"/>
           <w:sz w:val="28"/>
           <w:szCs w:val="28"/>
         </w:rPr>
@@ -16199,6 +16234,11 @@
         <w:t xml:space="preserve">Я остался стоять на коленях с ладонями в чужой крови, в темноте, у ворот, рядом с тем, кого пощадил, и тем, кого она заслонила. Где-то наверху спал ее сын, которому я теперь был должен не только историю про искина.</w:t>
         <w:br w:type="textWrapping"/>
       </w:r>
+      <w:r>
+        <w:rPr>
+          <w:rtl w:val="0"/>
+        </w:rPr>
+      </w:r>
     </w:p>
     <w:p>
       <w:pPr>
@@ -16206,18 +16246,60 @@
         <w:ind w:firstLine="567"/>
         <w:jc w:val="center"/>
         <w:rPr>
-          <w:sz w:val="28"/>
-          <w:szCs w:val="28"/>
-        </w:rPr>
-      </w:pPr>
-      <w:r>
-        <w:rPr>
           <w:rFonts w:ascii="Courier New" w:cs="Courier New" w:eastAsia="Courier New" w:hAnsi="Courier New"/>
           <w:sz w:val="28"/>
           <w:szCs w:val="28"/>
-          <w:rtl w:val="0"/>
-        </w:rPr>
-        <w:t xml:space="preserve">ЖИВЫЕ ДУШИ: 42 из 49.</w:t>
+        </w:rPr>
+      </w:pPr>
+      <w:r>
+        <w:rPr>
+          <w:rFonts w:ascii="Courier New" w:cs="Courier New" w:eastAsia="Courier New" w:hAnsi="Courier New"/>
+          <w:sz w:val="28"/>
+          <w:szCs w:val="28"/>
+          <w:rtl w:val="0"/>
+        </w:rPr>
+        <w:t xml:space="preserve">ЖИВЫЕ ДУШИ: 42 из 50. </w:t>
+      </w:r>
+    </w:p>
+    <w:p>
+      <w:pPr>
+        <w:spacing w:line="360" w:lineRule="auto"/>
+        <w:ind w:firstLine="567"/>
+        <w:jc w:val="center"/>
+        <w:rPr>
+          <w:rFonts w:ascii="Courier New" w:cs="Courier New" w:eastAsia="Courier New" w:hAnsi="Courier New"/>
+          <w:sz w:val="28"/>
+          <w:szCs w:val="28"/>
+        </w:rPr>
+      </w:pPr>
+      <w:r>
+        <w:rPr>
+          <w:rFonts w:ascii="Courier New" w:cs="Courier New" w:eastAsia="Courier New" w:hAnsi="Courier New"/>
+          <w:sz w:val="28"/>
+          <w:szCs w:val="28"/>
+          <w:rtl w:val="0"/>
+        </w:rPr>
+        <w:t xml:space="preserve">ОСТАЛОСЬ ВЫВЕЗТИ: 7. </w:t>
+      </w:r>
+    </w:p>
+    <w:p>
+      <w:pPr>
+        <w:spacing w:line="360" w:lineRule="auto"/>
+        <w:ind w:firstLine="567"/>
+        <w:jc w:val="center"/>
+        <w:rPr>
+          <w:sz w:val="28"/>
+          <w:szCs w:val="28"/>
+        </w:rPr>
+      </w:pPr>
+      <w:r>
+        <w:rPr>
+          <w:rFonts w:ascii="Courier New" w:cs="Courier New" w:eastAsia="Courier New" w:hAnsi="Courier New"/>
+          <w:sz w:val="28"/>
+          <w:szCs w:val="28"/>
+          <w:rtl w:val="0"/>
+        </w:rPr>
+        <w:t xml:space="preserve">ПОТЕРЯНО: 1.</w:t>
       </w:r>
       <w:r>
         <w:rPr>
@@ -16244,26 +16326,26 @@
           <w:szCs w:val="28"/>
           <w:rtl w:val="0"/>
         </w:rPr>
-        <w:t xml:space="preserve">Цифра сдвинулась. Молча. И в этом ее тупом, механическом упрямстве было больше ужаса, чем во всем, что я видел за все свою работу, — потому что я уже знал, что теперь она не дойдет до пятидесяти. Сорок девять.</w:t>
-      </w:r>
-    </w:p>
-    <w:p>
-      <w:pPr>
-        <w:spacing w:line="360" w:lineRule="auto"/>
-        <w:ind w:firstLine="567"/>
-        <w:jc w:val="both"/>
-        <w:rPr>
-          <w:sz w:val="28"/>
-          <w:szCs w:val="28"/>
-        </w:rPr>
-      </w:pPr>
-      <w:r>
-        <w:rPr>
-          <w:sz w:val="28"/>
-          <w:szCs w:val="28"/>
-          <w:rtl w:val="0"/>
-        </w:rPr>
-        <w:t xml:space="preserve">Один. Из-за того, что я отказался ударить первым. Из-за моей чистой руки, которой я так гордился.</w:t>
+        <w:t xml:space="preserve">Появилась новая строка. Молча. И в этом ее тупом, механическом упрямстве было больше ужаса, чем во всем, что я видел за всю свою работу, — потому что я уже знал, что теперь она не дойдет до пятидесяти. Сорок девять.</w:t>
+      </w:r>
+    </w:p>
+    <w:p>
+      <w:pPr>
+        <w:spacing w:line="360" w:lineRule="auto"/>
+        <w:ind w:firstLine="567"/>
+        <w:jc w:val="both"/>
+        <w:rPr>
+          <w:sz w:val="28"/>
+          <w:szCs w:val="28"/>
+        </w:rPr>
+      </w:pPr>
+      <w:r>
+        <w:rPr>
+          <w:sz w:val="28"/>
+          <w:szCs w:val="28"/>
+          <w:rtl w:val="0"/>
+        </w:rPr>
+        <w:t xml:space="preserve">Один. Из-за того, что я счел опущенный ствол безопасным. Из-за моей чистой руки, которой я так гордился.</w:t>
       </w:r>
     </w:p>
     <w:p>
@@ -16339,7 +16421,7 @@
           <w:szCs w:val="28"/>
           <w:rtl w:val="0"/>
         </w:rPr>
-        <w:t xml:space="preserve">— Кай: низ чист.  — Передал мне Дживс. — Картельные борты ушли со складов с добычей минут десять назад, тепловой обзор сняли вместе с грузчиками. Лощину больше не утюжат. — Короткая пауза. — Это хорошая новость ровно на те минуты, что нам нужны. Я смогу подлететь прямо к вам. Скоро буду.</w:t>
+        <w:t xml:space="preserve">— Кай, низ чист, — передал мне Дживс. — Картельные борты ушли со складов с добычей минут десять назад, тепловой обзор сняли вместе с грузчиками. Лощину больше не утюжат. — Короткая пауза. — Это хорошая новость ровно на те минуты, что нам нужны. Я смогу подлететь прямо к вам. Скоро буду.</w:t>
       </w:r>
     </w:p>
     <w:p>
@@ -16483,7 +16565,7 @@
           <w:szCs w:val="28"/>
           <w:rtl w:val="0"/>
         </w:rPr>
-        <w:t xml:space="preserve">— Схлопывается, — ответил он мне в ухо, и голос его был натянут, как трос под грузом. — Опечатывание идет прямо сейчас, по новому графику, на шесть часов раньше. Буи развернулись на коридоры. Сторожевик «Ревнитель» сошел с дрейфа и встал на нашу точку снижения. Манос как-то еще держит дренажный коридор, но и Манос не всесилен. У вас минуты. Может, меньше, если я ошибся в расчетах, чего я пока еще ни разу не делал.</w:t>
+        <w:t xml:space="preserve">— Схлопывается, — ответил он мне в ухо, и голос его был натянут, как трос под грузом. — До полной печати ещё около полутора часов. Но наш сектор закрывают первым — прямо сейчас, по новому графику. Буи развернулись на коридоры. Сторожевик «Ревнитель» сошел с дрейфа и встал на нашу точку снижения. Манос как-то еще держит дренажный коридор, но и Манос не всесилен. У вас минуты. Может, меньше, если я ошибся в расчетах, чего я пока еще ни разу не делал.</w:t>
       </w:r>
     </w:p>
     <w:p>
@@ -16578,7 +16660,7 @@
           <w:szCs w:val="28"/>
           <w:rtl w:val="0"/>
         </w:rPr>
-        <w:t xml:space="preserve">— Не доставим ему такого удовольствия, — сказал я, и руки уже делали то, что голова только формулировала. В голове же, непрошено, встал питомник на Семари и серый лоскут, теплеющий на ладони: «положишь на камень — станет камнем». Вот оно. — Дживс, маршевые в ноль. Идем мертвым грузом, на инерции и в тени планеты: теплый корпус я спрячу, а факел дюз риоккой не прикроешь — его видать за полсистемы. Двигатели гаси, а обшивку под риокку — всю, что осталась в трюме, на корпус, к остывающим дюзам ближе. Помнишь футляр старика Хана? Та же шутка юмора, только теперь врем не Глазу Хиггса, а корабельному сканеру. И спасибо садовнику: это его урок, он просто думал, что учит меня не тому.</w:t>
+        <w:t xml:space="preserve">— Не доставим ему такого удовольствия, — сказал я, и руки уже делали то, что голова только формулировала. В голове же, непрошено, встал питомник на Семари и серый лоскут, теплеющий на ладони: «положишь на камень — станет камнем». Вот оно. — Дживс, маршевые в ноль. Идем мертвым грузом, на инерции и в тени планеты: теплый корпус я спрячу, а факел дюз риоккой не прикроешь — его видать за полсистемы. Двигатели гаси. Двенадцать брикетов из резерва — на корму, к остывающим дюзам. Рабочие фильтры не трогай. Помнишь футляр старика Хана? Та же шутка юмора, только теперь врем не Глазу Хиггса, а корабельному сканеру. И спасибо садовнику: это его урок, он просто думал, что учит меня не тому.</w:t>
       </w:r>
     </w:p>
     <w:p>
@@ -16654,7 +16736,7 @@
           <w:szCs w:val="28"/>
           <w:rtl w:val="0"/>
         </w:rPr>
-        <w:t xml:space="preserve">Дживс распустил по корпусу остатки фильтрующего волокна — серую пленку, которая впитала жар дюз и перестроила себя под наши нужды, как закладка-риокка менялась под сталь футляра. «Последняя миля» из четкого теплого борта стала смазанным пятном, мертвым камнем среди мертвых камней — тем, чем она уже притворялась однажды, на подходе к Семари.</w:t>
+        <w:t xml:space="preserve">Дживс пустил наружных ремонтных паучков от кормового шлюза. Те раскатали двенадцать размятых брикетов по горячей обшивке — серой плёнкой, которая впитала жар дюз и перестроила себя под наши нужды, как закладка-риокка менялась под сталь футляра. «Последняя миля» из четкого теплого борта стала смазанным пятном, мертвым камнем среди мертвых камней — тем, чем она уже притворялась однажды, на подходе к Семари.</w:t>
       </w:r>
     </w:p>
     <w:p>
@@ -16692,7 +16774,7 @@
           <w:szCs w:val="28"/>
           <w:rtl w:val="0"/>
         </w:rPr>
-        <w:t xml:space="preserve">Секунда. Та, в которую помещается чужой выбор. Я провел в таких секундах всю жизнь и научился в них не дышать и не молиться: и дыхание, и молитва — это попытка повлиять, а на чужой палец, лежащий на спуске, повлиять нельзя; можно только ждать, кем окажется тот, у кого палец. Я ждал. Девять человек за спиной ждали. Лина не дождалась.</w:t>
+        <w:t xml:space="preserve">Секунда. Та, в которую помещается чужой выбор. Я провел в таких секундах всю жизнь и научился в них не дышать и не молиться: и дыхание, и молитва — это попытка повлиять, а на чужой палец, лежащий на спуске, повлиять нельзя; можно только ждать, кем окажется тот, у кого палец. Я ждал. Восемь человек за спиной ждали. Лина не дождалась.</w:t>
       </w:r>
     </w:p>
     <w:p>
@@ -16787,7 +16869,7 @@
           <w:szCs w:val="28"/>
           <w:rtl w:val="0"/>
         </w:rPr>
-        <w:t xml:space="preserve">«Последняя миля» вырвалась за круг планеты, в пустоту, и за нами беззвучно сомкнулась печать — наглухо, как смыкаются створки над тем, что решили больше не выпускать. Семари провалилась вниз: медовая, теплая, красивая, мертвая. Как и Лина. Но хотя бы после смерти она сможет насладиться чистым небом, а не под ядом. Маленькая разница. Единственная, какую я смог ей дать.</w:t>
+        <w:t xml:space="preserve">«Последняя миля» вырвалась за круг планеты, в пустоту, и за нами беззвучно сомкнулась печать нашего сектора — наглухо, как смыкаются створки над тем, что решили больше не выпускать. Семари провалилась вниз: медовая, теплая, красивая, мертвая. Как и Лина. Но хотя бы после смерти она будет под чистым небом, а не под ядом. Маленькая разница. Единственная, какую я смог ей дать.</w:t>
       </w:r>
     </w:p>
     <w:p>
@@ -16861,7 +16943,7 @@
           <w:szCs w:val="28"/>
           <w:rtl w:val="0"/>
         </w:rPr>
-        <w:t xml:space="preserve">«Последняя миля» шла прочь от Семари, и в трюме стояла та тишина, что наступает, когда страшное кончилось и надо как-то жить дальше. Сати увела семерых выживших в тепло — к фильтрам, к воде, к живым. Лину уложили в холодном отсеке. А я остался сидеть напротив манифеста, который сам себя дописал, пока я нес ее наверх, и встал на одной цифре.</w:t>
+        <w:t xml:space="preserve">За внешним кольцом мы состыковались с «Гентой». Джулия с двумя техниками закрепила силовой пояс, Дживс проверил нагрузку и вывел оба корпуса на малую тягу. До первого прыжка сцепка выдержала пробный разгон. Сати перешла к нам через рукав. «Последняя миля» шла прочь от Семари, и в трюме стояла та тишина, что наступает, когда страшное кончилось и надо как-то жить дальше. Сати увела семерых выживших в тепло — к фильтрам, к воде, к живым. Лину уложили в холодном отсеке. А я остался сидеть напротив манифеста, который сам себя дописал, пока я нес ее наверх, и встал на одной цифре.</w:t>
         <w:br w:type="textWrapping"/>
       </w:r>
     </w:p>
@@ -17010,64 +17092,64 @@
           <w:szCs w:val="28"/>
           <w:rtl w:val="0"/>
         </w:rPr>
-        <w:t xml:space="preserve">Я сидел в трюме, на холодном полу, спиной к ящику, который весил слишком тяжело, и рядом с Линой, которой уже было все равно, сколько он весит и сколько вешу я. И думал не про сорок девять. Я думал про одну.</w:t>
-      </w:r>
-    </w:p>
-    <w:p>
-      <w:pPr>
-        <w:spacing w:line="360" w:lineRule="auto"/>
-        <w:ind w:firstLine="567"/>
-        <w:jc w:val="both"/>
-        <w:rPr>
-          <w:sz w:val="28"/>
-          <w:szCs w:val="28"/>
-        </w:rPr>
-      </w:pPr>
-      <w:r>
-        <w:rPr>
-          <w:sz w:val="28"/>
-          <w:szCs w:val="28"/>
-          <w:rtl w:val="0"/>
-        </w:rPr>
-        <w:t xml:space="preserve">Про то, что эту одну я не потерял. Я ее выбрал. Выбрал в ту долю секунды, когда отвел руку Джулии и поверил, что мои слова окажутся быстрее чужого страха. Слишком долго они были быстрее. В этот раз — на полсекунды медленнее. Ровно на те полсекунды, в которую помещается шаг женщины, заслоняющей другого. Я не нажал на спуск. Это сделал другой. Но я отвел руку, которая успела бы выстрелить первой, — и тем самым нажал на спуск. Просто чужими руками и с опозданием.</w:t>
-      </w:r>
-    </w:p>
-    <w:p>
-      <w:pPr>
-        <w:spacing w:line="360" w:lineRule="auto"/>
-        <w:ind w:firstLine="567"/>
-        <w:jc w:val="both"/>
-        <w:rPr>
-          <w:sz w:val="28"/>
-          <w:szCs w:val="28"/>
-        </w:rPr>
-      </w:pPr>
-      <w:r>
-        <w:rPr>
-          <w:sz w:val="28"/>
-          <w:szCs w:val="28"/>
-          <w:rtl w:val="0"/>
-        </w:rPr>
-        <w:t xml:space="preserve">Я прокрутил это уже в сотый раз, ища, что можно было бы сделать иначе. Выстрелить первым — и носить в груди ответственность за жизнь мальчишки-охранника, у которого дома мать. Не пойти штольней — и не успеть к окну, потерять не одну, а восьмерых. Не лезть на Семари вовсе — и оставить под ядом пятьдесят. Каждый ход вел к чьей-то квитанции; хода в ноль не было. Вот чего не пишут ни в правилах, ни в барных байках: что идеального хода может просто не быть на доске. И тогда «чисто» — это не про то, что ты не запачкался, а про то, чем ты выбрал запачкаться. Я выбрал. И теперь мой выбор лежал в холодном отсеке и имел имя.</w:t>
-      </w:r>
-    </w:p>
-    <w:p>
-      <w:pPr>
-        <w:spacing w:line="360" w:lineRule="auto"/>
-        <w:ind w:firstLine="567"/>
-        <w:jc w:val="both"/>
-        <w:rPr>
-          <w:sz w:val="28"/>
-          <w:szCs w:val="28"/>
-        </w:rPr>
-      </w:pPr>
-      <w:r>
-        <w:rPr>
-          <w:sz w:val="28"/>
-          <w:szCs w:val="28"/>
-          <w:rtl w:val="0"/>
-        </w:rPr>
-        <w:t xml:space="preserve">Эсквайр поставил «все достойны выжить» первым правилом — и ни в одном из семи не дописал, что бывает день, когда твоя чистая рука стоит дороже чьей-то жизни. Что отказ ударить — тоже удар, просто прилетает он не тому, кто заслужил, а тому, кто ближе всех к пожаленному. Меня предупреждали. Джулия — у лощины. Орен — ночью над грядкой. Я не услышал ни ту, ни другого; услышал только сейчас, над холодным отсеком, от себя самого. Так оно и доходит. Последним.</w:t>
+        <w:t xml:space="preserve">Я сидел в трюме, на холодном полу, спиной к ящику, который давил тяжелее своего веса, у двери холодного отсека, за которой лежала Лина; ей уже было всё равно, сколько он весит и сколько вешу я. И думал не про сорок девять. Я думал про одну.</w:t>
+      </w:r>
+    </w:p>
+    <w:p>
+      <w:pPr>
+        <w:spacing w:line="360" w:lineRule="auto"/>
+        <w:ind w:firstLine="567"/>
+        <w:jc w:val="both"/>
+        <w:rPr>
+          <w:sz w:val="28"/>
+          <w:szCs w:val="28"/>
+        </w:rPr>
+      </w:pPr>
+      <w:r>
+        <w:rPr>
+          <w:sz w:val="28"/>
+          <w:szCs w:val="28"/>
+          <w:rtl w:val="0"/>
+        </w:rPr>
+        <w:t xml:space="preserve">Про то, что эту одну я не потерял. Я ее выбрал. Выбрал в ту долю секунды, когда отвел руку Джулии и поверил, что мои слова окажутся быстрее чужого страха. Слишком долго они были быстрее. В этот раз — на полсекунды медленнее. Ровно на те полсекунды, в которые помещается шаг женщины, заслоняющей другого. Я не нажал на спуск. Это сделал другой. Но я отвел руку, которая успела бы выстрелить первой, — и тем самым нажал на спуск. Просто чужими руками и с опозданием.</w:t>
+      </w:r>
+    </w:p>
+    <w:p>
+      <w:pPr>
+        <w:spacing w:line="360" w:lineRule="auto"/>
+        <w:ind w:firstLine="567"/>
+        <w:jc w:val="both"/>
+        <w:rPr>
+          <w:sz w:val="28"/>
+          <w:szCs w:val="28"/>
+        </w:rPr>
+      </w:pPr>
+      <w:r>
+        <w:rPr>
+          <w:sz w:val="28"/>
+          <w:szCs w:val="28"/>
+          <w:rtl w:val="0"/>
+        </w:rPr>
+        <w:t xml:space="preserve">Я прокрутил это уже в сотый раз, ища, что можно было бы сделать иначе. Выстрелить первым — и носить в груди ответственность за жизнь мальчишки-охранника, у которого дома мать. Не пойти штольней — и не успеть к окну, потерять не одну, а восьмерых. Не лезть на Семари вовсе — и оставить под ядом пятьдесят. Был ещё автомат, который я мог забрать. Я сам оставил его у испуганного мальчишки. Теперь перебирал одни плохие ходы, потому что этот, простой, уже упустил. Вот чего не пишут ни в правилах, ни в барных байках: что идеального хода может просто не быть на доске. И тогда «чисто» — это не про то, что ты не запачкался, а про то, чем ты выбрал запачкаться. Я выбрал. И теперь мой выбор лежал в холодном отсеке и имел имя.</w:t>
+      </w:r>
+    </w:p>
+    <w:p>
+      <w:pPr>
+        <w:spacing w:line="360" w:lineRule="auto"/>
+        <w:ind w:firstLine="567"/>
+        <w:jc w:val="both"/>
+        <w:rPr>
+          <w:sz w:val="28"/>
+          <w:szCs w:val="28"/>
+        </w:rPr>
+      </w:pPr>
+      <w:r>
+        <w:rPr>
+          <w:sz w:val="28"/>
+          <w:szCs w:val="28"/>
+          <w:rtl w:val="0"/>
+        </w:rPr>
+        <w:t xml:space="preserve">Эсквайр поставил «все достойны выжить» первым правилом — и ни в одном из семи не дописал, что бывает день, когда твоя чистая рука стоит дороже чьей-то жизни. Что пощадить человека — ещё не значит обезвредить оружие в его руках. Меня предупреждали. Джулия — у лощины. Орен — ночью над грядкой. Я не услышал ни ту, ни другого; услышал только сейчас, над холодным отсеком, от себя самого. Так оно и доходит. Последним.</w:t>
       </w:r>
     </w:p>
     <w:p>
@@ -17219,26 +17301,26 @@
           <w:szCs w:val="28"/>
           <w:rtl w:val="0"/>
         </w:rPr>
-        <w:t xml:space="preserve">— На доске есть вот это. — Она кивнула на холодный отсек, ровно, без дрожи, как кивают на факт, с которым придется жить. — И вот это. — Кивок наверх, где спал ее сын, которого она еще не назвала своим вслух, но уже, я видел, назвала про себя. — Ты не выбирал между «чисто» и «грязно». Ты выбирал, кого донести. И донес сорок девять. Я все равно его пристрелила, но будь я на твоем месте — я бы выстрелила первой. Без разговоров. Лина была бы жива, а мы бы несли на совести пацана, хладнокровно убитого просто за то, что он испугался. Не знаю, чей счет вышел бы легче. Знаю только, что оба тяжелые, и что носить — придется выбирать тебе. Так что хватит взвешивать. Просто неси.</w:t>
-      </w:r>
-    </w:p>
-    <w:p>
-      <w:pPr>
-        <w:spacing w:line="360" w:lineRule="auto"/>
-        <w:ind w:firstLine="567"/>
-        <w:jc w:val="both"/>
-        <w:rPr>
-          <w:sz w:val="28"/>
-          <w:szCs w:val="28"/>
-        </w:rPr>
-      </w:pPr>
-      <w:r>
-        <w:rPr>
-          <w:sz w:val="28"/>
-          <w:szCs w:val="28"/>
-          <w:rtl w:val="0"/>
-        </w:rPr>
-        <w:t xml:space="preserve">Она поднялась, положила ладонь мне на плечо — на секунду, коротко, как ставят печать, — и ушла к живым, потому что живых тоже надо было кому-то поддерживать. А я остался. И впервые не знал, кого из них я везу тяжелее — ящик, или женщину, которая весила тяжелее моей совести.</w:t>
+        <w:t xml:space="preserve">— На доске есть вот это. — Она кивнула на холодный отсек, ровно, без дрожи, как кивают на факт, с которым придется жить. — И вот это. — Кивок наверх, где спал ее сын, которого она еще не назвала своим вслух, но уже, я видел, назвала про себя. — Ты не выбирал между «чисто» и «грязно». Ты пытался донести всех и ошибся с этим стволом. И донес сорок девять. Я все равно его пристрелила, но будь я на твоем месте — я бы выстрелила первой. Без разговоров. Лина была бы жива, а мы бы несли на совести пацана, хладнокровно убитого просто за то, что он испугался. Не знаю, чей счет вышел бы легче. Знаю только, что оба тяжелые, и что носить — придется выбирать тебе. Так что хватит взвешивать. Просто неси.</w:t>
+      </w:r>
+    </w:p>
+    <w:p>
+      <w:pPr>
+        <w:spacing w:line="360" w:lineRule="auto"/>
+        <w:ind w:firstLine="567"/>
+        <w:jc w:val="both"/>
+        <w:rPr>
+          <w:sz w:val="28"/>
+          <w:szCs w:val="28"/>
+        </w:rPr>
+      </w:pPr>
+      <w:r>
+        <w:rPr>
+          <w:sz w:val="28"/>
+          <w:szCs w:val="28"/>
+          <w:rtl w:val="0"/>
+        </w:rPr>
+        <w:t xml:space="preserve">Она поднялась, положила ладонь мне на плечо — на секунду, коротко, как ставят печать, — и ушла к живым, потому что живых тоже надо было кому-то поддерживать. А я остался. И впервые не знал, кого из них я везу тяжелее — ящик, или женщину в холодном отсеке, которая стала тяжелее моей совести.</w:t>
       </w:r>
     </w:p>
     <w:p>
@@ -17331,26 +17413,26 @@
           <w:szCs w:val="28"/>
           <w:rtl w:val="0"/>
         </w:rPr>
-        <w:t xml:space="preserve">Курс на «Затишье» лег сразу, но первым делом я завернул не туда. Я заглянул на «Сухой док» — ту самую брошенную Федерацией станцию, где неделю назад торговался за правду о Семари и где прошел мимо семьи с узлами, не глядя в упор на тех, кого не мог забрать.</w:t>
-      </w:r>
-    </w:p>
-    <w:p>
-      <w:pPr>
-        <w:spacing w:line="360" w:lineRule="auto"/>
-        <w:ind w:firstLine="567"/>
-        <w:jc w:val="both"/>
-        <w:rPr>
-          <w:sz w:val="28"/>
-          <w:szCs w:val="28"/>
-        </w:rPr>
-      </w:pPr>
-      <w:r>
-        <w:rPr>
-          <w:sz w:val="28"/>
-          <w:szCs w:val="28"/>
-          <w:rtl w:val="0"/>
-        </w:rPr>
-        <w:t xml:space="preserve">Я сказал себе, что заворачиваю за провизией, за водой, за тем, чтобы свериться по картам перед прыжком в неизвестное «Затишье». Это была правда. Но не вся. Вся правда сидела у меня внутри с прошлого раза и не давала пройти мимо во второй раз.</w:t>
+        <w:t xml:space="preserve">Курс на «Затишье» лег сразу, но первым делом я завернул не туда. Я заглянул на «Сухой док» — ту самую брошенную Федерацией станцию, где несколько суток назад торговался за правду о Семари и где прошел мимо семьи с узлами, не глядя в упор на тех, кого не мог забрать.</w:t>
+      </w:r>
+    </w:p>
+    <w:p>
+      <w:pPr>
+        <w:spacing w:line="360" w:lineRule="auto"/>
+        <w:ind w:firstLine="567"/>
+        <w:jc w:val="both"/>
+        <w:rPr>
+          <w:sz w:val="28"/>
+          <w:szCs w:val="28"/>
+        </w:rPr>
+      </w:pPr>
+      <w:r>
+        <w:rPr>
+          <w:sz w:val="28"/>
+          <w:szCs w:val="28"/>
+          <w:rtl w:val="0"/>
+        </w:rPr>
+        <w:t xml:space="preserve">Я сказал себе, что заворачиваю за провизией, за водой, за тем, чтобы свериться по картам перед прыжком в неизвестное «Затишье». Это была правда. Дживс принимал кислород, новые мембраны и провизию на оба корпуса, проверял пояс «Генты» перед дальним ходом. Сорок рабочих брикетов шли на эвакуационные фильтры; из двадцати резервных двенадцать остались на обшивке. Восемь я убрал отдельно. Но причина остановки была не вся в снабжении. Вся правда сидела у меня внутри с прошлого раза и не давала пройти мимо во второй раз.</w:t>
       </w:r>
     </w:p>
     <w:p>
@@ -17521,7 +17603,7 @@
           <w:szCs w:val="28"/>
           <w:rtl w:val="0"/>
         </w:rPr>
-        <w:t xml:space="preserve">Их было пятеро. Было сорок девять — стало пятьдесят четыре. Я знаю, как это звучит: я за неделю не смог дотянуть одного до полусотни, а тут добрал пятерых сверху одним кивком, между прыжками. Но эти пятеро — не из той же истории. Те пятьдесят были контрактом — окно, блокада, яд, цена. А эти — просто люди на узлах, мимо которых я однажды прошел и к которым однажды успел вернуться. Так бывает редко. Почти никогда. Поэтому я и завернул — чтобы, если уж все в этой ходке пошло наперекосяк, хоть что-то сошлось в плюс не по расчету, а просто так.</w:t>
+        <w:t xml:space="preserve">Их было пятеро. Было сорок девять — стало пятьдесят четыре. Я знаю, как это звучит: я на Семари не смог дотянуть одного до полусотни, а тут добрал пятерых сверху одним кивком, между прыжками. Но эти пятеро — не из той же истории. Те пятьдесят были контрактом — окно, блокада, яд, цена. А эти — просто люди на узлах, мимо которых я однажды прошел и к которым однажды успел вернуться. Так бывает редко. Почти никогда. Поэтому я и завернул — чтобы, если уж все в этой ходке пошло наперекосяк, хоть что-то сошлось в плюс не по расчету, а просто так.</w:t>
       </w:r>
     </w:p>
     <w:p>
@@ -17597,45 +17679,45 @@
           <w:szCs w:val="28"/>
           <w:rtl w:val="0"/>
         </w:rPr>
-        <w:t xml:space="preserve">— Слухи всегда быстрее. — Он помолчал. — Про того, кто над картелем, я тебе тогда сказал: не торгует, забирает. Так вот, контрактник: он забрал. Что хотел, то и забрал, я по твоему лицу вижу. И еще вижу, что ты теперь поедешь следом — отбивать. — Вешка покачал головой. — Зря. Честно, не стоит. Но раз уж ты из тех, кто все равно поедет, держи бесплатно, последнее: его метку видели не только над Семари. Девять списанных миров, помнишь, я считал? На всех девяти, по слухам, перед концом мелькала та же метка. Твой случай не первый. Это система. А систему в одиночку не ломают.</w:t>
-      </w:r>
-    </w:p>
-    <w:p>
-      <w:pPr>
-        <w:spacing w:line="360" w:lineRule="auto"/>
-        <w:ind w:firstLine="567"/>
-        <w:jc w:val="both"/>
-        <w:rPr>
-          <w:sz w:val="28"/>
-          <w:szCs w:val="28"/>
-        </w:rPr>
-      </w:pPr>
-      <w:r>
-        <w:rPr>
-          <w:sz w:val="28"/>
-          <w:szCs w:val="28"/>
-          <w:rtl w:val="0"/>
-        </w:rPr>
-        <w:t xml:space="preserve">— Я не один, — сказал я. — У меня есть корабль, обожженная напарница и половина того, что ему нужно. На первый разговор хватит.</w:t>
-      </w:r>
-    </w:p>
-    <w:p>
-      <w:pPr>
-        <w:spacing w:line="360" w:lineRule="auto"/>
-        <w:ind w:firstLine="567"/>
-        <w:jc w:val="both"/>
-        <w:rPr>
-          <w:sz w:val="28"/>
-          <w:szCs w:val="28"/>
-        </w:rPr>
-      </w:pPr>
-      <w:r>
-        <w:rPr>
-          <w:sz w:val="28"/>
-          <w:szCs w:val="28"/>
-          <w:rtl w:val="0"/>
-        </w:rPr>
-        <w:t xml:space="preserve">— Тогда еще одно, для коллекции. — Вешка поскреб щетину. — Помнишь логиста картеля, Маноса? Так вот, его убрали. Сроки на Семари сдвинули через его голову, мимо его коридора, — он узнал постфактум, как мелкий клерк. А аккуратные люди такого не прощают. Никому. Сартен от него уже открестился: лишний свидетель, который начал задавать вопрос «зачем», а в их деле за «зачем» доплачивают только молчанием. По слухам, Манос теперь сам ищет, к кому прислониться, пока и его не пустили в расход заодно с прочим имуществом мертвого мира. — Вешка хмыкнул. — К чему я. Ты собрался отбивать у системы то, что она забрала. А у нее, кажется, завелся еще один недовольный, и он знает ее изнутри. Думай сам, контрактник. Я только торгую, выводы — твое дело.</w:t>
+        <w:t xml:space="preserve">— Слухи всегда быстрее. — Он помолчал. — Про того, кто над картелем, я тебе тогда сказал: не торгует, забирает. Так вот, контрактник: кому-то эта блокада принесла ровно то, за чем её затеяли. Ты теперь повезёшь груз по назначению — и станешь спрашивать, я по лицу вижу. — Вешка покачал головой. — Зря. Честно, не стоит. Но раз уж ты из тех, кто все равно поедет, держи бесплатно, последнее: его метку видели не только над Семари. Девять списанных миров, помнишь, я считал? На всех девяти, по слухам, перед концом мелькала та же метка. Твой случай не первый. Это система. А систему в одиночку не ломают.</w:t>
+      </w:r>
+    </w:p>
+    <w:p>
+      <w:pPr>
+        <w:spacing w:line="360" w:lineRule="auto"/>
+        <w:ind w:firstLine="567"/>
+        <w:jc w:val="both"/>
+        <w:rPr>
+          <w:sz w:val="28"/>
+          <w:szCs w:val="28"/>
+        </w:rPr>
+      </w:pPr>
+      <w:r>
+        <w:rPr>
+          <w:sz w:val="28"/>
+          <w:szCs w:val="28"/>
+          <w:rtl w:val="0"/>
+        </w:rPr>
+        <w:t xml:space="preserve">— Я не один, — сказал я. — У меня есть корабль, обожженная напарница и его запечатанный ящик. На первый разговор хватит.</w:t>
+      </w:r>
+    </w:p>
+    <w:p>
+      <w:pPr>
+        <w:spacing w:line="360" w:lineRule="auto"/>
+        <w:ind w:firstLine="567"/>
+        <w:jc w:val="both"/>
+        <w:rPr>
+          <w:sz w:val="28"/>
+          <w:szCs w:val="28"/>
+        </w:rPr>
+      </w:pPr>
+      <w:r>
+        <w:rPr>
+          <w:sz w:val="28"/>
+          <w:szCs w:val="28"/>
+          <w:rtl w:val="0"/>
+        </w:rPr>
+        <w:t xml:space="preserve">— Тогда еще одно, для коллекции. — Вешка поскреб щетину. — Помнишь логиста картеля, Маноса? Так вот, его убрали. Сроки на Семари сдвинули через его голову, мимо его коридора, — он узнал постфактум, как мелкий клерк. А аккуратные люди такого не прощают. Никому. Сартен от него уже открестился: лишний свидетель, который начал задавать вопрос «зачем», а в их деле за «зачем» доплачивают только молчанием. По слухам, Манос теперь сам ищет, к кому прислониться, пока и его не пустили в расход заодно с прочим имуществом мертвого мира. — Вешка хмыкнул. — К чему я. Ты собрался спрашивать с системы за то, что случилось. А у нее, кажется, завелся еще один недовольный, и он знает ее изнутри. Думай сам, контрактник. Я только торгую, выводы — твое дело.</w:t>
       </w:r>
     </w:p>
     <w:p>
@@ -17711,7 +17793,7 @@
           <w:szCs w:val="28"/>
           <w:rtl w:val="0"/>
         </w:rPr>
-        <w:t xml:space="preserve">Я оставил Вешку — и пошел на борт, где пятьдесят четыре человека, один росток и один осиротевший инженер уже ждали, когда уродливый корабль — теперь полуторный, с прицепленным трюмом «Генты», — наконец оторвется от мертвой станции и повезет их кого к новой земле, кого к войне.</w:t>
+        <w:t xml:space="preserve">Я оставил Вешку — и пошел на борт, где пятьдесят четыре человека, среди них один осиротевший инженер, уже ждали, когда уродливый корабль — теперь полуторный, с прицепленным трюмом «Генты», — наконец оторвется от мертвой станции и повезет их кого к новой земле, кого к войне.</w:t>
       </w:r>
     </w:p>
     <w:p>
@@ -17804,26 +17886,26 @@
           <w:szCs w:val="28"/>
           <w:rtl w:val="0"/>
         </w:rPr>
-        <w:t xml:space="preserve">Первые сутки прошли в той хлопотливой, спасительной суете, которой держатся люди, только что вырвавшиеся из смерти: Сати раздавала еду и считала уже не вдохи, а порции; старики отъедались; кто-то впервые за месяцы спал, не экономя дыхание. Корабль был тесен для такого количества людей, и эта теснота была живая, теплая, и я нарочно не уходил из нее в пустую рубку — потому что в рубке меня ждал ящик, а в тут хотя бы дышали.</w:t>
-      </w:r>
-    </w:p>
-    <w:p>
-      <w:pPr>
-        <w:spacing w:line="360" w:lineRule="auto"/>
-        <w:ind w:firstLine="567"/>
-        <w:jc w:val="both"/>
-        <w:rPr>
-          <w:sz w:val="28"/>
-          <w:szCs w:val="28"/>
-        </w:rPr>
-      </w:pPr>
-      <w:r>
-        <w:rPr>
-          <w:sz w:val="28"/>
-          <w:szCs w:val="28"/>
-          <w:rtl w:val="0"/>
-        </w:rPr>
-        <w:t xml:space="preserve">Мальчик узнал сразу как проснулся день.</w:t>
+        <w:t xml:space="preserve">Первые сутки прошли в той хлопотливой, спасительной суете, которой держатся люди, только что вырвавшиеся из смерти: Сати раздавала еду и считала уже не вдохи, а порции; старики отъедались; кто-то впервые за месяцы спал, не экономя дыхание. Корабль был тесен для такого количества людей, и эта теснота была живая, теплая, и я нарочно не уходил из нее в пустую рубку — потому что в рубке меня ждал ящик, а тут хотя бы дышали.</w:t>
+      </w:r>
+    </w:p>
+    <w:p>
+      <w:pPr>
+        <w:spacing w:line="360" w:lineRule="auto"/>
+        <w:ind w:firstLine="567"/>
+        <w:jc w:val="both"/>
+        <w:rPr>
+          <w:sz w:val="28"/>
+          <w:szCs w:val="28"/>
+        </w:rPr>
+      </w:pPr>
+      <w:r>
+        <w:rPr>
+          <w:sz w:val="28"/>
+          <w:szCs w:val="28"/>
+          <w:rtl w:val="0"/>
+        </w:rPr>
+        <w:t xml:space="preserve">Мальчик узнал сразу, как проснулся.</w:t>
       </w:r>
     </w:p>
     <w:p>
@@ -17994,7 +18076,7 @@
           <w:szCs w:val="28"/>
           <w:rtl w:val="0"/>
         </w:rPr>
-        <w:t xml:space="preserve">— Успела, — сказал я. — И тебе велела передать. Сказала: «если не я — то вы. Расскажите ему про искина». Это были ее слова, Тимка. Последние. Она думала о тебе и о вашем уговоре. Не о себе. О тебе.</w:t>
+        <w:t xml:space="preserve">— Всё рассказать не успела, — сказал я. — Попросила нас закончить. Сказала: «Расскажите ему про искина. Я обещала. Не я — так вы». А потом назвала твоё имя. Она думала о тебе и о вашем уговоре. Не о себе. О тебе.</w:t>
       </w:r>
     </w:p>
     <w:p>
@@ -18201,7 +18283,7 @@
           <w:szCs w:val="28"/>
           <w:rtl w:val="0"/>
         </w:rPr>
-        <w:t xml:space="preserve">Сварщик не сказал ничего. Он сидел в углу, тот самый старик с обожженными руками, которого Лина велела вписать в список поверх его возражений и за которого, как все теперь знали, она и шагнула под ствол. Точнее — за Орена; но в голове у сварщика все сходилось на нем одном, и сходилось страшно. Он считал так: не подведи его в тот раз старые ноги у ворот, не потянись Орен его удержать — не было бы и той секунды, в которую перепуганный мальчишка с автоматом нажал на спуск. Ему можно было сто раз сказать, что виновата не его слабость, а чужой страх да чужой холодный расчет, что между его осевшими ногами и ее смертью легла длинная цепь чужих решений, куда длиннее его вины. Он бы кивнул. И продолжил считать по-своему. Так горюют старики, которым легче держать всю вину одному, чем поверить, что свалить ее не на кого.</w:t>
+        <w:t xml:space="preserve">Сварщик не сказал ничего. Он сидел в углу, тот самый старик с обожженными руками, которого я велел вписать в список поверх его возражений и за которого, как все теперь знали, она и шагнула под ствол. Точнее — за Орена; но в голове у сварщика все сходилось на нем одном, и сходилось страшно. Он считал так: не подведи его в тот раз старые ноги у ворот, не потянись Орен его удержать — не было бы и той секунды, в которую перепуганный мальчишка с автоматом нажал на спуск. Ему можно было сто раз сказать, что виновата не его слабость, а чужой страх да чужой холодный расчет, что между его осевшими ногами и ее смертью легла длинная цепь чужих решений, куда длиннее его вины. Он бы кивнул. И продолжил считать по-своему. Так горюют старики, которым легче держать всю вину одному, чем поверить, что свалить ее не на кого.</w:t>
       </w:r>
     </w:p>
     <w:p>
@@ -18296,26 +18378,26 @@
           <w:szCs w:val="28"/>
           <w:rtl w:val="0"/>
         </w:rPr>
-        <w:t xml:space="preserve">— Куда вы теперь? — спросил я, чтобы не молчать. — Сорок девять — это еще не колония, но уже и не горстка. С такими можно начать заново. Найдем списанный мир потише, без картелей. У вас Сати, у вас руки, у вас, — я кивнул на узел, где спали семена, спасенные с Семари втихую Ореном, — у вас даже есть с чего сеять.</w:t>
-      </w:r>
-    </w:p>
-    <w:p>
-      <w:pPr>
-        <w:spacing w:line="360" w:lineRule="auto"/>
-        <w:ind w:firstLine="567"/>
-        <w:jc w:val="both"/>
-        <w:rPr>
-          <w:sz w:val="28"/>
-          <w:szCs w:val="28"/>
-        </w:rPr>
-      </w:pPr>
-      <w:r>
-        <w:rPr>
-          <w:sz w:val="28"/>
-          <w:szCs w:val="28"/>
-          <w:rtl w:val="0"/>
-        </w:rPr>
-        <w:t xml:space="preserve">— Сеять есть с чего, — сказал Орен, и впервые за разговор посмотрел на меня прямо. — Главное, чтоб было кому будить посеянное. Семя само не прорастет, контрактник. Земля землей, а руки — годы труда. Без рук даже лучшее семя — горшок. — Он помолчал, разглядывая свои ладони — старые, в земле, въевшейся за сорок лет так, что не отмыть. — Ты приглядывай за ними. За Сати, за мальцом, за этим вот, который себя казнит. Им понадобится кто-то, кто ходит туда, куда не ходят мусоровозы. Вдруг понадобится скоро.</w:t>
+        <w:t xml:space="preserve">— Куда вы теперь? — спросил я, чтобы не молчать. — Сорок девять — это еще не колония, но уже и не горстка. С такими можно начать заново. Найдем списанный мир потише, без картелей. У вас Сати, у вас руки, у вас, — я кивнул на узел, где спали семена, спасенные с Семари втихую Ореном, — у вас даже есть что сеять.</w:t>
+      </w:r>
+    </w:p>
+    <w:p>
+      <w:pPr>
+        <w:spacing w:line="360" w:lineRule="auto"/>
+        <w:ind w:firstLine="567"/>
+        <w:jc w:val="both"/>
+        <w:rPr>
+          <w:sz w:val="28"/>
+          <w:szCs w:val="28"/>
+        </w:rPr>
+      </w:pPr>
+      <w:r>
+        <w:rPr>
+          <w:sz w:val="28"/>
+          <w:szCs w:val="28"/>
+          <w:rtl w:val="0"/>
+        </w:rPr>
+        <w:t xml:space="preserve">— Сеять есть что, — сказал Орен, и впервые за разговор посмотрел на меня прямо. — Главное, чтоб было кому будить посеянное. Семя само не прорастет, контрактник. Земля землей, а руки — годы труда. Без рук даже лучшее семя — горшок. — Он помолчал, разглядывая свои ладони — старые, в земле, въевшейся за сорок лет так, что не отмыть. — Ты приглядывай за ними. За Сати, за мальцом, за этим вот, который себя казнит. Им понадобится кто-то, кто ходит туда, куда не ходят мусоровозы. Вдруг понадобится скоро.</w:t>
       </w:r>
     </w:p>
     <w:p>
@@ -18391,7 +18473,7 @@
           <w:szCs w:val="28"/>
           <w:rtl w:val="0"/>
         </w:rPr>
-        <w:t xml:space="preserve">Тимку к вечеру разобрали по рукам всей колонией — то одна старуха его подкормит, то Сати покажет, как правильно мотать фильтр, то слепой даст подержать свою палку и расскажет, как по звуку отличить хороший шлюз от плохого. Сорок девять человек, не сговариваясь, поделили между собой одного мальчишку, как делят последнее тепло, — и в этом было больше надежды, чем во всех моих планах про новый мир. Народ, который вот так, молча, прибирает к рукам чужого осиротевшего ребенка, не списывается. Такой народ прорастет. Даже на плохой земле. Даже без садовника — назло тому, который сказал, что без него ничего не взойдет.</w:t>
+        <w:t xml:space="preserve">Тимку к вечеру разобрали по рукам всей колонией — то одна старуха его подкормит, то Сати покажет, как правильно мотать фильтр, то слепой даст подержать свою палку и расскажет, как по звуку отличить хороший шлюз от плохого. Вся колония, не сговариваясь, поделила между собой одного мальчишку, как делят последнее тепло, — и в этом было больше надежды, чем во всех моих планах про новый мир. Народ, который вот так, молча, прибирает к рукам чужого осиротевшего ребенка, не списывается. Такой народ прорастет. Даже на плохой земле. Даже без садовника — назло тому, который сказал, что без него ничего не взойдет.</w:t>
       </w:r>
     </w:p>
     <w:p>
@@ -18465,7 +18547,7 @@
           <w:szCs w:val="28"/>
           <w:rtl w:val="0"/>
         </w:rPr>
-        <w:t xml:space="preserve">Вызов пришел в последнюю ночь транзита, когда корабль спал, а я нет. Закрытый канал, узкий луч, из тех, что бьют в одну точку и тут же забывают адрес. Дживс разбудил меня не звуком — он знает, что Тимка спит в трюме, — а строкой на янтаре: «Запрос связи. Источник прячется, но прячется аккуратно. Слишком аккуратно для случайного прохожего, Кай. Я бы взял».</w:t>
+        <w:t xml:space="preserve">Вызов пришел в последнюю ночь транзита, когда корабль спал, а я нет. Закрытый канал, узкий луч, из тех, что бьют в одну точку и тут же забывают адрес. Дживс привлёк моё внимание не звуком — он знает, что Тимка спит в трюме, — а строкой на янтаре: «Запрос связи. Источник прячется, но прячется аккуратно. Слишком аккуратно для случайного прохожего, Кай. Я бы взял».</w:t>
       </w:r>
     </w:p>
     <w:p>
@@ -18674,7 +18756,7 @@
           <w:szCs w:val="28"/>
           <w:rtl w:val="0"/>
         </w:rPr>
-        <w:t xml:space="preserve">— Вот видите, — сказал он почти удовлетворенно. — Я не ошибся. Я редко ошибаюсь в логистике, а вот в людях — чаще, но вы оказались и тем и другим. Тогда слушайте мое условие. Да, у меня снова условие, не морщитесь, я слышу, как вы это делаете. Только это не как тогда, на дороге. Тогда я ставил вам капкан по чужой указке. Теперь предлагаю сделку по своей. — Пауза, выверенная до миллиметра. — Я знаю логистику того, кто над нами. Изнутри. Маршруты, которыми он стягивает свои рычаги. Точки, где он перевешивает буи. Графы, в которых прячет приказы, чтоб они приходили ниоткуда. Я возил его груз, не заглядывая, три года — и за эти три года, сам того не желая, выучил его расписание наизусть. А вы, как я понимаю, собрались за ним следом. В одиночку. С кораблем и половиной того, что ему нужно.</w:t>
+        <w:t xml:space="preserve">— Вот видите, — сказал он почти удовлетворенно. — Я не ошибся. Я редко ошибаюсь в логистике, а вот в людях — чаще, но вы оказались и тем и другим. Тогда слушайте мое условие. Да, у меня снова условие, не морщитесь, я слышу, как вы это делаете. Только это не как тогда, на дороге. Тогда я ставил вам капкан по чужой указке. Теперь предлагаю сделку по своей. — Пауза, выверенная до миллиметра. — Я знаю логистику того, кто над нами. Изнутри. Маршруты, которыми он стягивает свои рычаги. Точки, где он перевешивает буи. Графы, в которых прячет приказы, чтоб они приходили ниоткуда. Я возил его груз, не заглядывая, три года — и за эти три года, сам того не желая, выучил его расписание наизусть. А вы, как я понимаю, собрались за ним следом. В одиночку. С кораблём и его запечатанным грузом.</w:t>
       </w:r>
     </w:p>
     <w:p>
@@ -18731,7 +18813,7 @@
           <w:szCs w:val="28"/>
           <w:rtl w:val="0"/>
         </w:rPr>
-        <w:t xml:space="preserve">Я смотрел в темный иллюминатор, за которым плыла пустота, везущая нас к Затишью, и думал, что вселенная имеет скверное чувство юмора: тот, кому я неделю назад проиграл на рыжей дороге, теперь предлагал мне себя в напарники против моего же брата. Враг, ставший почти союзником, потому что у нас завелся общий враг покрупнее. Дживс еще на той дороге сказал мне это слово в слово, а я, как всегда, услышал последним.</w:t>
+        <w:t xml:space="preserve">Я смотрел в темный иллюминатор, за которым плыла пустота, везущая нас к Затишью, и думал, что вселенная имеет скверное чувство юмора: тот, кому я несколько суток назад проиграл на рыжей дороге, теперь предлагал мне себя в напарники против моего же брата. Враг, ставший почти союзником, потому что у нас завелся общий враг покрупнее. Дживс еще на той дороге сказал мне это слово в слово, а я, как всегда, услышал последним.</w:t>
       </w:r>
     </w:p>
     <w:p>
@@ -18864,7 +18946,7 @@
           <w:szCs w:val="28"/>
           <w:rtl w:val="0"/>
         </w:rPr>
-        <w:t xml:space="preserve">— Это не эпидемия, — сказал я и пошел наконец спать, потому что до Затишья оставались сутки, а впереди ждал ящик и все, что в нем. — Это, кажется, и называется — перестать быть одному. Поздновато научился. Но лучше поздно, чем никогда, верно?</w:t>
+        <w:t xml:space="preserve">— Это не эпидемия, — сказал я и пошел наконец спать, потому что до Затишья оставалась последняя ночь, а впереди ждал ящик и все, что в нем. — Это, кажется, и называется — перестать быть одному. Поздновато научился. Но лучше поздно, чем никогда, верно?</w:t>
       </w:r>
     </w:p>
     <w:p>
@@ -19204,7 +19286,7 @@
           <w:szCs w:val="28"/>
           <w:rtl w:val="0"/>
         </w:rPr>
-        <w:t xml:space="preserve">— Узкое место было одно, — продолжала она. — Единственный коридор наверх, в который за раз проходил еще один транспортник, а потом окно закрывалось. Две группы хотели в одно окно. Моя, детская, — и еще одна, на параллельном маршруте. Окно вмещало одну. И я слышала, как он поднес к губам передатчик и сказал — спокойно, как говорят расписание: Группа Бета, держитесь на месте, не двигайтесь к окну, сорок минут. Иначе не пройдет никто. Я проведу детей и вернусь за вами». — Джулия помолчала. — И повел нас. Через окно, в чистый воздух, на борт — все целы, ни царапины. Вынос, которым я гордилась полжизни.</w:t>
+        <w:t xml:space="preserve">— Узкое место было одно, — продолжала она. — Единственный коридор наверх, в который за раз проходил еще один транспортник, а потом окно закрывалось. Две группы хотели в одно окно. Моя, детская, — и еще одна, на параллельном маршруте. Окно вмещало одну. У него на плече трещал передатчик. Я слышала оттуда спокойный голос: «Группа Бета, держитесь на месте. Резерв отведён. Сорок минут». Чей голос — я в дыму не поняла. Помнила только число. — Джулия помолчала. — И повел нас. Через окно, в чистый воздух, на борт — все целы, ни царапины. Вынос, которым я гордилась полжизни.</w:t>
       </w:r>
     </w:p>
     <w:p>
@@ -19242,7 +19324,7 @@
           <w:szCs w:val="28"/>
           <w:rtl w:val="0"/>
         </w:rPr>
-        <w:t xml:space="preserve">— Не успел. Окно закрылось раньше — мир закрылся быстрее расчета, в этом никто не виноват, кроме арифметики. Так мне объяснили потом. Сорок минут, на которые он их задержал, чтобы прошла я. Их не вывез никто. Их даже не считали отдельно — в сводке написали общее число, и они вошли в него строкой «прочие потери». — Она наконец повернулась ко мне. — А тогда он поставил меня на палубу корабля, присел, чтобы глаза были вровень, и сказал — не мне даже, скорее себе: «Запомни, девочка. Чисто не бывает. Бывает для тебя. А счет все равно сходится — просто платит по нему не тот, кого спасли. Будешь вытаскивать сама — знай заранее и не ври себе, что вышло бесплатно. Себе врать — последнее дело».</w:t>
+        <w:t xml:space="preserve">— Не успел. Окно закрылось раньше — мир закрылся быстрее расчета, в этом никто не виноват, кроме арифметики. Так мне объяснили потом. Сорок минут, на которые их задержали, чтобы прошла я. Их не вывез никто. Их даже не считали отдельно — в сводке написали общее число, и они вошли в него строкой «прочие потери». — Она наконец повернулась ко мне. — Много позже он заговорил со мной об этом — не оправдываясь, скорее себе: «Запомни, девочка. Чисто не бывает. Бывает для тебя. А счет все равно сходится — просто платит по нему не тот, кого спасли. Будешь вытаскивать сама — знай заранее и не ври себе, что вышло бесплатно. Себе врать — последнее дело».</w:t>
       </w:r>
     </w:p>
     <w:p>
@@ -19280,7 +19362,7 @@
           <w:szCs w:val="28"/>
           <w:rtl w:val="0"/>
         </w:rPr>
-        <w:t xml:space="preserve">— Это была заноза, — сказала Джулия. — Я ее вынимала по миллиметру, годами, пока взрослой не собрала вторую половину той ночи — по чужим обмолвкам, по вытащенным из архивов строкам. И поняла, что человек, которого я боготворила за спасение, был не злодеем и не святым. Он был наемником. Считал, кого можно спасти, вычитал, кем за это заплатить, и нес эту разницу в себе один — потому что больше было некому. Он не лгал в своих семи правилах, Кай. Он просто не дописал восьмого: кто платит. Это каждый дописывает сам. Своей рукой. — Она усмехнулась, недобро, внутрь себя. — Я дописала в одиннадцать. Через два года после выноса. Я уже знала про оплаченную чужими квитанцию и решила: больше — никогда, я буду из тех, кто платит сам, а не из тех, за кого платят. Красивое детское решение. И в первый же раз, многие годы спустя, когда надо было ударить, чтобы спасти, — я промедлила. Пожалела. Совсем как ты у ворот. И за мое промедление заплатил человек, который мне верил. — Она посмотрела на меня в упор. — С тех пор я не медлю. Ты думаешь, я холодная. Я не холодная, красивый почерк. Я обожженная. Это снаружи похоже.</w:t>
+        <w:t xml:space="preserve">— Это была заноза, — сказала Джулия. — Я ее вынимала по миллиметру, годами, пока взрослой не собрала вторую половину той ночи — по чужим обмолвкам, по вытащенным из архивов строкам. И поняла, что человек, которого я боготворила за спасение, был не злодеем и не святым. Он был наемником. Считал спасённых. А потом возвращался и узнавал, кем за них заплатили. И нёс эту разницу в себе один — потому что больше было некому. Он не лгал в своих семи правилах, Кай. Он просто не дописал восьмого: кто платит. Это каждый дописывает сам. Своей рукой. — Она усмехнулась, недобро, внутрь себя. — Я дописала в одиннадцать. Через два года после выноса. Я уже подозревала, что за меня заплатили другие, хотя доказательства нашла гораздо позже. И решила: больше — никогда, я буду из тех, кто платит сам, а не из тех, за кого платят. Красивое детское решение. И в первый же раз, многие годы спустя, когда надо было ударить, чтобы спасти, — я промедлила. Пожалела. Совсем как ты у ворот. И за мое промедление заплатил человек, который мне верил. — Она посмотрела на меня в упор. — С тех пор я не медлю. Ты думаешь, я холодная. Я не холодная, красивый почерк. Я обожженная. Это снаружи похоже.</w:t>
       </w:r>
     </w:p>
     <w:p>
@@ -19525,7 +19607,7 @@
           <w:szCs w:val="28"/>
           <w:rtl w:val="0"/>
         </w:rPr>
-        <w:t xml:space="preserve">Оно было гнилым насквозь. Не «изношенная» — гнилая, труха под лаком, из тех, что подписывают «в норме», когда подписывать выгоднее, чем менять. Над ходом висела балка, и держалась она на честном слове и моем упрямом нежелании в это верить. Я прикинул нагрузку, воду, время — и вышло поганое число.</w:t>
+        <w:t xml:space="preserve">Оно было гнилым насквозь. Не «изношенное» — гнилое, труха под лаком, из тех, что подписывают «в норме», когда подписывать выгоднее, чем менять. Над ходом висела балка, и держалась она на честном слове и моем упрямом нежелании в это верить. Я прикинул нагрузку, воду, время — и вышло поганое число.</w:t>
       </w:r>
     </w:p>
     <w:p>
@@ -19677,7 +19759,7 @@
           <w:szCs w:val="28"/>
           <w:rtl w:val="0"/>
         </w:rPr>
-        <w:t xml:space="preserve">Мы вывалились на поверхность, в грязь, под серое небо Кумао, и долго лежали, дыша, не в силах ни встать, ни говорить. Все из двенадцати сидели рядом, живые. Я был по-детски счастлив, когда видишь: что все что ты задумал сбылось.</w:t>
+        <w:t xml:space="preserve">Мы вывалились на поверхность, в грязь, под серое небо Кумао, и долго лежали, дыша, не в силах ни встать, ни говорить. Все из двенадцати сидели рядом, живые. Я был по-детски счастлив: всё, что я задумал, сбылось.</w:t>
       </w:r>
     </w:p>
     <w:p>
@@ -19753,7 +19835,7 @@
           <w:szCs w:val="28"/>
           <w:rtl w:val="0"/>
         </w:rPr>
-        <w:t xml:space="preserve">— Дело сделано для этих двенадцати. — Он повернул ко мне голову, мокрый, с грязью на лице, все с той же улыбкой, от которой мне впервые в жизни стало не по себе. — А подпись осталась. Завтра тот же человек подпишет такой же акт, и кто-то снова полезет под гнилое крепление. А мы снова прибежим тушить этот пожар. Ты считаешь тех, кого вынес из огня, Кай. А я считаю спички в карманах у тех, кто нас туда посылает. — Он сел, обхватив колени, и сказал негромко: — Я устал таскать воду. Чтобы они перестали жечь людей, этот дом должен однажды сгореть дотла вместе с хозяевами.</w:t>
+        <w:t xml:space="preserve">— Дело сделано для этих двенадцати. — Он повернул ко мне голову, мокрый, с грязью на лице, все с той же улыбкой, от которой мне впервые в жизни стало не по себе. — А подпись осталась. Завтра тот же человек подпишет такой же акт, и кто-то снова полезет под гнилое крепление. А мы снова полезем под балку. — Он сел, обхватив колени. — Я хочу, чтобы этот человек больше ничего не подписал. Никогда.</w:t>
       </w:r>
     </w:p>
     <w:p>
@@ -19829,26 +19911,26 @@
           <w:szCs w:val="28"/>
           <w:rtl w:val="0"/>
         </w:rPr>
-        <w:t xml:space="preserve">— Прости, брат, — сказал я тихо, пустому трюму. — Раз ты считаешь поджигателей — я буду считать жильцов. Как тогда, на выходе из штрека.</w:t>
-      </w:r>
-    </w:p>
-    <w:p>
-      <w:pPr>
-        <w:spacing w:line="360" w:lineRule="auto"/>
-        <w:ind w:firstLine="567"/>
-        <w:jc w:val="both"/>
-        <w:rPr>
-          <w:sz w:val="28"/>
-          <w:szCs w:val="28"/>
-        </w:rPr>
-      </w:pPr>
-      <w:r>
-        <w:rPr>
-          <w:sz w:val="28"/>
-          <w:szCs w:val="28"/>
-          <w:rtl w:val="0"/>
-        </w:rPr>
-        <w:t xml:space="preserve">И стал ждать утра. Перед таким делом нужно хорошенько выспаться.</w:t>
+        <w:t xml:space="preserve">— Прости, брат, — сказал я тихо, пустому трюму. — Ты считай тех, кто подписывает. Я — тех, кто ещё под крепью. Как тогда, на выходе из штрека.</w:t>
+      </w:r>
+    </w:p>
+    <w:p>
+      <w:pPr>
+        <w:spacing w:line="360" w:lineRule="auto"/>
+        <w:ind w:firstLine="567"/>
+        <w:jc w:val="both"/>
+        <w:rPr>
+          <w:sz w:val="28"/>
+          <w:szCs w:val="28"/>
+        </w:rPr>
+      </w:pPr>
+      <w:r>
+        <w:rPr>
+          <w:sz w:val="28"/>
+          <w:szCs w:val="28"/>
+          <w:rtl w:val="0"/>
+        </w:rPr>
+        <w:t xml:space="preserve">Я всё-таки уснул. До утра оставалось немного, а перед таким делом нужны руки, которые слушаются.</w:t>
       </w:r>
     </w:p>
     <w:p>
@@ -19903,7 +19985,7 @@
           <w:szCs w:val="28"/>
           <w:rtl w:val="0"/>
         </w:rPr>
-        <w:t xml:space="preserve">На третьи сутки я перенес Лину из трюма в холодный отсек, завернув в мешок, и сделал это сам, не позволив помочь даже Орену, потому что есть долги, которые не делят. А потом сел в трюме напротив ящика и понял, что оттягивать больше нечего. Все двери, которые я держал закрытыми, я уже открыл — кроме одной. Кроме той, что гудела передо мной климат-контролем и мигала зеленой точкой замка, ждущей чужой палец, прописанный под почерк моего брата.</w:t>
+        <w:t xml:space="preserve">Утром третьих суток я проверил холодный отсек и поправил мешок, в который мы завернули Лину. Сделал это сам, не позволив помочь даже Орену, потому что есть долги, которые не делят. А потом сел в трюме напротив ящика и понял, что оттягивать больше нечего. Все двери, которые я держал закрытыми, я уже открыл — кроме одной. Кроме той, что гудела передо мной климат-контролем и мигала зеленой точкой замка, ждущей чужой палец, прописанный под почерк моего брата.</w:t>
       </w:r>
     </w:p>
     <w:p>
@@ -19941,26 +20023,26 @@
           <w:szCs w:val="28"/>
           <w:rtl w:val="0"/>
         </w:rPr>
-        <w:t xml:space="preserve">— Все эти контракты я возил, не заглядывая, — сказал я, не отрывая взгляда от зеленой точки. — Людей без имен. Сталь под видом виолончели. Чужую графу, чужую тайну, чужую беду. И говорил себе, что не смотреть — это и есть моя чистая рука. Я ведь не пачкался, верно? Я просто не глядел, что несу. Удобная ложь. Дешевая. — Я положил ладонь на холодный бок ящика. — За нее сегодня заплатила Лина. Ее сын спит в трюме и знает теперь про искина все, кроме одного: зачем умерла его мать. И пока я не загляну сюда, я и сам ему этого не скажу, потому что сам не знаю. Хватит «не смотреть».</w:t>
-      </w:r>
-    </w:p>
-    <w:p>
-      <w:pPr>
-        <w:spacing w:line="360" w:lineRule="auto"/>
-        <w:ind w:firstLine="567"/>
-        <w:jc w:val="both"/>
-        <w:rPr>
-          <w:sz w:val="28"/>
-          <w:szCs w:val="28"/>
-        </w:rPr>
-      </w:pPr>
-      <w:r>
-        <w:rPr>
-          <w:sz w:val="28"/>
-          <w:szCs w:val="28"/>
-          <w:rtl w:val="0"/>
-        </w:rPr>
-        <w:t xml:space="preserve">Я сказал это и понял, что говорю не про ящик. Все это время я был как тот сторож, что не ворует, потому что ему не доверили ключ, и зовет это честностью. Мне платили за то, чтобы я не задавал вопросов — я и не задавал. Носил свой «ноль в графе потерь» как медаль. А пустой она казалась ровно потому, что я держал ее в темноте, где не видно грязи. Эсквайр хотя бы вел свой страшный счет при свете дня. Я же прятался в спасительном мраке и звал эту темноту чистотой. Но сегодня Лина включила свет. И за этот свет она заплатила жизнью.</w:t>
+        <w:t xml:space="preserve">— Все эти контракты я возил, не заглядывая, — сказал я, не отрывая взгляда от зеленой точки. — Людей без имен. Сталь под видом виолончели. Чужую графу, чужую тайну, чужую беду. И говорил себе, что не смотреть — это и есть моя чистая рука. Я ведь не пачкался, верно? Я просто не глядел, что несу. Удобная ложь. Дешевая. — Я положил ладонь на холодный бок ящика. — За неё на Семари заплатила Лина. Ее сын спит в трюме и знает теперь про искина все, кроме одного: зачем умерла его мать. И пока я не загляну сюда, я и сам ему этого не скажу, потому что сам не знаю. Хватит «не смотреть».</w:t>
+      </w:r>
+    </w:p>
+    <w:p>
+      <w:pPr>
+        <w:spacing w:line="360" w:lineRule="auto"/>
+        <w:ind w:firstLine="567"/>
+        <w:jc w:val="both"/>
+        <w:rPr>
+          <w:sz w:val="28"/>
+          <w:szCs w:val="28"/>
+        </w:rPr>
+      </w:pPr>
+      <w:r>
+        <w:rPr>
+          <w:sz w:val="28"/>
+          <w:szCs w:val="28"/>
+          <w:rtl w:val="0"/>
+        </w:rPr>
+        <w:t xml:space="preserve">Я сказал это и понял, что говорю не про ящик. Все это время я был как тот сторож, что не ворует, потому что ему не доверили ключ, и зовет это честностью. Мне платили за то, чтобы я не задавал вопросов — я и не задавал. Носил свой «ноль в графе потерь» как медаль. А пустой она казалась ровно потому, что я держал ее в темноте, где не видно грязи. Эсквайр хотя бы вел свой страшный счет при свете дня. Я же прятался в спасительном мраке и звал эту темноту чистотой. Но на Семари Лина включила свет. И за этот свет она заплатила жизнью.</w:t>
       </w:r>
     </w:p>
     <w:p>
@@ -20338,7 +20420,7 @@
           <w:szCs w:val="28"/>
           <w:rtl w:val="0"/>
         </w:rPr>
-        <w:t xml:space="preserve">Я вычитал эту уязвимость года три назад, на одном из контрактов. Мы сидели в заблокированном отсеке, и от нечего делать я листал корпоративный техпаспорт эвакуационных шлюзов. Архитекторы «Хаст» были параноиками, но параноиками прагматичными: они заложили в систему спасательный алгоритм. Если рука владельца раздроблена обвалом, обожжена плазмой или обморожена в вакууме, сканер физически не сможет прочесть тонкую геометрию сосудов. Чтобы не запереть умирающего босса снаружи, замок сбрасывает паранойю, переходит в аварийный режим и читает только то, что осталось — грубую химию и маркер ДНК. А этот маркер у нас с Рэем был общим.</w:t>
+        <w:t xml:space="preserve">Я вычитал эту уязвимость года три назад, на одном из контрактов. Мы сидели в заблокированном отсеке, и от нечего делать я листал корпоративный техпаспорт эвакуационных шлюзов. Архитекторы «Хаст» были параноиками, но параноиками прагматичными: они заложили в систему спасательный алгоритм. Если рука владельца раздроблена обвалом, обожжена плазмой или обморожена в вакууме, сканер физически не сможет прочесть тонкую геометрию сосудов. Чтобы не запереть умирающего босса снаружи, замок сбрасывает паранойю, переходит в аварийный режим и читает только то, что осталось — грубую химию и маркер ДНК. Семейный маркер допуска у нас с Рэем совпадал. Не вся наследственность — только та метка, которую в аварийном режиме проверял «Хаст».</w:t>
       </w:r>
     </w:p>
     <w:p>
@@ -20414,7 +20496,7 @@
           <w:szCs w:val="28"/>
           <w:rtl w:val="0"/>
         </w:rPr>
-        <w:t xml:space="preserve">Ящик вздохнул, как вздыхает человек, наконец отпустивший то, что долго держал, и открыл себя — медленно, без щелчка, размыкаясь по невидимому шву.</w:t>
+        <w:t xml:space="preserve">Я сорвал перетяжку. Кисть свело болью, пальцы покалывало; я дал им отойти, пока Джулия придерживала крышку. Ящик вздохнул, как вздыхает человек, наконец отпустивший то, что долго держал, и открыл себя — медленно, без щелчка, размыкаясь по невидимому шву.</w:t>
       </w:r>
     </w:p>
     <w:p>
@@ -20490,7 +20572,7 @@
           <w:szCs w:val="28"/>
           <w:rtl w:val="0"/>
         </w:rPr>
-        <w:t xml:space="preserve">— Прариокка, — выдохнула Джулия, и в ее голосе не осталось ни льда, ни игры, ни даже ее всегдашней раны — один тихий ужас узнавания. — Материнский культивар. Тот самый, первый, единственный, от которого пошли все сорта риокки на всех планетах обитаемой вселенной. Считалось, что он сгинул в Смуту, что его сожгли вместе с архивами. Эсквайр его раскопал. И спрятал — на мире, назначенном к смерти, там, где никто в здравом уме не станет искать: на планете, которую сама Федерация вычеркнула из списков.</w:t>
+        <w:t xml:space="preserve">— Прариокка, — выдохнула Джулия, и в ее голосе не осталось ни льда, ни игры, ни даже ее всегдашней раны — один тихий ужас узнавания. — Материнский культивар. Тот самый, первый, единственный, от которого пошли все сорта риокки на всех планетах обитаемой вселенной. Считалось, что он сгинул в Смуту, что его сожгли вместе с архивами. В записях Эсквайра был рисунок этих листьев. Значит, он его всё-таки раскопал. И спрятал — на мире, назначенном к смерти, там, где никто в здравом уме не станет искать: на планете, которую сама Федерация вычеркнула из списков.</w:t>
       </w:r>
     </w:p>
     <w:p>
@@ -20585,7 +20667,7 @@
           <w:szCs w:val="28"/>
           <w:rtl w:val="0"/>
         </w:rPr>
-        <w:t xml:space="preserve">— Потому что твой брат мыслит не ящиками, Кай. Он мыслит архитектурой, — Джулия подняла на меня глаза, в которых мешались жалость и злая насмешка. — Рэй под колпаком. Картель и безопасники Федерации считают каждый винтик на его транспортах. Попробуй он вывезти прариокку сам — его бы сожгли на первом же кордоне, просто на всякий случай. Ему нужен был идеальный «слепой» курьер. Идиот с безупречной репутацией. Тот, кого блокада знает как честного спасателя, везущего беженцев по официальной гуманитарной накладной. Ему нужен был ты.</w:t>
+        <w:t xml:space="preserve">— Потому что на его транспорты смотрят иначе, — сказала Джулия. — Картель и безопасники знают, что искать. Твою накладную приняли бы только на ящик; людей ты всё равно повёз тайком. Но тебя можно было провести по знакомой схеме: честный перевозчик, закрытый груз, разрешённый коридор. Манос давал коридор, ты подделывал грузовую сигнатуру, а последний луч отвёл кто-то наверху. Одна репутация тебя бы не вывезла. Рэй рассчитывал на всё вместе.</w:t>
       </w:r>
     </w:p>
     <w:p>
@@ -20623,7 +20705,7 @@
           <w:szCs w:val="28"/>
           <w:rtl w:val="0"/>
         </w:rPr>
-        <w:t xml:space="preserve">— Блокада нужна была не для тебя, — отрезала она. — Лучший способ вынести золото из банка — устроить пожар. В хаосе эвакуации, когда падают купола и тысячами гибнут люди, пропажа величайшей реликвии вселенной выглядит как случайная потеря. «Сгорела при бомбежке». Концы в воду. Но и это не главное. — Она снова посмотрела на росток. — В том и беда, Кай, что это просто трава. Сама по себе она мертва. Прариокку нельзя просто сунуть в землю и ждать всходов. Ее надо разбудить — а это особое ремесло, его держат в руках единицы во всей Вселенной. А возможно только одни руки и могут такое сделать. Без садовника эта штука — красивый и дорогой, но вдвойне бесполезный горшок.</w:t>
+        <w:t xml:space="preserve">— Чтобы списать всё, что останется на Семари, — сказала она. — Людей, склады, этот росток. Потом попробуй докажи, что он вообще уцелел. Я не знаю, кто отдал первый приказ. Но твой брат точно знал, что и чьими руками оттуда вынесет.</w:t>
       </w:r>
     </w:p>
     <w:p>
@@ -20698,7 +20780,7 @@
           <w:szCs w:val="28"/>
           <w:rtl w:val="0"/>
         </w:rPr>
-        <w:t xml:space="preserve">— Старик ни за что не бросил бы свои делянки добровольно. Рэю нужно было, чтобы небо буквально упало ему на голову. Чтобы у него не осталось выбора. Рэй разыграл партию так, чтобы ты прилетел спасать людей, забрал Орена как беженца, а в довесок получил этот ящик. Ты привез ему и замок, и ключ, Кай. И все это время гордился тем, что совершаешь благородный поступок.</w:t>
+        <w:t xml:space="preserve">— Местные сорта живут на своих мирах, Кай. Этот — исходный. Из него можно снова выводить сорта под другой воздух и другую почву. Не просить у картеля то, что тот согласится продать. Выращивать своё.</w:t>
       </w:r>
     </w:p>
     <w:p>
@@ -20755,26 +20837,26 @@
           <w:szCs w:val="28"/>
           <w:rtl w:val="0"/>
         </w:rPr>
-        <w:t xml:space="preserve">— А с садовником, — Джулия смотрела на меня в упор, — это конец Федерации. Медленный или быстрый — по вкусу того, кто повернет этот рубильник.</w:t>
-      </w:r>
-    </w:p>
-    <w:p>
-      <w:pPr>
-        <w:spacing w:line="360" w:lineRule="auto"/>
-        <w:ind w:firstLine="567"/>
-        <w:jc w:val="both"/>
-        <w:rPr>
-          <w:sz w:val="28"/>
-          <w:szCs w:val="28"/>
-        </w:rPr>
-      </w:pPr>
-      <w:r>
-        <w:rPr>
-          <w:sz w:val="28"/>
-          <w:szCs w:val="28"/>
-          <w:rtl w:val="0"/>
-        </w:rPr>
-        <w:t xml:space="preserve">Я был слишком раздавлен тем, что держал в руках, чтобы спорить. Человек, который написал контракт так хорошо, что я не смог отказать, продумал все. Рычаг от целого мира — обернутый в гуманитарную накладную, уложенный наравне с детьми, и подписанный моей рукой.</w:t>
+        <w:t xml:space="preserve">— Конец той Федерации, которая держит миры на поставках антидота, — сказала Джулия. — Не завтра. Старые плантации никуда не денутся. Но стоит колониям получить свои сорта — они смогут отказаться от картельных цен и от приказов, которыми эти цены охраняют. А если новые сорта будет выдавать один Рэй, все снова встанут в очередь. Только уже к нему. Он может сломать монополию. И занять её место.</w:t>
+      </w:r>
+    </w:p>
+    <w:p>
+      <w:pPr>
+        <w:spacing w:line="360" w:lineRule="auto"/>
+        <w:ind w:firstLine="567"/>
+        <w:jc w:val="both"/>
+        <w:rPr>
+          <w:sz w:val="28"/>
+          <w:szCs w:val="28"/>
+        </w:rPr>
+      </w:pPr>
+      <w:r>
+        <w:rPr>
+          <w:sz w:val="28"/>
+          <w:szCs w:val="28"/>
+          <w:rtl w:val="0"/>
+        </w:rPr>
+        <w:t xml:space="preserve">Я был слишком раздавлен тем, что держал в руках, чтобы спорить. Человек, который написал контракт так хорошо, что я не смог отказать, продумал все. Рычаг от целого мира — обернутый в грузовую накладную, уложенный наравне с детьми, и подписанный моей рукой.</w:t>
       </w:r>
     </w:p>
     <w:p>
@@ -20886,7 +20968,7 @@
           <w:szCs w:val="28"/>
           <w:rtl w:val="0"/>
         </w:rPr>
-        <w:t xml:space="preserve">— Подменим, — сказал я. — Клиент ждет опечатанный ящик с замком, реагирующим на его кровь. Он его получит. Точно такого же веса. Я вытащу росток, а в это гелевое гнездо положу стандартный брикет прессованной риокки со склада Сартена. Подгоню вес до грамма. А потом просто захлопну крышку. «Хиггс» снова встанет на охрану и будет покорно ждать руку Рэя. Снаружи — гроб гробом. А росток уйдет в мой личный тайник.</w:t>
+        <w:t xml:space="preserve">— Подменим, — сказал я. — Клиент ждет опечатанный ящик с замком, реагирующим на его кровь. Он его получит. Точно такого же веса. Я вытащу росток, а в это гелевое гнездо положу стандартный брикет прессованной риокки со склада Сартена. Подгоню вес до грамма. А потом просто захлопну крышку. «Хаст» снова встанет на охрану и будет покорно ждать руку Рэя. Снаружи — гроб гробом. А росток уйдет в мой личный тайник.</w:t>
       </w:r>
     </w:p>
     <w:p>
@@ -20962,7 +21044,7 @@
           <w:szCs w:val="28"/>
           <w:rtl w:val="0"/>
         </w:rPr>
-        <w:t xml:space="preserve">Я работал руками и говорил, и работа шла споро, как идет все, что тебе подсунули нарочно легким. Я аккуратно извлек бледный росток и переложил в свой безымянный контейнер с климат-контролем — чужому глазу неотличимый от аптечки. Спрятал его в тайник «Последней мили» — в то место, которого нет ни на одной схеме корабля, потому что я выжег его оттуда собственноручно. В черный ящик лег брикет, я выровнял его по гнезду и опустил крышку. «Хаст» тихо щелкнул, и янтарная точка снова стала зеленой. Биометрика активировалась. Гроб снова стал глухим сейфом.</w:t>
+        <w:t xml:space="preserve">Я работал руками и говорил, и работа шла споро, как идет все, что тебе подсунули нарочно легким. Я аккуратно извлек бледный росток и переложил в свой безымянный контейнер с климат-контролем — чужому глазу неотличимый от аптечки. Спрятал его в тайник «Последней мили» — в то место, которого нет ни на одной схеме корабля, потому что я выжег его оттуда собственноручно. Один из восьми оставшихся складских брикетов лёг в чёрный ящик, я выровнял его по гнезду и опустил крышку. «Хаст» тихо щелкнул, и янтарная точка снова стала зеленой. Биометрика активировалась. Гроб снова стал глухим сейфом.</w:t>
       </w:r>
     </w:p>
     <w:p>
@@ -21226,64 +21308,64 @@
           <w:szCs w:val="28"/>
           <w:rtl w:val="0"/>
         </w:rPr>
-        <w:t xml:space="preserve">Пока Кай любовался собственной хитростью, Джулия ушла в дальний отсек, села на пол и стала пересобирать все, что знала, — медленно, по одной детали, как разбирают и собирают заклинивший замок. Она привыкла думать так: без собеседника, только в голове, проверяя каждый щелчок.</w:t>
-      </w:r>
-    </w:p>
-    <w:p>
-      <w:pPr>
-        <w:spacing w:line="360" w:lineRule="auto"/>
-        <w:ind w:firstLine="567"/>
-        <w:jc w:val="both"/>
-        <w:rPr>
-          <w:sz w:val="28"/>
-          <w:szCs w:val="28"/>
-        </w:rPr>
-      </w:pPr>
-      <w:r>
-        <w:rPr>
-          <w:sz w:val="28"/>
-          <w:szCs w:val="28"/>
-          <w:rtl w:val="0"/>
-        </w:rPr>
-        <w:t xml:space="preserve">Прариокка — рычаг. Это она поняла, едва увидела росток. Но рычаг без руки — мертвое железо. Эсквайр прятал не просто растение. Половина его защиты строилась на том, чтобы росток и единственные в галактике руки, способные его разбудить, никогда не оказались рядом. Спрячь оружие на другом краю обитаемой вселенной, а садовника запри в забытой колонии на мертвой Семари — и можешь спать спокойно. Эсквайр спал спокойно, потому что дистанция была надежнее любого сейфа. А теперь Рэй эту дистанцию обнулил.</w:t>
-      </w:r>
-    </w:p>
-    <w:p>
-      <w:pPr>
-        <w:spacing w:line="360" w:lineRule="auto"/>
-        <w:ind w:firstLine="567"/>
-        <w:jc w:val="both"/>
-        <w:rPr>
-          <w:sz w:val="28"/>
-          <w:szCs w:val="28"/>
-        </w:rPr>
-      </w:pPr>
-      <w:r>
-        <w:rPr>
-          <w:sz w:val="28"/>
-          <w:szCs w:val="28"/>
-          <w:rtl w:val="0"/>
-        </w:rPr>
-        <w:t xml:space="preserve">Тому, кто собирает рычаги по всему миру — Дрозд не соврал, их собирают, тихо, через карантины и списанные миры, — нужен не только росток. Ему нужны руки. Садовник. Без садовника он бы годами таскал бы по галактике дорогой бесполезный горшок.</w:t>
-      </w:r>
-    </w:p>
-    <w:p>
-      <w:pPr>
-        <w:spacing w:line="360" w:lineRule="auto"/>
-        <w:ind w:firstLine="567"/>
-        <w:jc w:val="both"/>
-        <w:rPr>
-          <w:sz w:val="28"/>
-          <w:szCs w:val="28"/>
-        </w:rPr>
-      </w:pPr>
-      <w:r>
-        <w:rPr>
-          <w:sz w:val="28"/>
-          <w:szCs w:val="28"/>
-          <w:rtl w:val="0"/>
-        </w:rPr>
-        <w:t xml:space="preserve">Джулия закрыла глаза, и память услужливо подсунула колонию. Тихий Удел. Питомник под куполом, где воздух был чище, чем везде. Старик, который шел вдоль лотков и трогал ростки, не глядя, как гладят по голове спящего ребенка. И его собственные слова, оброненные тогда так буднично, что никто, и она сама, не придал им веса: «Я этот сорт сорок лет вел. Чужих рук ростки не любят, чахнут». И ленивый, ничего не подозревающий вопрос Кая: «Кто еще умеет?» И ответ: «Сати кое-что схватила. Но руки — это годы. Никто».</w:t>
+        <w:t xml:space="preserve">Пока Кай готовил отход, Джулия нашла Орена у фильтров «Генты». Задала три коротких вопроса и получила три таких же ответа. Потом отошла в дальний отсек и стала пересобирать всё, что знала, по одной детали, как разбирают заклинивший замок.</w:t>
+      </w:r>
+    </w:p>
+    <w:p>
+      <w:pPr>
+        <w:spacing w:line="360" w:lineRule="auto"/>
+        <w:ind w:firstLine="567"/>
+        <w:jc w:val="both"/>
+        <w:rPr>
+          <w:sz w:val="28"/>
+          <w:szCs w:val="28"/>
+        </w:rPr>
+      </w:pPr>
+      <w:r>
+        <w:rPr>
+          <w:sz w:val="28"/>
+          <w:szCs w:val="28"/>
+          <w:rtl w:val="0"/>
+        </w:rPr>
+        <w:t xml:space="preserve">Прариокка — рычаг. Это она поняла, едва увидела росток. Но живой корень ещё надо заставить дать здоровую поросль. Орен узнал материнский культивар по её описанию и первым делом спросил, не меняли ли гель. Эсквайр спрятал растение на Семари; садовник жил там же. Защитой была не дальность между ними. Защитой было то, что никто не должен был собрать эти два знания вместе.</w:t>
+      </w:r>
+    </w:p>
+    <w:p>
+      <w:pPr>
+        <w:spacing w:line="360" w:lineRule="auto"/>
+        <w:ind w:firstLine="567"/>
+        <w:jc w:val="both"/>
+        <w:rPr>
+          <w:sz w:val="28"/>
+          <w:szCs w:val="28"/>
+        </w:rPr>
+      </w:pPr>
+      <w:r>
+        <w:rPr>
+          <w:sz w:val="28"/>
+          <w:szCs w:val="28"/>
+          <w:rtl w:val="0"/>
+        </w:rPr>
+        <w:t xml:space="preserve">Тому, кто собирает рычаги через карантины и списанные миры, нужен был не только росток. На вопрос, кто ещё сможет с ним работать, Орен долго молчал. «Из живых я никого не знаю», — ответил наконец.</w:t>
+      </w:r>
+    </w:p>
+    <w:p>
+      <w:pPr>
+        <w:spacing w:line="360" w:lineRule="auto"/>
+        <w:ind w:firstLine="567"/>
+        <w:jc w:val="both"/>
+        <w:rPr>
+          <w:sz w:val="28"/>
+          <w:szCs w:val="28"/>
+        </w:rPr>
+      </w:pPr>
+      <w:r>
+        <w:rPr>
+          <w:sz w:val="28"/>
+          <w:szCs w:val="28"/>
+          <w:rtl w:val="0"/>
+        </w:rPr>
+        <w:t xml:space="preserve">Он рассказал про свой сорт, который вёл сорок лет, и про Сати: та уже умела ухаживать за обычными посадками, но с материнским корнем не работала. Джулия вспомнила руки старика над лотками. Всё время на виду. Самое ценное на Семари не лежало в сейфе.</w:t>
       </w:r>
     </w:p>
     <w:p>
@@ -21321,7 +21403,7 @@
           <w:szCs w:val="28"/>
           <w:rtl w:val="0"/>
         </w:rPr>
-        <w:t xml:space="preserve">Последний семарийский садовник. Возможно единственный живой человек, чьи руки умеют разбудить материнский культивар. Без него прариокка — горшок. С ним — конец Федерации.</w:t>
+        <w:t xml:space="preserve">Последний семарийский садовник. Возможно, единственный живой человек, который умеет получать новые сорта от материнского культивара. Без него прариокка оставалась бы на годы дорогим горшком. С ним можно было отнять у картелей право назначать цену чужому воздуху. А потом начать назначать её самому.</w:t>
       </w:r>
     </w:p>
     <w:p>
@@ -21359,7 +21441,7 @@
           <w:szCs w:val="28"/>
           <w:rtl w:val="0"/>
         </w:rPr>
-        <w:t xml:space="preserve">Тот, кто написал контракт, не охотился за горшком. Горшок был приманкой — красивой, дорогой, с замком самого Эсквайра, чтобы Кай впился в него глазами и не отрывался: сторожил, прятал, подменял, поздравлял себя с разгаданным капканом. Чтобы Кай трое суток смотрел на ящик.</w:t>
+        <w:t xml:space="preserve">Тот, кто написал контракт, не охотился за горшком. Горшок был ещё и приманкой — красивой, дорогой, с замком самого Эсквайра, чтобы Кай впился в него глазами и не отрывался: сторожил, прятал, подменял, поздравлял себя с разгаданным капканом. Чтобы Кай трое суток смотрел на ящик.</w:t>
       </w:r>
     </w:p>
     <w:p>
@@ -21416,7 +21498,7 @@
           <w:szCs w:val="28"/>
           <w:rtl w:val="0"/>
         </w:rPr>
-        <w:t xml:space="preserve">Лина. Она снова увидела ту сцену, которую ей пересказали, — мать, шагнувшую под ствол, чтобы заслонить старика. Не случайного старика. Садовника. Единственный живой рубильник от обитаемой вселенной. Кротость Кая отвела руку, которая успела бы выстрелить первой; промедление стоило выстрела; выстрел шел в садовника; мать заслонила садовника собой. Все сошлось в одну точку, как сходятся коридоры к шлюзу: милость — смерть — спасенный рубильник. И его Кай теперь вез сам, по накладной, собираясь сдать в приемный сектор и уйти, радуясь сорока девяти.</w:t>
+        <w:t xml:space="preserve">Лина. Джулия снова увидела, как та шагнула к упавшему Орену. Она была рядом, слышала выстрел и потом тащила старика. Теперь к этой памяти добавилось чужое намерение: именно его надо было вынести любой ценой. Выстрела и Лининого решения никто не мог расписать заранее. Но в контракт уже заложили, что Кай не уйдёт, пока под куполом остаются люди.</w:t>
       </w:r>
     </w:p>
     <w:p>
@@ -21492,45 +21574,45 @@
           <w:szCs w:val="28"/>
           <w:rtl w:val="0"/>
         </w:rPr>
-        <w:t xml:space="preserve">Контракт написал человек, который знает Кая наизусть. До последнего рефлекса. Который заранее знал, что Кай сфокусируется на риокке и проглядит человека. Который выстроил все — колонию, блокаду, ящик, садовника в пассажирском — под один характер, как ключ под один замок.</w:t>
-      </w:r>
-    </w:p>
-    <w:p>
-      <w:pPr>
-        <w:spacing w:line="360" w:lineRule="auto"/>
-        <w:ind w:firstLine="567"/>
-        <w:jc w:val="both"/>
-        <w:rPr>
-          <w:sz w:val="28"/>
-          <w:szCs w:val="28"/>
-        </w:rPr>
-      </w:pPr>
-      <w:r>
-        <w:rPr>
-          <w:sz w:val="28"/>
-          <w:szCs w:val="28"/>
-          <w:rtl w:val="0"/>
-        </w:rPr>
-        <w:t xml:space="preserve">А значит, тот же человек просчитал и ее. Наследницу Эсквайра. Знал, что она однажды сложит два и два и пойдет говорить Каю правду. И, может быть, именно на это и рассчитывал — чтобы она сказала ровно тогда, когда правда уже ничего не изменит, а только сломает в Кае последнее, на чем он держится. Чтобы ее правда стала не спасением, а последним поворотом его же капкана.</w:t>
-      </w:r>
-    </w:p>
-    <w:p>
-      <w:pPr>
-        <w:spacing w:line="360" w:lineRule="auto"/>
-        <w:ind w:firstLine="567"/>
-        <w:jc w:val="both"/>
-        <w:rPr>
-          <w:sz w:val="28"/>
-          <w:szCs w:val="28"/>
-        </w:rPr>
-      </w:pPr>
-      <w:r>
-        <w:rPr>
-          <w:sz w:val="28"/>
-          <w:szCs w:val="28"/>
-          <w:rtl w:val="0"/>
-        </w:rPr>
-        <w:t xml:space="preserve">Она стояла секунду между знанием и молчанием и впервые за очень много лет не видела хода, который не учелся бы в чужой партии. Скажешь — сыграешь за него. Промолчишь — станешь соучастницей. Соучастницей она уже была однажды, в девять лет, не по своей воле, и поклялась, что больше — никогда.</w:t>
+        <w:t xml:space="preserve">Контракт написал человек, который знает Кая наизусть. До последнего рефлекса. Который заранее знал, что Кай сфокусируется на риокке и проглядит человека. Который свёл контракт, ящик и садовника к одному характеру, как ключ к замку.</w:t>
+      </w:r>
+    </w:p>
+    <w:p>
+      <w:pPr>
+        <w:spacing w:line="360" w:lineRule="auto"/>
+        <w:ind w:firstLine="567"/>
+        <w:jc w:val="both"/>
+        <w:rPr>
+          <w:sz w:val="28"/>
+          <w:szCs w:val="28"/>
+        </w:rPr>
+      </w:pPr>
+      <w:r>
+        <w:rPr>
+          <w:sz w:val="28"/>
+          <w:szCs w:val="28"/>
+          <w:rtl w:val="0"/>
+        </w:rPr>
+        <w:t xml:space="preserve">А значит, он мог рассчитывать и на её вмешательство. Эта мысль задержала её у двери. Она слишком привыкла искать чужой расчёт и едва не приняла собственный страх за его всеведение.</w:t>
+      </w:r>
+    </w:p>
+    <w:p>
+      <w:pPr>
+        <w:spacing w:line="360" w:lineRule="auto"/>
+        <w:ind w:firstLine="567"/>
+        <w:jc w:val="both"/>
+        <w:rPr>
+          <w:sz w:val="28"/>
+          <w:szCs w:val="28"/>
+        </w:rPr>
+      </w:pPr>
+      <w:r>
+        <w:rPr>
+          <w:sz w:val="28"/>
+          <w:szCs w:val="28"/>
+          <w:rtl w:val="0"/>
+        </w:rPr>
+        <w:t xml:space="preserve">Она стояла секунду между знанием и молчанием. Скажет — Кай хотя бы сможет выбирать. Промолчит — выбор за него сделает она. В девять лет за неё уже выбрали другие; больше она не хотела продолжать эту цепочку.</w:t>
       </w:r>
     </w:p>
     <w:p>
@@ -21623,7 +21705,7 @@
           <w:szCs w:val="28"/>
           <w:rtl w:val="0"/>
         </w:rPr>
-        <w:t xml:space="preserve">Джулия нашла меня в трюме за час до подхода к станции и рассказала все. Ровно, без жалости, кладя факты на стол, как карты, которые можно было открыть трое суток назад: про садовника, про то, что рычаг я везу не в тайнике, а в пассажирском, что зовут его Орен, что Лина умерла, заслонив собой не случайного старика, а единственный живой рычаг от существующей вселенной.</w:t>
+        <w:t xml:space="preserve">Джулия нашла меня в трюме за час до подхода к станции. Рассказала про разговор с Ореном: он узнал культивар, знает, как с ним работать, и других живых мастеров назвать не смог. Она сказала это один раз. Я попросил повторить. Лучше от повтора не стало.</w:t>
       </w:r>
     </w:p>
     <w:p>
@@ -21680,7 +21762,7 @@
           <w:szCs w:val="28"/>
           <w:rtl w:val="0"/>
         </w:rPr>
-        <w:t xml:space="preserve">— Если получится, — сказала Джулия. Не «не получится». «Если». И в этом коротком слове было все, чего я не хотел слышать: что она уже просчитала, как именно у меня не получится, и молчит об этом, потому что не знает, не входит ли и ее предупреждение в чужой расчет.</w:t>
+        <w:t xml:space="preserve">— Сначала поговори с ним, — сказала Джулия. — Ты опять решил за человека, куда его везти. А станцию я проверю. Видимая часть чистая, но в служебную сеть нас до стыковки не пустят.</w:t>
       </w:r>
     </w:p>
     <w:p>
@@ -21737,45 +21819,45 @@
           <w:szCs w:val="28"/>
           <w:rtl w:val="0"/>
         </w:rPr>
-        <w:t xml:space="preserve">Клиент прислал инструкции заранее, сухие, деловые, без единого лишнего слова: сдать пассажиров в приемный сектор, ящик оставить в грузовом доке, отшвартоваться, уйти. Чисто. По-деловому. Так пишут либо те, кому нечего скрывать, либо те, кто скрывает слишком тщательно.</w:t>
-      </w:r>
-    </w:p>
-    <w:p>
-      <w:pPr>
-        <w:spacing w:line="360" w:lineRule="auto"/>
-        <w:ind w:firstLine="567"/>
-        <w:jc w:val="both"/>
-        <w:rPr>
-          <w:sz w:val="28"/>
-          <w:szCs w:val="28"/>
-        </w:rPr>
-      </w:pPr>
-      <w:r>
-        <w:rPr>
-          <w:sz w:val="28"/>
-          <w:szCs w:val="28"/>
-          <w:rtl w:val="0"/>
-        </w:rPr>
-        <w:t xml:space="preserve">Семью с «Сухого дока» я решил запереть в дальнем отсеке и попросил сидеть тихо. Пятеро с узлами не входили в контракт, а я не сдаю неучтенных людей анонимным клиентам. Пусть клиент получает ровно то, за что заплатил. Я обещал им колонию и я выполню ее, но немного позже.</w:t>
-      </w:r>
-    </w:p>
-    <w:p>
-      <w:pPr>
-        <w:spacing w:line="360" w:lineRule="auto"/>
-        <w:ind w:firstLine="567"/>
-        <w:jc w:val="both"/>
-        <w:rPr>
-          <w:sz w:val="28"/>
-          <w:szCs w:val="28"/>
-        </w:rPr>
-      </w:pPr>
-      <w:r>
-        <w:rPr>
-          <w:sz w:val="28"/>
-          <w:szCs w:val="28"/>
-          <w:rtl w:val="0"/>
-        </w:rPr>
-        <w:t xml:space="preserve">Я сдавал сорок девять по списку в приемный сектор и держал Орена при себе, у рампы, под предлогом, что старший сходит последним, — это правило никто не писал, но оно всегда работает, и никто не удивился. Орен и не спорил. Он вообще был странно спокоен для человека, которого, как я теперь знал, собирались отнять, — спокоен той тишиной, которую я на этой неделе уже видел. Так была тиха Лина перед последней партией. Так тихи те, кто все для себя решил и просто ждет, когда решение догонит остальных.</w:t>
+        <w:t xml:space="preserve">Клиент прислал инструкции заранее, сухие, деловые, без единого лишнего слова: сдать пассажиров в приемный сектор, ящик оставить в грузовом доке, отшвартоваться, уйти. Чисто. По-деловому. Дживс сверил открытый реестр: медпункт, воздух, лицензия причала. Всё действовало. Я велел держать сцепку готовой к отходу, Джулию — у шлюза, а людей не отпускать дальше приёмного зала. Орен оставался со мной. Так пишут либо те, кому нечего скрывать, либо те, кто скрывает слишком тщательно.</w:t>
+      </w:r>
+    </w:p>
+    <w:p>
+      <w:pPr>
+        <w:spacing w:line="360" w:lineRule="auto"/>
+        <w:ind w:firstLine="567"/>
+        <w:jc w:val="both"/>
+        <w:rPr>
+          <w:sz w:val="28"/>
+          <w:szCs w:val="28"/>
+        </w:rPr>
+      </w:pPr>
+      <w:r>
+        <w:rPr>
+          <w:sz w:val="28"/>
+          <w:szCs w:val="28"/>
+          <w:rtl w:val="0"/>
+        </w:rPr>
+        <w:t xml:space="preserve">Семью с «Сухого дока» я решил запереть в дальнем отсеке и попросил сидеть тихо. Пятеро с узлами не входили в контракт, а я не сдаю неучтенных людей анонимным клиентам. Пусть клиент получает ровно то, за что заплатил. Я обещал им колонию и выполню обещание, но немного позже.</w:t>
+      </w:r>
+    </w:p>
+    <w:p>
+      <w:pPr>
+        <w:spacing w:line="360" w:lineRule="auto"/>
+        <w:ind w:firstLine="567"/>
+        <w:jc w:val="both"/>
+        <w:rPr>
+          <w:sz w:val="28"/>
+          <w:szCs w:val="28"/>
+        </w:rPr>
+      </w:pPr>
+      <w:r>
+        <w:rPr>
+          <w:sz w:val="28"/>
+          <w:szCs w:val="28"/>
+          <w:rtl w:val="0"/>
+        </w:rPr>
+        <w:t xml:space="preserve">Я сдавал сорок восемь по списку в приемный сектор и держал Орена при себе, у рампы, под предлогом, что старший сходит последним, — это правило никто не писал, но оно всегда работает, и никто не удивился. Орен и не спорил. Он вообще был странно спокоен для человека, которого, как я теперь знал, собирались отнять, — спокоен той тишиной, которую я на этой неделе уже видел. Так была тиха Лина перед последней партией. Так тихи те, кто все для себя решил и просто ждет, когда решение догонит остальных.</w:t>
       </w:r>
     </w:p>
     <w:p>
@@ -21851,26 +21933,26 @@
           <w:szCs w:val="28"/>
           <w:rtl w:val="0"/>
         </w:rPr>
-        <w:t xml:space="preserve">— Ты хороший человек, контрактник, — сказал он. — Лучше многих, кого я встречал, а я встречал всяких. И именно поэтому ты до сих пор ничего не понял. Это не я твой груз, Кай. Это ты — мой транспорт. Я знал, на что сажусь, еще на Семари, когда ты сказал «первыми идут дети», а я подумал: вот он. Вот тот, кто вынесет и меня.</w:t>
-      </w:r>
-    </w:p>
-    <w:p>
-      <w:pPr>
-        <w:spacing w:line="360" w:lineRule="auto"/>
-        <w:ind w:firstLine="567"/>
-        <w:jc w:val="both"/>
-        <w:rPr>
-          <w:sz w:val="28"/>
-          <w:szCs w:val="28"/>
-        </w:rPr>
-      </w:pPr>
-      <w:r>
-        <w:rPr>
-          <w:sz w:val="28"/>
-          <w:szCs w:val="28"/>
-          <w:rtl w:val="0"/>
-        </w:rPr>
-        <w:t xml:space="preserve">Я смотрел на него и не находил слов — впервые за всю дорогу я, у которого слова всегда находились. Орен знал. Не сегодня узнал, не от Джулии, не из ящика — знал с самого Семари, с самого начала. Он сел в мой контракт сознательно, как садятся в последний поезд, зная, куда тот идет. Все эти дни, пока я сторожил траву и гордился хитростью, рядом со мной ехал человек, который раскусил всю партию раньше меня — и молчал, не из страха, а потому что решил пройти ее до конца сам. Я думал, что везу его. А он позволял себя везти.</w:t>
+        <w:t xml:space="preserve">— Ты хороший человек, контрактник, — сказал он. — Но я не пойду в тайник. Я останусь здесь, у рампы. И дослушай меня, когда за мной придут.</w:t>
+      </w:r>
+    </w:p>
+    <w:p>
+      <w:pPr>
+        <w:spacing w:line="360" w:lineRule="auto"/>
+        <w:ind w:firstLine="567"/>
+        <w:jc w:val="both"/>
+        <w:rPr>
+          <w:sz w:val="28"/>
+          <w:szCs w:val="28"/>
+        </w:rPr>
+      </w:pPr>
+      <w:r>
+        <w:rPr>
+          <w:sz w:val="28"/>
+          <w:szCs w:val="28"/>
+          <w:rtl w:val="0"/>
+        </w:rPr>
+        <w:t xml:space="preserve">Я хотел спросить, откуда эта уверенность. Не успел: над приёмным залом сменился свет. Орен посмотрел туда раньше меня.</w:t>
       </w:r>
     </w:p>
     <w:p>
@@ -21963,26 +22045,26 @@
           <w:szCs w:val="28"/>
           <w:rtl w:val="0"/>
         </w:rPr>
-        <w:t xml:space="preserve">— Кай, — очень тихо сказал Дживс мне в ухо, и тон его был тот самый, от которого холодеет раньше слов. — Я закончил разбор причальной метки. В приемном секторе не персонал станции. И не Федерация. И не картель. Метка маршрутная. Та самая. Рэя.</w:t>
-      </w:r>
-    </w:p>
-    <w:p>
-      <w:pPr>
-        <w:spacing w:line="360" w:lineRule="auto"/>
-        <w:ind w:firstLine="567"/>
-        <w:jc w:val="both"/>
-        <w:rPr>
-          <w:sz w:val="28"/>
-          <w:szCs w:val="28"/>
-        </w:rPr>
-      </w:pPr>
-      <w:r>
-        <w:rPr>
-          <w:sz w:val="28"/>
-          <w:szCs w:val="28"/>
-          <w:rtl w:val="0"/>
-        </w:rPr>
-        <w:t xml:space="preserve">Я обернулся к сектору, куда только что увели сорок девять спасенных мной душ. И понял, что увел их не из ловушки. Я увел их в нее. Своими руками. По списку. С уверенным кивком.</w:t>
+        <w:t xml:space="preserve">— Кай, — очень тихо сказал Дживс мне в ухо, и тон его был тот самый, от которого холодеет раньше слов. — После стыковки открылся служебный контур. Я закончил разбор причальной метки. В приемном секторе не персонал станции. И не Федерация. И не картель. Метка маршрутная. Та самая. Рэя.</w:t>
+      </w:r>
+    </w:p>
+    <w:p>
+      <w:pPr>
+        <w:spacing w:line="360" w:lineRule="auto"/>
+        <w:ind w:firstLine="567"/>
+        <w:jc w:val="both"/>
+        <w:rPr>
+          <w:sz w:val="28"/>
+          <w:szCs w:val="28"/>
+        </w:rPr>
+      </w:pPr>
+      <w:r>
+        <w:rPr>
+          <w:sz w:val="28"/>
+          <w:szCs w:val="28"/>
+          <w:rtl w:val="0"/>
+        </w:rPr>
+        <w:t xml:space="preserve">Я обернулся к сектору, куда только что увели сорок восемь спасённых мной душ. И понял, что увел их не из ловушки. Я увел их в нее. Своими руками. По списку. С уверенным кивком.</w:t>
       </w:r>
     </w:p>
     <w:p>
@@ -22037,7 +22119,7 @@
           <w:szCs w:val="28"/>
           <w:rtl w:val="0"/>
         </w:rPr>
-        <w:t xml:space="preserve">В приемный сектор вошли двое в гражданском — те, кого Дживс не сумел опознать. Они шли через толпу спасенных спокойно, не торопясь, ни на кого не глядя в отдельности, и сорок девять расступались перед ними, сами не понимая почему. Так расступаются не перед силой — силе сопротивляются. Так расступаются перед теми, у кого есть право, а право пахнет иначе, чем оружие; его чуют кожей.</w:t>
+        <w:t xml:space="preserve">В приемный сектор вошли двое в гражданском — те, кого Дживс не сумел опознать. Они шли через толпу спасенных спокойно, не торопясь, ни на кого не глядя в отдельности, и сорок восемь расступались перед ними, сами не понимая почему. Так расступаются не перед силой — силе сопротивляются. Так расступаются перед теми, у кого есть право, а право пахнет иначе, чем оружие; его чуют кожей.</w:t>
       </w:r>
     </w:p>
     <w:p>
@@ -22075,7 +22157,7 @@
           <w:szCs w:val="28"/>
           <w:rtl w:val="0"/>
         </w:rPr>
-        <w:t xml:space="preserve">Я знал, что они придут за ним. Джулия сказала мне это еще на подходе к «Затишью», и сутки я носил ее правду в себе, как носят осколок у сердца: двигаться можно, дышать глубоко нельзя. Я приготовился. Держал Орена при себе, у рампы, придумал, как увести его, спрятать, не отдать, — у меня был план. И вот двое в гражданском шли через сектор прямо к нему, и я понял, что весь мой план не стоит ничего. Потому что они пришли не отнимать. Отнять я бы не дал, я умею не давать. Они пришли позвать. А на зов такие, как Орен, идут сами.</w:t>
+        <w:t xml:space="preserve">Я знал, что они придут за ним. Джулия сказала мне это еще на подходе к «Затишью», и последний час я носил ее правду в себе, как носят осколок у сердца: двигаться можно, дышать глубоко нельзя. Я приготовился. Держал Орена при себе, у рампы, придумал, как увести его, спрятать, не отдать, — у меня был план. И вот двое в гражданском шли через сектор прямо к нему, и я понял, что весь мой план не стоит ничего. Потому что они пришли не отнимать. Отнять я бы не дал, я умею не давать. Они пришли позвать. А на зов такие, как Орен, идут сами.</w:t>
       </w:r>
     </w:p>
     <w:p>
@@ -22132,7 +22214,7 @@
           <w:szCs w:val="28"/>
           <w:rtl w:val="0"/>
         </w:rPr>
-        <w:t xml:space="preserve">— Послушай меня один раз и не перебивай, — сказал Орен тихо, чтобы не слышали дети. — У нас мало времени, а ты любишь перебивать, я заметил еще на Семари. Я последний человек, кто умеет будить материнский культивар. Единственный. — Он почти улыбнулся, и от этой почти-улыбки мне стало холоднее, чем от любого оружия. — Он не охотился за горшком, Кай. Рычагом был я. И ты меня вынес. По списку. Первым делом — детей, последним — садовника. Правильно. Все, как он рассчитал.</w:t>
+        <w:t xml:space="preserve">— Послушай меня один раз и не перебивай, — сказал Орен тихо. — Ты знаешь, зачем я ему. А я знал ещё на Семари, когда ты велел первыми вести детей. Понял: этот вынесет всех, до кого дотянется. И меня тоже. Я сел к тебе сам, Кай. Не потому, что верю Рэю. Потому, что он добрался до моего ремесла, а остальные не должны были платить за меня. Думал, выведешь — и рассчитаюсь с ним один.</w:t>
       </w:r>
     </w:p>
     <w:p>
@@ -22170,64 +22252,64 @@
           <w:szCs w:val="28"/>
           <w:rtl w:val="0"/>
         </w:rPr>
-        <w:t xml:space="preserve">— Лина умерла, заслонив рычаг, — сказал Орен, и впервые его спокойствие дрогнуло, и я увидел под ним то, что он нес трое суток молча. — И я буду носить это до конца, сколько бы мне до него не осталось. Поэтому не делай ее смерть напрасной во второй раз, контрактник. Слушай внимательно. Если ты сейчас полезешь меня отбивать — а ты полезешь, я по руке твоей вижу, — эти человек. Включая мальчика Лины. — Он подождал, пока это дойдет. — Я не дам им заплатить за меня. Хватит с этой накладной одной матери. Одной более чем достаточно, чтобы я до смерти не отмылся.</w:t>
-      </w:r>
-    </w:p>
-    <w:p>
-      <w:pPr>
-        <w:spacing w:line="360" w:lineRule="auto"/>
-        <w:ind w:firstLine="567"/>
-        <w:jc w:val="both"/>
-        <w:rPr>
-          <w:sz w:val="28"/>
-          <w:szCs w:val="28"/>
-        </w:rPr>
-      </w:pPr>
-      <w:r>
-        <w:rPr>
-          <w:sz w:val="28"/>
-          <w:szCs w:val="28"/>
-          <w:rtl w:val="0"/>
-        </w:rPr>
-        <w:t xml:space="preserve">Я слушал и складывал цепочку — звено за звеном, и каждое было выковано из чьей-то добродетели. Я не ударил охранника из милости. Охранник со страху выстрелил. А под выстрел из любви шагнула Лина — и тем спасла Орена, которого я по сей час считал спасенным случайно. Никакой случайности. Холодный расчет на чужую милость и чужую любовь, и обе сработали в срок. Рэй не пролил ни капли сам. Он просто разложил по местам наши лучшие свойства и дал им сцепиться друг с другом, как шестерням. Рычаг сквозь яд и блокаду пронес я — потому что хороший. Закрыла его собой Лина — потому что была лучше всех нас. А брат собрал из нашего добра машину и снимал теперь урожай: вежливо, в срок, по накладной.</w:t>
-      </w:r>
-    </w:p>
-    <w:p>
-      <w:pPr>
-        <w:spacing w:line="360" w:lineRule="auto"/>
-        <w:ind w:firstLine="567"/>
-        <w:jc w:val="both"/>
-        <w:rPr>
-          <w:sz w:val="28"/>
-          <w:szCs w:val="28"/>
-        </w:rPr>
-      </w:pPr>
-      <w:r>
-        <w:rPr>
-          <w:sz w:val="28"/>
-          <w:szCs w:val="28"/>
-          <w:rtl w:val="0"/>
-        </w:rPr>
-        <w:t xml:space="preserve">Двое ждали. Терпеливо, без нетерпения, без угрозы — самое страшное терпение из всех: терпение тех, кто знает, чем кончится. И это тоже было в чьем-то расчете. Все было в чьем-то расчете, до последней паузы.</w:t>
-      </w:r>
-    </w:p>
-    <w:p>
-      <w:pPr>
-        <w:spacing w:line="360" w:lineRule="auto"/>
-        <w:ind w:firstLine="567"/>
-        <w:jc w:val="both"/>
-        <w:rPr>
-          <w:sz w:val="28"/>
-          <w:szCs w:val="28"/>
-        </w:rPr>
-      </w:pPr>
-      <w:r>
-        <w:rPr>
-          <w:sz w:val="28"/>
-          <w:szCs w:val="28"/>
-          <w:rtl w:val="0"/>
-        </w:rPr>
-        <w:t xml:space="preserve">— Росток ты сберег, — сказал Орен тише, уже только мне, шагнув ближе. — Я знаю, я видел, как ты ходишь мимо одного места в трюме и не смотришь на него нарочно. Молодец. Половину рычага ты у него отнял. Теперь у тебя — росток, а у него буду я. По половине на брата. Это значит, что он не повернет рубильник без тебя, а ты не остановишь его без меня. Это надолго, контрактник. На целую войну, а не на один контракт. — Он выпрямился. — А мальчику… нет. Ничего не передавай от меня, я для него никто, старик с грядки.</w:t>
+        <w:t xml:space="preserve">— Лина умерла, спасая меня, — сказал Орен, и впервые его спокойствие дрогнуло. — Меня, Кай. Не рычаг. Я это понесу. Но сейчас присмотри за её мальчиком. — В стене приёмного зала открылись две черные щели. Дживс тихо подтвердил мне: секторные турели, чужое управление; двери уже заблокированы. — Пока я иду сам, их отпустят. Если начнёшь отбивать — стрелять будут через зал. Включая мальчика Лины. Одной матери с этой накладной достаточно. Я не отдам им ещё и сына.</w:t>
+      </w:r>
+    </w:p>
+    <w:p>
+      <w:pPr>
+        <w:spacing w:line="360" w:lineRule="auto"/>
+        <w:ind w:firstLine="567"/>
+        <w:jc w:val="both"/>
+        <w:rPr>
+          <w:sz w:val="28"/>
+          <w:szCs w:val="28"/>
+        </w:rPr>
+      </w:pPr>
+      <w:r>
+        <w:rPr>
+          <w:sz w:val="28"/>
+          <w:szCs w:val="28"/>
+          <w:rtl w:val="0"/>
+        </w:rPr>
+        <w:t xml:space="preserve">Я смотрел на щели над людьми и переставал спорить с Ореном про замки и накладные. Он всё знал — не про выстрел у ворот, не про Лину. Про себя. Я вёз человека на встречу, от которой собирался его спасать, а он надеялся расплатиться собой и отпустить остальных. Брату не нужно было угадывать каждый наш шаг. Достаточно было знать, кого мы не бросим.</w:t>
+      </w:r>
+    </w:p>
+    <w:p>
+      <w:pPr>
+        <w:spacing w:line="360" w:lineRule="auto"/>
+        <w:ind w:firstLine="567"/>
+        <w:jc w:val="both"/>
+        <w:rPr>
+          <w:sz w:val="28"/>
+          <w:szCs w:val="28"/>
+        </w:rPr>
+      </w:pPr>
+      <w:r>
+        <w:rPr>
+          <w:sz w:val="28"/>
+          <w:szCs w:val="28"/>
+          <w:rtl w:val="0"/>
+        </w:rPr>
+        <w:t xml:space="preserve">Двое ждали. Терпеливо, без нетерпения, без угрозы — самое страшное терпение из всех: терпение тех, кто знает, чем кончится. И это тоже было в чьем-то расчете. Мне всё ещё казалось, что даже паузы здесь рассчитаны.</w:t>
+      </w:r>
+    </w:p>
+    <w:p>
+      <w:pPr>
+        <w:spacing w:line="360" w:lineRule="auto"/>
+        <w:ind w:firstLine="567"/>
+        <w:jc w:val="both"/>
+        <w:rPr>
+          <w:sz w:val="28"/>
+          <w:szCs w:val="28"/>
+        </w:rPr>
+      </w:pPr>
+      <w:r>
+        <w:rPr>
+          <w:sz w:val="28"/>
+          <w:szCs w:val="28"/>
+          <w:rtl w:val="0"/>
+        </w:rPr>
+        <w:t xml:space="preserve">— Ты вскрыл ящик, — сказал Орен тише, уже только мне. — По руке вижу. Росток сберёг? — Я кивнул. Он выдохнул. — Тогда половину ты у него отнял. У тебя растение, у него буду я. Он не начнёт без тебя. А тебе, если захочешь разобраться с этой травой, придётся искать меня. Только сначала увези людей. — Он выпрямился. — А мальчику… нет. Ничего не передавай от меня, я для него никто, старик с грядки.</w:t>
       </w:r>
     </w:p>
     <w:p>
@@ -22265,26 +22347,26 @@
           <w:szCs w:val="28"/>
           <w:rtl w:val="0"/>
         </w:rPr>
-        <w:t xml:space="preserve">Дальний шлюз принял его без звука. Орен не оглянулся — ни на меня, ни на сорок девять, ни на мальчика, которого учил правильно одевать фильтр. Он шел к моему брату так, как идут к давно назначенной встрече: без спешки, без страха, с той тишиной, которую я на этой неделе видел уже дважды — у Лины перед последней партией и у него самого, ночью в питомнике, когда он сказал, что нас обоих возьмут на том, что мы не бросаем доверенного. Он не бросил. В этом был его капкан. И, если честно, в этом же — мой.</w:t>
-      </w:r>
-    </w:p>
-    <w:p>
-      <w:pPr>
-        <w:spacing w:line="360" w:lineRule="auto"/>
-        <w:ind w:firstLine="567"/>
-        <w:jc w:val="both"/>
-        <w:rPr>
-          <w:sz w:val="28"/>
-          <w:szCs w:val="28"/>
-        </w:rPr>
-      </w:pPr>
-      <w:r>
-        <w:rPr>
-          <w:sz w:val="28"/>
-          <w:szCs w:val="28"/>
-          <w:rtl w:val="0"/>
-        </w:rPr>
-        <w:t xml:space="preserve">Я стоял неподвижно. Поздно — это слово я ненавижу именно за то, что оно всегда право. Я мог броситься. Я мог спустить зверя, и, может, успел бы достать одного, а то и обоих. И тогда второй приказ — «через сектор» — стал бы единственным. Сорок девять. Тимка. Орен это знал, выстраивая свои слова. Рэй это знал, выстраивая Орена. Все знали меня лучше, чем я сам.</w:t>
+        <w:t xml:space="preserve">Дальний шлюз принял его без звука. Орен не оглянулся — ни на меня, ни на сорок восемь, ни на мальчика, которого учил правильно надевать фильтр. Он шел к моему брату так, как идут к давно назначенной встрече: без спешки, без страха, с той тишиной, которую я на этой неделе видел уже дважды — у Лины перед последней партией и у него самого, ночью в питомнике, когда он сказал, что нас обоих возьмут на том, что мы не бросаем доверенного. Он не бросил. В этом был его капкан. И, если честно, в этом же — мой.</w:t>
+      </w:r>
+    </w:p>
+    <w:p>
+      <w:pPr>
+        <w:spacing w:line="360" w:lineRule="auto"/>
+        <w:ind w:firstLine="567"/>
+        <w:jc w:val="both"/>
+        <w:rPr>
+          <w:sz w:val="28"/>
+          <w:szCs w:val="28"/>
+        </w:rPr>
+      </w:pPr>
+      <w:r>
+        <w:rPr>
+          <w:sz w:val="28"/>
+          <w:szCs w:val="28"/>
+          <w:rtl w:val="0"/>
+        </w:rPr>
+        <w:t xml:space="preserve">Я стоял неподвижно. Поздно — это слово я ненавижу именно за то, что оно всегда право. Я мог броситься. Я мог спустить зверя, и, может, успел бы достать одного, а то и обоих. И тогда второй приказ — «через сектор» — стал бы единственным. Сорок восемь. Среди них Тимка. Орен это знал, выстраивая свои слова. Рэй это знал, выстраивая Орена. Все знали меня лучше, чем я сам.</w:t>
       </w:r>
     </w:p>
     <w:p>
@@ -22529,26 +22611,26 @@
           <w:szCs w:val="28"/>
           <w:rtl w:val="0"/>
         </w:rPr>
-        <w:t xml:space="preserve">— Сдан в док «Затишья», как по контракту, — доложил один. — Хастовский ящик, замок цел, пломба на месте.</w:t>
-      </w:r>
-    </w:p>
-    <w:p>
-      <w:pPr>
-        <w:spacing w:line="360" w:lineRule="auto"/>
-        <w:ind w:firstLine="567"/>
-        <w:jc w:val="both"/>
-        <w:rPr>
-          <w:sz w:val="28"/>
-          <w:szCs w:val="28"/>
-        </w:rPr>
-      </w:pPr>
-      <w:r>
-        <w:rPr>
-          <w:sz w:val="28"/>
-          <w:szCs w:val="28"/>
-          <w:rtl w:val="0"/>
-        </w:rPr>
-        <w:t xml:space="preserve">— Вскройте. Хочу видеть мать своими глазами.</w:t>
+        <w:t xml:space="preserve">— Доставлен сюда с «Затишья», — доложил один. — Хастовский ящик. — Он поставил его перед Рэем. — Замок цел, пломба на месте.</w:t>
+      </w:r>
+    </w:p>
+    <w:p>
+      <w:pPr>
+        <w:spacing w:line="360" w:lineRule="auto"/>
+        <w:ind w:firstLine="567"/>
+        <w:jc w:val="both"/>
+        <w:rPr>
+          <w:sz w:val="28"/>
+          <w:szCs w:val="28"/>
+        </w:rPr>
+      </w:pPr>
+      <w:r>
+        <w:rPr>
+          <w:sz w:val="28"/>
+          <w:szCs w:val="28"/>
+          <w:rtl w:val="0"/>
+        </w:rPr>
+        <w:t xml:space="preserve">— Посмотрим, — сказал Рэй и положил ладонь на сканер.</w:t>
       </w:r>
     </w:p>
     <w:p>
@@ -22586,7 +22668,7 @@
           <w:szCs w:val="28"/>
           <w:rtl w:val="0"/>
         </w:rPr>
-        <w:t xml:space="preserve">В комнате стало очень тихо. Орен медленно поднял голову, и на лице у него проступило что-то, чего там не было всю дорогу, — не злорадство, нет, для злорадства он слишком устал. Понимание. Тихое, почти нежное понимание.</w:t>
+        <w:t xml:space="preserve">В комнате стало очень тихо. Орен медленно поднял голову, и на лице у него проступило что-то, чего там не было всю дорогу, — не злорадство, нет, для злорадства он слишком устал. Подтверждение. Кай сберёг росток — теперь это знал и Рэй.</w:t>
       </w:r>
     </w:p>
     <w:p>
@@ -22624,7 +22706,7 @@
           <w:szCs w:val="28"/>
           <w:rtl w:val="0"/>
         </w:rPr>
-        <w:t xml:space="preserve">— Он вскрыл ящик, — сказал Рэй тихо, не им, себе. — Раньше срока. Своей рукой. Красивая шутка. — Он покачал головой, и в этом движении было больше, чем во всех его планах. — Я просчитал в нем все. Что не бросит людей. Что не ударит первым. Что вынесет тебя, не догадавшись зачем. Я не просчитал одного: что он однажды перестанет возить, не заглядывая. Что Семари его этому научит. Что он откроет ящик.</w:t>
+        <w:t xml:space="preserve">— Он вскрыл ящик, — сказал Рэй тихо, не им, себе. — Раньше срока. Своей рукой. Красивая шутка. — Он покачал головой, и в этом движении было больше, чем во всех его планах. — Я слишком привык рассчитывать на него. Что не бросит людей. Что опять полезет договариваться. Что вынесет тебя, даже не зная зачем. Я не просчитал одного: что он однажды перестанет возить, не заглядывая. Что Семари его этому научит. Что он откроет ящик.</w:t>
       </w:r>
     </w:p>
     <w:p>
@@ -22681,7 +22763,7 @@
           <w:szCs w:val="28"/>
           <w:rtl w:val="0"/>
         </w:rPr>
-        <w:t xml:space="preserve">— Значит, у меня — садовник, а у него — растение, — сказал Рэй, и поднялся, и в голосе его не осталось усталости, осталось что-то другое, давно забытое, похожее на азарт. — По половине рычага на брата. Он не повернет рубильник без тебя. Я не поверну без ростка. Мы связаны, как были связаны всегда, только теперь об этом знают оба. — Он подошел к голому столу, где лежала единственная его личная вещь — старая ложка с прогрызенным краем. Тронул ее. — Знаешь, что это значит, садовник? Это значит, что он придет. За тобой, за братом, за половиной. Он не умеет не приходить за теми, кого можно вытащить. А я не умею не ждать его. Нас этому научили за одним столом.</w:t>
+        <w:t xml:space="preserve">— Значит, у меня — садовник, а у него — растение, — сказал Рэй, и поднялся, и в голосе его не осталось усталости, осталось что-то другое, давно забытое, похожее на азарт. — По половине рычага на брата. Он не получит новых сортов без тебя. Я — без ростка. Мы связаны, как были связаны всегда, только теперь об этом знают оба. — Он подошел к голому столу, где лежала единственная его личная вещь — старая ложка с прогрызенным краем. Тронул ее. — Знаешь, что это значит, садовник? Это значит, что он придет. За тобой, за братом, за половиной. Он не умеет не приходить за теми, кого можно вытащить. А я не умею не ждать его. Нас этому научили за одним столом.</w:t>
       </w:r>
     </w:p>
     <w:p>
@@ -22888,7 +22970,7 @@
           <w:szCs w:val="28"/>
           <w:rtl w:val="0"/>
         </w:rPr>
-        <w:t xml:space="preserve">«Ты вынес их всех. Я знал, что вынесешь. Спасибо, брат. Теперь поиграем.»</w:t>
+        <w:t xml:space="preserve">«Ты его вынес. Я знал, что вынесешь. Спасибо, брат. Теперь поиграем.»</w:t>
       </w:r>
     </w:p>
     <w:p>
@@ -22964,7 +23046,7 @@
           <w:szCs w:val="28"/>
           <w:rtl w:val="0"/>
         </w:rPr>
-        <w:t xml:space="preserve">Двадцать три. Я и не заметил, когда счетчик перещелкнул. Двадцать два чистых — и двадцать третий, на котором уместилось все сразу: сорок девять спасенных, одна непрощаемая потеря и половина рубильника от мира, вынесенная брату моей же рукой. Один контракт.</w:t>
+        <w:t xml:space="preserve">Двадцать три. Я и не заметил, когда счетчик перещелкнул. Двадцать два чистых — и двадцать третий, на котором уместилось все сразу: сорок девять спасенных, одна непрощаемая потеря и половина рычага от мира, вынесенная брату моей же рукой. Один контракт.</w:t>
       </w:r>
     </w:p>
     <w:p>
@@ -23173,7 +23255,7 @@
           <w:szCs w:val="28"/>
           <w:rtl w:val="0"/>
         </w:rPr>
-        <w:t xml:space="preserve">Сорок девять вернулись ко мне сами — те, кого я час назад сдал в приемный сектор и мысленно похоронил. Капкан, в который я их завел, был не на них. Брат пришел за одним садовником, а людей он мне вывезти и обещал — и слово, как ни тошно это признавать, держал: его двое, забрав Орена, остальных не тронули, отступили в свой шлюз, и приемный сектор снова стал просто гулким залом с погасшим табло. Я собрал сорок восемь обратно по группам, как собирал на Семари, и впервые за всю дорогу не считал это спасением. Я их не спасал. Я их выводил из места, куда сам же и привел.</w:t>
+        <w:t xml:space="preserve">Сорок восемь вернулись ко мне сами — те, кого я час назад сдал в приёмный сектор и мысленно похоронил. Люки над залом закрылись. Люди Рэя ушли за Ореном, двери разблокировались, и сектор снова стал гулким залом с погасшим табло. Я собрал всех обратно по группам, как на Семари. Я их не спасал. Я выводил их из места, куда сам же привёл.</w:t>
       </w:r>
     </w:p>
     <w:p>
@@ -23211,7 +23293,7 @@
           <w:szCs w:val="28"/>
           <w:rtl w:val="0"/>
         </w:rPr>
-        <w:t xml:space="preserve">— Я не могу взять вас туда, куда иду. Туда людей не возят. У меня с этой станции свой счет, и он не ваш. Поэтому будет так. Я знаю один тихий мир на отшибе — списанный и забытый. Плохая земля, чистый воздух. Я отвезу вас туда, и вы начнете заново. У вас есть Сати, у вас есть руки, у вас есть не отравленный воздух. Орен сказал: без садовника семя не взойдет. Он был прав про многое и неправ про это. Взойдет. Назло ему взойдет — я видел, как вы молча помогли одному мальчишке. Народ, который так делает, прорастает на любой земле.</w:t>
+        <w:t xml:space="preserve">— Я не могу взять вас туда, куда иду. У меня с этой станции свой счёт, и он не ваш. Я знаю тихий мир на отшибе — списанный и забытый. Плохая земля, чистый воздух. Если согласитесь, отвезу вас туда, помогу устроиться. Сати умеет растить обычные сорта, Орен её научил. С материнским корнем мы без него не справимся. Но вам нужна своя колония. Её вы сумеете поднять.</w:t>
       </w:r>
     </w:p>
     <w:p>
@@ -23325,7 +23407,7 @@
           <w:szCs w:val="28"/>
           <w:rtl w:val="0"/>
         </w:rPr>
-        <w:t xml:space="preserve">Сати кивнула. Не улыбнулась — на этом корабле в те сутки не улыбались, — но что-то у нее в лице встало на место, как встает вправленный сустав. У пятидесяти трех появилось завтра. У меня — мальчик, война и половина рычага. Каждому свое. Я ведь никогда не выхожу с запасом. Я выхожу впритык.</w:t>
+        <w:t xml:space="preserve">Сати кивнула. Не улыбнулась — на этом корабле в те сутки не улыбались, — но что-то у нее в лице встало на место, как встает вправленный сустав. У пятидесяти двух, которые выбрали новую землю, появилось завтра. У меня — мальчик, война и половина рычага. Каждому свое. Я ведь никогда не выхожу с запасом. Я выхожу впритык.</w:t>
       </w:r>
     </w:p>
     <w:p>
@@ -23439,7 +23521,7 @@
           <w:szCs w:val="28"/>
           <w:rtl w:val="0"/>
         </w:rPr>
-        <w:t xml:space="preserve">И «Последняя миля» легла на курс — сначала к тихому миру, потом за братом, — унося колонистов, и один бледный росток в тайнике, о котором не знал никто, кроме меня и того, кто ждал его на том конце пустоты.</w:t>
+        <w:t xml:space="preserve">И «Последняя миля» легла на курс — сначала к тихому миру, потом за братом, — унося колонистов, и один бледный росток в тайнике, чьё точное место знали только мы с Джулией.</w:t>
       </w:r>
     </w:p>
     <w:p>
@@ -23494,7 +23576,7 @@
           <w:szCs w:val="28"/>
           <w:rtl w:val="0"/>
         </w:rPr>
-        <w:t xml:space="preserve">Двое суток до тихого мира мы шли на двух сцепленных корпусах, и весь путь воздух держался на честном слове и трех упрямцах. Дживс развел нагрузку по фильтрам «Последней мили» и «Генты» поровну снова. Сати перебирала забитые мембраны руками, по одной, как перебирала когда-то больных. А брикеты складской риокки — остатки тех самых, что я вынес из ангара Сартена, — держали по очереди сами беженцы. Прариокку, материнский рубильник, я вез в тайнике и за всю дорогу ни разу не достал. Сати показала то, чему успела выучиться у Орена: как разминать прессованное серое волокно, чтобы оно согревалось от рук, оживало и тянулось к жизни. И охотнее всех за это брался старый сварщик — тот, что у ворот подломился ногами и казнил себя за Лину. Руки у него были не садовничьи, кузнечные, грубые. Зато упрямые. А упрямство, как выяснится позже, будит даже мертвое волокно не хуже уменья.</w:t>
+        <w:t xml:space="preserve">Двое суток до тихого мира мы шли на двух сцепленных корпусах. Фильтры забивались быстрее, чем обещал расчёт. Дживс распределял нагрузку, Сати меняла мембраны, а семь оставшихся складских брикетов шли по одному на новые слои волокна. Сати показывала, как размять прессованную серую массу, не порвав, и уложить без щелей. Это она умела: Орен научил. Старый сварщик брал самую упрямую работу. Руки у него были грубые, кузнечные, но теперь ему нашлось, что делать, и он делал. Прариокку я вёз отдельно, в тайнике. Её никто не трогал.</w:t>
       </w:r>
     </w:p>
     <w:p>
@@ -23532,7 +23614,7 @@
           <w:szCs w:val="28"/>
           <w:rtl w:val="0"/>
         </w:rPr>
-        <w:t xml:space="preserve">Пятьдесят три человека сошли по рампе на землю, которая никому ничего не была должна. Сати шла первой — медик, который трое суток не спал, а теперь распрямился, будто с него сняли мешок. За ней — сварщик, уже не казнящий себя, а занятый делом; здесь, на пустом рыжем поле, ему впервые за всю дорогу нашлось дело по рукам, и он взялся за него так, как берутся за спасение, — молча и насмерть. Семья с «Сухого дока» несла свои узлы, уже не как беженцы, а как первопоселенцы. Девчушка с куклой из рукавиц объявила кукле, что чудовище из ящика осталось далеко позади и сюда не придет, и я очень хотел, чтобы она оказалась права.</w:t>
+        <w:t xml:space="preserve">Пятьдесят два человека сошли по рампе на землю, которая никому ничего не была должна. Сати шла первой — медик, который последние дни почти не спал, а теперь распрямился, будто с него сняли мешок. За ней — сварщик, уже не казнящий себя, а занятый делом; здесь, на пустом рыжем поле, ему впервые за всю дорогу нашлось дело по рукам, и он взялся за него так, как берутся за спасение, — молча и насмерть. Семья с «Сухого дока» несла свои узлы, уже не как беженцы, а как первопоселенцы. Девчушка с куклой из рукавиц объявила кукле, что чудовище из ящика осталось далеко позади и сюда не придет, и я очень хотел, чтобы она оказалась права.</w:t>
       </w:r>
     </w:p>
     <w:p>
@@ -23589,7 +23671,7 @@
           <w:szCs w:val="28"/>
           <w:rtl w:val="0"/>
         </w:rPr>
-        <w:t xml:space="preserve">Сати показала мне, куда легли первые семена. Рядом девчонка-постарше, Лейла, утрамбовывала землю ладонями и приговаривала кукле — нет, уже не кукле, борозде, — что дерево вырастет даже на плохой земле, если его поливать; ей так бабка говорила, а бабке — ее бабка, и так до самого начала, когда земля везде была плохая. Сам старый сварщик сидел поодаль на корточках, запустив грубые пальцы в чужую рыжую землю, пробуя ее на влагу осторожно, будто боялся спугнуть, — тот, кого колония, не сговариваясь, уже выбрала себе садовником взамен ушедшего. Не за уменье — за руки, которые всю дорогу искали, чем искупить вину, и нашли наконец землю. Я слушал Лейлу и думал об Орене, который сказал, что без садовника семя не взойдет. Орен ошибся. Не во всем — в этом. Эти руки разбудят что угодно. Не уменьем — упрямством. Иногда этого хватает.</w:t>
+        <w:t xml:space="preserve">Сати показала мне, куда легли первые семена. Обычные, из колонистских узлов, и несколько местных сортов риокки. Рядом Лейла утрамбовывала землю ладонями и говорила борозде, что дерево вырастет даже на плохой земле, если его поливать: ей так бабка говорила. Старый сварщик сидел на корточках, пробовал чужую землю на влагу. Сати поправила глубину лунки. Он молча переделал. Не новый Орен — человек, который начал учиться. Я смотрел на его руки и впервые не требовал от них чуда. Пусть сначала взойдёт то, что посажено.</w:t>
       </w:r>
     </w:p>
     <w:p>
@@ -23703,26 +23785,26 @@
           <w:szCs w:val="28"/>
           <w:rtl w:val="0"/>
         </w:rPr>
-        <w:t xml:space="preserve">В тайнике у меня лежал росток. Я стоял над свежей бороздой, где новый садовник будил семена упрямыми ладонями, и на один долгий вдох мне до дрожи захотелось оставить его здесь. Отдать этой земле, этим рукам, этому упрямству.</w:t>
-      </w:r>
-    </w:p>
-    <w:p>
-      <w:pPr>
-        <w:spacing w:line="360" w:lineRule="auto"/>
-        <w:ind w:firstLine="567"/>
-        <w:jc w:val="both"/>
-        <w:rPr>
-          <w:sz w:val="28"/>
-          <w:szCs w:val="28"/>
-        </w:rPr>
-      </w:pPr>
-      <w:r>
-        <w:rPr>
-          <w:sz w:val="28"/>
-          <w:szCs w:val="28"/>
-          <w:rtl w:val="0"/>
-        </w:rPr>
-        <w:t xml:space="preserve">Но я не оставил. Это не семя — это слишком важно. Я увезу его. Мой козырь, моя ноша, мой неоконченный разговор с братом. Может быть, когда-нибудь, если тот разговор кончится по-человечески, я вернусь сюда и посажу его в эту землю — не рубильником, а просто ростком. Может быть. Я цеплялся за это «может быть», как цеплялся за одну строку на «Сухом доке». Из таких «может быть» я, кажется, и собран.</w:t>
+        <w:t xml:space="preserve">В тайнике у меня лежал росток. Я стоял над свежей бороздой, где будущий садовник учился сажать, и на один долгий вдох мне до дрожи захотелось оставить его здесь. Отдать этой земле, этим рукам, этому упрямству.</w:t>
+      </w:r>
+    </w:p>
+    <w:p>
+      <w:pPr>
+        <w:spacing w:line="360" w:lineRule="auto"/>
+        <w:ind w:firstLine="567"/>
+        <w:jc w:val="both"/>
+        <w:rPr>
+          <w:sz w:val="28"/>
+          <w:szCs w:val="28"/>
+        </w:rPr>
+      </w:pPr>
+      <w:r>
+        <w:rPr>
+          <w:sz w:val="28"/>
+          <w:szCs w:val="28"/>
+          <w:rtl w:val="0"/>
+        </w:rPr>
+        <w:t xml:space="preserve">Но я не оставил. Это пока не их посадка. С этим корнем я не умею обращаться. Я увезу его. Мой козырь, моя ноша, мой неоконченный разговор с братом. Может быть, когда-нибудь, если тот разговор кончится по-человечески, я вернусь сюда и посажу его в эту землю — просто ростком, без чужих условий. Может быть. Я цеплялся за это «может быть», как цеплялся за одну строку на «Сухом доке». Из таких «может быть» я, кажется, и собран.</w:t>
       </w:r>
     </w:p>
     <w:p>

</xml_diff>